<commit_message>
feature: added db scheme
</commit_message>
<xml_diff>
--- a/rapporto/DOC_SARAK.docx
+++ b/rapporto/DOC_SARAK.docx
@@ -4348,16 +4348,7 @@
           <w:sz w:val="20"/>
           <w:lang w:eastAsia="it-CH"/>
         </w:rPr>
-        <w:t xml:space="preserve">Il progetto è fatto </w:t>
-      </w:r>
-      <w:bookmarkStart w:id="6" w:name="_GoBack"/>
-      <w:bookmarkEnd w:id="6"/>
-      <w:r>
-        <w:rPr>
-          <w:sz w:val="20"/>
-          <w:lang w:eastAsia="it-CH"/>
-        </w:rPr>
-        <w:t xml:space="preserve">in collaborazione con </w:t>
+        <w:t xml:space="preserve">Il progetto è fatto in collaborazione con </w:t>
       </w:r>
       <w:proofErr w:type="spellStart"/>
       <w:r>
@@ -4444,79 +4435,79 @@
           <w:lang w:val="it-CH" w:eastAsia="it-CH"/>
         </w:rPr>
       </w:pPr>
-      <w:bookmarkStart w:id="7" w:name="_Toc160445514"/>
+      <w:bookmarkStart w:id="6" w:name="_Toc160445514"/>
       <w:r>
         <w:rPr>
           <w:lang w:val="it-CH" w:eastAsia="it-CH"/>
         </w:rPr>
         <w:t>Idea del progetto</w:t>
       </w:r>
+      <w:bookmarkEnd w:id="6"/>
+    </w:p>
+    <w:p>
+      <w:pPr>
+        <w:pStyle w:val="SUPSITestoArial10"/>
+        <w:rPr>
+          <w:sz w:val="20"/>
+          <w:lang w:val="it-IT" w:eastAsia="it-CH"/>
+        </w:rPr>
+      </w:pPr>
+      <w:r>
+        <w:rPr>
+          <w:sz w:val="20"/>
+          <w:lang w:val="it-IT" w:eastAsia="it-CH"/>
+        </w:rPr>
+        <w:t>L’idea del p</w:t>
+      </w:r>
+      <w:r>
+        <w:rPr>
+          <w:sz w:val="20"/>
+          <w:lang w:val="it-IT" w:eastAsia="it-CH"/>
+        </w:rPr>
+        <w:t xml:space="preserve">rogetto di diploma è quella di sviluppare un applicazione che permetta gli utenti di avere una gestione delle proprie </w:t>
+      </w:r>
+      <w:proofErr w:type="spellStart"/>
+      <w:r>
+        <w:rPr>
+          <w:sz w:val="20"/>
+          <w:lang w:val="it-IT" w:eastAsia="it-CH"/>
+        </w:rPr>
+        <w:t>HexCard</w:t>
+      </w:r>
+      <w:proofErr w:type="spellEnd"/>
+      <w:r>
+        <w:rPr>
+          <w:sz w:val="20"/>
+          <w:lang w:val="it-IT" w:eastAsia="it-CH"/>
+        </w:rPr>
+        <w:t xml:space="preserve">, ossia biglietti da visita digitali, completamente autonoma, senza più dipendere dal diretto contatto con </w:t>
+      </w:r>
+      <w:proofErr w:type="spellStart"/>
+      <w:r>
+        <w:rPr>
+          <w:sz w:val="20"/>
+          <w:lang w:val="it-IT" w:eastAsia="it-CH"/>
+        </w:rPr>
+        <w:t>HexagonSwiss</w:t>
+      </w:r>
+      <w:proofErr w:type="spellEnd"/>
+      <w:r>
+        <w:rPr>
+          <w:sz w:val="20"/>
+          <w:lang w:val="it-IT" w:eastAsia="it-CH"/>
+        </w:rPr>
+        <w:t>.</w:t>
+      </w:r>
+    </w:p>
+    <w:p>
+      <w:pPr>
+        <w:pStyle w:val="Titolo2"/>
+      </w:pPr>
+      <w:bookmarkStart w:id="7" w:name="_Toc160445515"/>
+      <w:r>
+        <w:t>Punto di partenza del progetto</w:t>
+      </w:r>
       <w:bookmarkEnd w:id="7"/>
-    </w:p>
-    <w:p>
-      <w:pPr>
-        <w:pStyle w:val="SUPSITestoArial10"/>
-        <w:rPr>
-          <w:sz w:val="20"/>
-          <w:lang w:val="it-IT" w:eastAsia="it-CH"/>
-        </w:rPr>
-      </w:pPr>
-      <w:r>
-        <w:rPr>
-          <w:sz w:val="20"/>
-          <w:lang w:val="it-IT" w:eastAsia="it-CH"/>
-        </w:rPr>
-        <w:t>L’idea del p</w:t>
-      </w:r>
-      <w:r>
-        <w:rPr>
-          <w:sz w:val="20"/>
-          <w:lang w:val="it-IT" w:eastAsia="it-CH"/>
-        </w:rPr>
-        <w:t xml:space="preserve">rogetto di diploma è quella di sviluppare un applicazione che permetta gli utenti di avere una gestione delle proprie </w:t>
-      </w:r>
-      <w:proofErr w:type="spellStart"/>
-      <w:r>
-        <w:rPr>
-          <w:sz w:val="20"/>
-          <w:lang w:val="it-IT" w:eastAsia="it-CH"/>
-        </w:rPr>
-        <w:t>HexCard</w:t>
-      </w:r>
-      <w:proofErr w:type="spellEnd"/>
-      <w:r>
-        <w:rPr>
-          <w:sz w:val="20"/>
-          <w:lang w:val="it-IT" w:eastAsia="it-CH"/>
-        </w:rPr>
-        <w:t xml:space="preserve">, ossia biglietti da visita digitali, completamente autonoma, senza più dipendere dal diretto contatto con </w:t>
-      </w:r>
-      <w:proofErr w:type="spellStart"/>
-      <w:r>
-        <w:rPr>
-          <w:sz w:val="20"/>
-          <w:lang w:val="it-IT" w:eastAsia="it-CH"/>
-        </w:rPr>
-        <w:t>HexagonSwiss</w:t>
-      </w:r>
-      <w:proofErr w:type="spellEnd"/>
-      <w:r>
-        <w:rPr>
-          <w:sz w:val="20"/>
-          <w:lang w:val="it-IT" w:eastAsia="it-CH"/>
-        </w:rPr>
-        <w:t>.</w:t>
-      </w:r>
-    </w:p>
-    <w:p>
-      <w:pPr>
-        <w:pStyle w:val="Titolo2"/>
-      </w:pPr>
-      <w:bookmarkStart w:id="8" w:name="_Toc160445515"/>
-      <w:r>
-        <w:t>Punto di partenza del progetto</w:t>
-      </w:r>
-      <w:bookmarkEnd w:id="8"/>
     </w:p>
     <w:p>
       <w:pPr>
@@ -4573,13 +4564,13 @@
       <w:pPr>
         <w:pStyle w:val="Titolo"/>
       </w:pPr>
-      <w:bookmarkStart w:id="9" w:name="_Toc300833159"/>
-      <w:bookmarkStart w:id="10" w:name="_Toc160445516"/>
-      <w:bookmarkStart w:id="11" w:name="_Toc73344986"/>
-      <w:bookmarkStart w:id="12" w:name="_Toc73345127"/>
-      <w:bookmarkStart w:id="13" w:name="_Toc73345142"/>
-      <w:bookmarkStart w:id="14" w:name="_Toc82498955"/>
-      <w:bookmarkEnd w:id="9"/>
+      <w:bookmarkStart w:id="8" w:name="_Toc300833159"/>
+      <w:bookmarkStart w:id="9" w:name="_Toc160445516"/>
+      <w:bookmarkStart w:id="10" w:name="_Toc73344986"/>
+      <w:bookmarkStart w:id="11" w:name="_Toc73345127"/>
+      <w:bookmarkStart w:id="12" w:name="_Toc73345142"/>
+      <w:bookmarkStart w:id="13" w:name="_Toc82498955"/>
+      <w:bookmarkEnd w:id="8"/>
       <w:r>
         <w:lastRenderedPageBreak/>
         <w:t>Capitolo 1</w:t>
@@ -4587,7 +4578,7 @@
       <w:r>
         <w:t xml:space="preserve"> – Stato dell’arte</w:t>
       </w:r>
-      <w:bookmarkEnd w:id="10"/>
+      <w:bookmarkEnd w:id="9"/>
     </w:p>
     <w:p>
       <w:pPr>
@@ -4734,19 +4725,19 @@
           <w:numId w:val="5"/>
         </w:numPr>
       </w:pPr>
-      <w:bookmarkStart w:id="15" w:name="_Toc160445517"/>
-      <w:bookmarkStart w:id="16" w:name="_Toc73344988"/>
-      <w:bookmarkStart w:id="17" w:name="_Toc73345129"/>
-      <w:bookmarkStart w:id="18" w:name="_Toc73345144"/>
-      <w:bookmarkStart w:id="19" w:name="_Toc82498957"/>
+      <w:bookmarkStart w:id="14" w:name="_Toc160445517"/>
+      <w:bookmarkStart w:id="15" w:name="_Toc73344988"/>
+      <w:bookmarkStart w:id="16" w:name="_Toc73345129"/>
+      <w:bookmarkStart w:id="17" w:name="_Toc73345144"/>
+      <w:bookmarkStart w:id="18" w:name="_Toc82498957"/>
+      <w:bookmarkEnd w:id="10"/>
       <w:bookmarkEnd w:id="11"/>
       <w:bookmarkEnd w:id="12"/>
       <w:bookmarkEnd w:id="13"/>
+      <w:r>
+        <w:t>Cos’è l’NFC?</w:t>
+      </w:r>
       <w:bookmarkEnd w:id="14"/>
-      <w:r>
-        <w:t>Cos’è l’NFC?</w:t>
-      </w:r>
-      <w:bookmarkEnd w:id="15"/>
     </w:p>
     <w:p>
       <w:r>
@@ -4778,10 +4769,10 @@
         <w:t xml:space="preserve"> </w:t>
       </w:r>
     </w:p>
+    <w:bookmarkEnd w:id="15"/>
     <w:bookmarkEnd w:id="16"/>
     <w:bookmarkEnd w:id="17"/>
     <w:bookmarkEnd w:id="18"/>
-    <w:bookmarkEnd w:id="19"/>
     <w:p>
       <w:pPr>
         <w:pStyle w:val="Titolo3"/>
@@ -6242,65 +6233,65 @@
       <w:pPr>
         <w:pStyle w:val="Titolo3"/>
       </w:pPr>
-      <w:bookmarkStart w:id="20" w:name="_Toc160445518"/>
+      <w:bookmarkStart w:id="19" w:name="_Toc160445518"/>
       <w:r>
         <w:t>1.1.1 Vantaggi</w:t>
       </w:r>
+      <w:bookmarkEnd w:id="19"/>
+    </w:p>
+    <w:p>
+      <w:pPr>
+        <w:pStyle w:val="SUPSITestoArial10"/>
+        <w:rPr>
+          <w:sz w:val="20"/>
+        </w:rPr>
+      </w:pPr>
+      <w:r>
+        <w:rPr>
+          <w:sz w:val="20"/>
+        </w:rPr>
+        <w:t xml:space="preserve">I vantaggi che porta </w:t>
+      </w:r>
+      <w:r>
+        <w:rPr>
+          <w:sz w:val="20"/>
+        </w:rPr>
+        <w:t>l’NFC per il progetto in questione …</w:t>
+      </w:r>
+    </w:p>
+    <w:p>
+      <w:pPr>
+        <w:pStyle w:val="Titolo3"/>
+      </w:pPr>
+      <w:bookmarkStart w:id="20" w:name="_Toc160445519"/>
+      <w:r>
+        <w:t xml:space="preserve">1.1.2 </w:t>
+      </w:r>
+      <w:r>
+        <w:t>Svantaggi</w:t>
+      </w:r>
       <w:bookmarkEnd w:id="20"/>
     </w:p>
     <w:p>
       <w:pPr>
         <w:pStyle w:val="SUPSITestoArial10"/>
-        <w:rPr>
-          <w:sz w:val="20"/>
-        </w:rPr>
-      </w:pPr>
-      <w:r>
-        <w:rPr>
-          <w:sz w:val="20"/>
-        </w:rPr>
-        <w:t xml:space="preserve">I vantaggi che porta </w:t>
-      </w:r>
-      <w:r>
-        <w:rPr>
-          <w:sz w:val="20"/>
-        </w:rPr>
-        <w:t>l’NFC per il progetto in questione …</w:t>
+      </w:pPr>
+      <w:r>
+        <w:rPr>
+          <w:sz w:val="20"/>
+        </w:rPr>
+        <w:t>Gli svantaggi che porta l’NFC per il progetto in questione …</w:t>
       </w:r>
     </w:p>
     <w:p>
       <w:pPr>
         <w:pStyle w:val="Titolo3"/>
       </w:pPr>
-      <w:bookmarkStart w:id="21" w:name="_Toc160445519"/>
-      <w:r>
-        <w:t xml:space="preserve">1.1.2 </w:t>
-      </w:r>
-      <w:r>
-        <w:t>Svantaggi</w:t>
+      <w:bookmarkStart w:id="21" w:name="_Toc160445520"/>
+      <w:r>
+        <w:t>1.1.3 Campi di applicazione</w:t>
       </w:r>
       <w:bookmarkEnd w:id="21"/>
-    </w:p>
-    <w:p>
-      <w:pPr>
-        <w:pStyle w:val="SUPSITestoArial10"/>
-      </w:pPr>
-      <w:r>
-        <w:rPr>
-          <w:sz w:val="20"/>
-        </w:rPr>
-        <w:t>Gli svantaggi che porta l’NFC per il progetto in questione …</w:t>
-      </w:r>
-    </w:p>
-    <w:p>
-      <w:pPr>
-        <w:pStyle w:val="Titolo3"/>
-      </w:pPr>
-      <w:bookmarkStart w:id="22" w:name="_Toc160445520"/>
-      <w:r>
-        <w:t>1.1.3 Campi di applicazione</w:t>
-      </w:r>
-      <w:bookmarkEnd w:id="22"/>
     </w:p>
     <w:p>
       <w:pPr>
@@ -6455,7 +6446,7 @@
           <w:lang w:val="it-CH"/>
         </w:rPr>
       </w:pPr>
-      <w:bookmarkStart w:id="23" w:name="_Toc160445521"/>
+      <w:bookmarkStart w:id="22" w:name="_Toc160445521"/>
       <w:r>
         <w:rPr>
           <w:lang w:val="it-CH"/>
@@ -6477,7 +6468,7 @@
         <w:lastRenderedPageBreak/>
         <w:t xml:space="preserve">1.2 </w:t>
       </w:r>
-      <w:bookmarkEnd w:id="23"/>
+      <w:bookmarkEnd w:id="22"/>
       <w:r>
         <w:rPr>
           <w:lang w:val="it-CH"/>
@@ -6764,32 +6755,22 @@
       <w:pPr>
         <w:pStyle w:val="Didascalia"/>
       </w:pPr>
-      <w:bookmarkStart w:id="24" w:name="_Toc164256788"/>
+      <w:bookmarkStart w:id="23" w:name="_Toc164256788"/>
       <w:r>
         <w:t xml:space="preserve">Figura </w:t>
       </w:r>
-      <w:r>
-        <w:fldChar w:fldCharType="begin"/>
-      </w:r>
-      <w:r>
-        <w:instrText xml:space="preserve"> SEQ Figura \* ARABIC </w:instrText>
-      </w:r>
-      <w:r>
-        <w:fldChar w:fldCharType="separate"/>
-      </w:r>
-      <w:r>
-        <w:rPr>
-          <w:noProof/>
-        </w:rPr>
-        <w:t>1</w:t>
-      </w:r>
-      <w:r>
-        <w:fldChar w:fldCharType="end"/>
-      </w:r>
+      <w:fldSimple w:instr=" SEQ Figura \* ARABIC ">
+        <w:r>
+          <w:rPr>
+            <w:noProof/>
+          </w:rPr>
+          <w:t>1</w:t>
+        </w:r>
+      </w:fldSimple>
       <w:r>
         <w:t xml:space="preserve"> - Confronto tra i tipi di web</w:t>
       </w:r>
-      <w:bookmarkEnd w:id="24"/>
+      <w:bookmarkEnd w:id="23"/>
     </w:p>
     <w:p>
       <w:pPr>
@@ -6859,28 +6840,18 @@
       <w:pPr>
         <w:pStyle w:val="Didascalia"/>
       </w:pPr>
-      <w:bookmarkStart w:id="25" w:name="_Toc164256789"/>
+      <w:bookmarkStart w:id="24" w:name="_Toc164256789"/>
       <w:r>
         <w:t xml:space="preserve">Figura </w:t>
       </w:r>
-      <w:r>
-        <w:fldChar w:fldCharType="begin"/>
-      </w:r>
-      <w:r>
-        <w:instrText xml:space="preserve"> SEQ Figura \* ARABIC </w:instrText>
-      </w:r>
-      <w:r>
-        <w:fldChar w:fldCharType="separate"/>
-      </w:r>
-      <w:r>
-        <w:rPr>
-          <w:noProof/>
-        </w:rPr>
-        <w:t>2</w:t>
-      </w:r>
-      <w:r>
-        <w:fldChar w:fldCharType="end"/>
-      </w:r>
+      <w:fldSimple w:instr=" SEQ Figura \* ARABIC ">
+        <w:r>
+          <w:rPr>
+            <w:noProof/>
+          </w:rPr>
+          <w:t>2</w:t>
+        </w:r>
+      </w:fldSimple>
       <w:r>
         <w:t xml:space="preserve"> - Confronto tra centralizzato e </w:t>
       </w:r>
@@ -6888,7 +6859,7 @@
       <w:r>
         <w:t>decntralizzato</w:t>
       </w:r>
-      <w:bookmarkEnd w:id="25"/>
+      <w:bookmarkEnd w:id="24"/>
       <w:proofErr w:type="spellEnd"/>
     </w:p>
     <w:p>
@@ -7218,6 +7189,7 @@
       </w:pPr>
       <w:r>
         <w:rPr>
+          <w:noProof/>
           <w:sz w:val="20"/>
           <w:lang w:val="en-US"/>
         </w:rPr>
@@ -7476,6 +7448,7 @@
       </w:pPr>
       <w:r>
         <w:rPr>
+          <w:noProof/>
           <w:sz w:val="20"/>
           <w:lang w:val="en-US"/>
         </w:rPr>
@@ -9048,7 +9021,7 @@
       <w:pPr>
         <w:pStyle w:val="Titolo"/>
       </w:pPr>
-      <w:bookmarkStart w:id="26" w:name="_Toc160445522"/>
+      <w:bookmarkStart w:id="25" w:name="_Toc160445522"/>
       <w:r>
         <w:rPr>
           <w:lang w:val="it-CH"/>
@@ -9080,101 +9053,314 @@
         </w:rPr>
         <w:t>Approccio al problema</w:t>
       </w:r>
+      <w:bookmarkEnd w:id="25"/>
+    </w:p>
+    <w:p>
+      <w:pPr>
+        <w:pStyle w:val="SUPSITestoArial10"/>
+      </w:pPr>
+      <w:r>
+        <w:t xml:space="preserve">In questo capitolo viene affrontato l’approccio al </w:t>
+      </w:r>
+      <w:r>
+        <w:t>problema</w:t>
+      </w:r>
+      <w:r>
+        <w:t xml:space="preserve"> che è stato </w:t>
+      </w:r>
+      <w:r>
+        <w:t>utilizzato</w:t>
+      </w:r>
+      <w:r>
+        <w:t>.</w:t>
+      </w:r>
+      <w:r>
+        <w:t xml:space="preserve"> Come prima cosa ci sarà la parte di analisi a proposito di </w:t>
+      </w:r>
+      <w:proofErr w:type="spellStart"/>
+      <w:r>
+        <w:t>HexCard</w:t>
+      </w:r>
+      <w:proofErr w:type="spellEnd"/>
+      <w:r>
+        <w:t xml:space="preserve">. Quindi si vedrà la struttura del database, le funzionalità di base delle tecnologie utilizzate e delle loro peculiarità. </w:t>
+      </w:r>
+      <w:r>
+        <w:t>Si vedrà la struttura delle classi e come si intende testare il progetto.</w:t>
+      </w:r>
+    </w:p>
+    <w:p>
+      <w:pPr>
+        <w:pStyle w:val="SUPSITestoArial10"/>
+      </w:pPr>
+      <w:r>
+        <w:t xml:space="preserve">In </w:t>
+      </w:r>
+      <w:proofErr w:type="spellStart"/>
+      <w:r>
+        <w:t>seguit</w:t>
+      </w:r>
+      <w:proofErr w:type="spellEnd"/>
+      <w:r>
+        <w:t xml:space="preserve"> sarà presente la parte sui database decentralizzati, la scelta su qualche sarebbe meglio utilizzare e l’idea della possibile implementazione di esso all’interno del progetto in questione. Il tutto si fermerà ad una linea teoria, nel capitolo successivo </w:t>
+      </w:r>
+      <w:proofErr w:type="spellStart"/>
+      <w:r>
+        <w:t>verrano</w:t>
+      </w:r>
+      <w:proofErr w:type="spellEnd"/>
+      <w:r>
+        <w:t xml:space="preserve"> messe delle idee su come sarebbe possibile implementarlo effettivamente, ma il tutto senza effettivamente implementarlo.</w:t>
+      </w:r>
+    </w:p>
+    <w:p>
+      <w:pPr>
+        <w:pStyle w:val="Titolo2"/>
+        <w:rPr>
+          <w:lang w:val="fr-FR"/>
+        </w:rPr>
+      </w:pPr>
+      <w:bookmarkStart w:id="26" w:name="_Toc73344990"/>
+      <w:bookmarkStart w:id="27" w:name="_Toc73345131"/>
+      <w:bookmarkStart w:id="28" w:name="_Toc73345146"/>
+      <w:bookmarkStart w:id="29" w:name="_Toc82498959"/>
+      <w:bookmarkStart w:id="30" w:name="_Toc160445523"/>
+      <w:r>
+        <w:rPr>
+          <w:lang w:val="fr-FR"/>
+        </w:rPr>
+        <w:t xml:space="preserve">2.1 </w:t>
+      </w:r>
       <w:bookmarkEnd w:id="26"/>
-    </w:p>
-    <w:p>
-      <w:pPr>
-        <w:pStyle w:val="SUPSITestoArial10"/>
-      </w:pPr>
-      <w:r>
-        <w:t xml:space="preserve">In questo capitolo viene affrontato l’approccio al </w:t>
-      </w:r>
-      <w:r>
-        <w:t>problema</w:t>
-      </w:r>
-      <w:r>
-        <w:t xml:space="preserve"> che è stato </w:t>
-      </w:r>
-      <w:r>
-        <w:t>utilizzato</w:t>
-      </w:r>
-      <w:r>
-        <w:t>.</w:t>
-      </w:r>
-      <w:r>
-        <w:t xml:space="preserve"> Come prima cosa ci sarà la parte di analisi a proposito di </w:t>
-      </w:r>
-      <w:proofErr w:type="spellStart"/>
-      <w:r>
-        <w:t>HexCard</w:t>
-      </w:r>
-      <w:proofErr w:type="spellEnd"/>
-      <w:r>
-        <w:t xml:space="preserve">. Quindi si vedrà la struttura del database, le funzionalità di base delle tecnologie utilizzate e delle loro peculiarità. </w:t>
-      </w:r>
-      <w:r>
-        <w:t>Si vedrà la struttura delle classi e come si intende testare il progetto.</w:t>
-      </w:r>
-    </w:p>
-    <w:p>
-      <w:pPr>
-        <w:pStyle w:val="SUPSITestoArial10"/>
-      </w:pPr>
-      <w:r>
-        <w:t xml:space="preserve">In </w:t>
-      </w:r>
-      <w:proofErr w:type="spellStart"/>
-      <w:r>
-        <w:t>seguit</w:t>
-      </w:r>
-      <w:proofErr w:type="spellEnd"/>
-      <w:r>
-        <w:t xml:space="preserve"> sarà presente la parte sui database decentralizzati, la scelta su qualche sarebbe meglio utilizzare e l’idea della possibile implementazione di esso all’interno del progetto in questione. Il tutto si fermerà ad una linea teoria, nel capitolo successivo </w:t>
-      </w:r>
-      <w:proofErr w:type="spellStart"/>
-      <w:r>
-        <w:t>verrano</w:t>
-      </w:r>
-      <w:proofErr w:type="spellEnd"/>
-      <w:r>
-        <w:t xml:space="preserve"> messe delle idee su come sarebbe possibile implementarlo effettivamente, ma il tutto senza effettivamente implementarlo.</w:t>
-      </w:r>
-    </w:p>
-    <w:p>
-      <w:pPr>
-        <w:pStyle w:val="Titolo2"/>
-        <w:rPr>
-          <w:lang w:val="fr-FR"/>
-        </w:rPr>
-      </w:pPr>
-      <w:bookmarkStart w:id="27" w:name="_Toc73344990"/>
-      <w:bookmarkStart w:id="28" w:name="_Toc73345131"/>
-      <w:bookmarkStart w:id="29" w:name="_Toc73345146"/>
-      <w:bookmarkStart w:id="30" w:name="_Toc82498959"/>
-      <w:bookmarkStart w:id="31" w:name="_Toc160445523"/>
-      <w:r>
-        <w:rPr>
-          <w:lang w:val="fr-FR"/>
-        </w:rPr>
-        <w:t xml:space="preserve">2.1 </w:t>
-      </w:r>
       <w:bookmarkEnd w:id="27"/>
       <w:bookmarkEnd w:id="28"/>
       <w:bookmarkEnd w:id="29"/>
       <w:bookmarkEnd w:id="30"/>
+      <w:proofErr w:type="spellStart"/>
+      <w:r>
+        <w:rPr>
+          <w:lang w:val="fr-FR"/>
+        </w:rPr>
+        <w:t>Struttura</w:t>
+      </w:r>
+      <w:proofErr w:type="spellEnd"/>
+      <w:r>
+        <w:rPr>
+          <w:lang w:val="fr-FR"/>
+        </w:rPr>
+        <w:t xml:space="preserve"> </w:t>
+      </w:r>
+      <w:proofErr w:type="spellStart"/>
+      <w:r>
+        <w:rPr>
+          <w:lang w:val="fr-FR"/>
+        </w:rPr>
+        <w:t>database</w:t>
+      </w:r>
+      <w:proofErr w:type="spellEnd"/>
+      <w:r>
+        <w:rPr>
+          <w:lang w:val="fr-FR"/>
+        </w:rPr>
+        <w:t xml:space="preserve"> </w:t>
+      </w:r>
+      <w:proofErr w:type="spellStart"/>
+      <w:r>
+        <w:rPr>
+          <w:lang w:val="fr-FR"/>
+        </w:rPr>
+        <w:t>del</w:t>
+      </w:r>
+      <w:proofErr w:type="spellEnd"/>
+      <w:r>
+        <w:rPr>
+          <w:lang w:val="fr-FR"/>
+        </w:rPr>
+        <w:t xml:space="preserve"> </w:t>
+      </w:r>
+      <w:proofErr w:type="spellStart"/>
+      <w:r>
+        <w:rPr>
+          <w:lang w:val="fr-FR"/>
+        </w:rPr>
+        <w:t>progetto</w:t>
+      </w:r>
+      <w:proofErr w:type="spellEnd"/>
+    </w:p>
+    <w:p>
+      <w:pPr>
+        <w:rPr>
+          <w:lang w:val="fr-FR"/>
+        </w:rPr>
+      </w:pPr>
+      <w:r>
+        <w:rPr>
+          <w:lang w:val="fr-FR"/>
+        </w:rPr>
+        <w:t xml:space="preserve">Per il </w:t>
+      </w:r>
+      <w:proofErr w:type="spellStart"/>
+      <w:r>
+        <w:rPr>
+          <w:lang w:val="fr-FR"/>
+        </w:rPr>
+        <w:t>progetto</w:t>
+      </w:r>
+      <w:proofErr w:type="spellEnd"/>
+      <w:r>
+        <w:rPr>
+          <w:lang w:val="fr-FR"/>
+        </w:rPr>
+        <w:t xml:space="preserve"> la </w:t>
+      </w:r>
+      <w:proofErr w:type="spellStart"/>
+      <w:r>
+        <w:rPr>
+          <w:lang w:val="fr-FR"/>
+        </w:rPr>
+        <w:t>struttura</w:t>
+      </w:r>
+      <w:proofErr w:type="spellEnd"/>
+      <w:r>
+        <w:rPr>
+          <w:lang w:val="fr-FR"/>
+        </w:rPr>
+        <w:t xml:space="preserve"> </w:t>
+      </w:r>
+      <w:proofErr w:type="spellStart"/>
+      <w:r>
+        <w:rPr>
+          <w:lang w:val="fr-FR"/>
+        </w:rPr>
+        <w:t>del</w:t>
+      </w:r>
+      <w:proofErr w:type="spellEnd"/>
+      <w:r>
+        <w:rPr>
+          <w:lang w:val="fr-FR"/>
+        </w:rPr>
+        <w:t xml:space="preserve"> </w:t>
+      </w:r>
+      <w:proofErr w:type="spellStart"/>
+      <w:r>
+        <w:rPr>
+          <w:lang w:val="fr-FR"/>
+        </w:rPr>
+        <w:t>database</w:t>
+      </w:r>
+      <w:proofErr w:type="spellEnd"/>
+      <w:r>
+        <w:rPr>
+          <w:lang w:val="fr-FR"/>
+        </w:rPr>
+        <w:t xml:space="preserve"> </w:t>
+      </w:r>
+      <w:proofErr w:type="spellStart"/>
+      <w:r>
+        <w:rPr>
+          <w:lang w:val="fr-FR"/>
+        </w:rPr>
+        <w:t>iniziale</w:t>
+      </w:r>
+      <w:proofErr w:type="spellEnd"/>
+      <w:r>
+        <w:rPr>
+          <w:lang w:val="fr-FR"/>
+        </w:rPr>
+        <w:t xml:space="preserve"> </w:t>
+      </w:r>
+      <w:proofErr w:type="spellStart"/>
+      <w:r>
+        <w:rPr>
+          <w:lang w:val="fr-FR"/>
+        </w:rPr>
+        <w:t>pensata</w:t>
+      </w:r>
+      <w:proofErr w:type="spellEnd"/>
+      <w:r>
+        <w:rPr>
+          <w:lang w:val="fr-FR"/>
+        </w:rPr>
+        <w:t xml:space="preserve"> è la </w:t>
+      </w:r>
+      <w:proofErr w:type="spellStart"/>
+      <w:r>
+        <w:rPr>
+          <w:lang w:val="fr-FR"/>
+        </w:rPr>
+        <w:t>seguente</w:t>
+      </w:r>
+      <w:proofErr w:type="spellEnd"/>
+      <w:r>
+        <w:rPr>
+          <w:lang w:val="fr-FR"/>
+        </w:rPr>
+        <w:t> :</w:t>
+      </w:r>
+      <w:bookmarkStart w:id="31" w:name="_GoBack"/>
       <w:bookmarkEnd w:id="31"/>
-      <w:proofErr w:type="spellStart"/>
-      <w:r>
+    </w:p>
+    <w:p>
+      <w:pPr>
         <w:rPr>
           <w:lang w:val="fr-FR"/>
         </w:rPr>
-        <w:t>Struttura</w:t>
-      </w:r>
-      <w:proofErr w:type="spellEnd"/>
+      </w:pPr>
       <w:r>
         <w:rPr>
           <w:lang w:val="fr-FR"/>
         </w:rPr>
+        <w:pict w14:anchorId="7BCFD066">
+          <v:shapetype id="_x0000_t75" coordsize="21600,21600" o:spt="75" o:preferrelative="t" path="m@4@5l@4@11@9@11@9@5xe" filled="f" stroked="f">
+            <v:stroke joinstyle="miter"/>
+            <v:formulas>
+              <v:f eqn="if lineDrawn pixelLineWidth 0"/>
+              <v:f eqn="sum @0 1 0"/>
+              <v:f eqn="sum 0 0 @1"/>
+              <v:f eqn="prod @2 1 2"/>
+              <v:f eqn="prod @3 21600 pixelWidth"/>
+              <v:f eqn="prod @3 21600 pixelHeight"/>
+              <v:f eqn="sum @0 0 1"/>
+              <v:f eqn="prod @6 1 2"/>
+              <v:f eqn="prod @7 21600 pixelWidth"/>
+              <v:f eqn="sum @8 21600 0"/>
+              <v:f eqn="prod @7 21600 pixelHeight"/>
+              <v:f eqn="sum @10 21600 0"/>
+            </v:formulas>
+            <v:path o:extrusionok="f" gradientshapeok="t" o:connecttype="rect"/>
+            <o:lock v:ext="edit" aspectratio="t"/>
+          </v:shapetype>
+          <v:shape id="_x0000_i1025" type="#_x0000_t75" style="width:453.35pt;height:395.35pt">
+            <v:imagedata r:id="rId27" o:title="hexcard"/>
+          </v:shape>
+        </w:pict>
+      </w:r>
+    </w:p>
+    <w:p>
+      <w:pPr>
+        <w:pStyle w:val="Titolo2"/>
+        <w:rPr>
+          <w:lang w:val="fr-FR"/>
+        </w:rPr>
+      </w:pPr>
+      <w:r>
+        <w:rPr>
+          <w:lang w:val="fr-FR"/>
+        </w:rPr>
+        <w:t xml:space="preserve">2.2 </w:t>
+      </w:r>
+      <w:proofErr w:type="spellStart"/>
+      <w:r>
+        <w:rPr>
+          <w:lang w:val="fr-FR"/>
+        </w:rPr>
+        <w:t>Database</w:t>
+      </w:r>
+      <w:proofErr w:type="spellEnd"/>
+      <w:r>
+        <w:rPr>
+          <w:lang w:val="fr-FR"/>
+        </w:rPr>
         <w:t xml:space="preserve"> </w:t>
       </w:r>
       <w:proofErr w:type="spellStart"/>
@@ -9182,91 +9368,6 @@
         <w:rPr>
           <w:lang w:val="fr-FR"/>
         </w:rPr>
-        <w:t>database</w:t>
-      </w:r>
-      <w:proofErr w:type="spellEnd"/>
-      <w:r>
-        <w:rPr>
-          <w:lang w:val="fr-FR"/>
-        </w:rPr>
-        <w:t xml:space="preserve"> </w:t>
-      </w:r>
-      <w:proofErr w:type="spellStart"/>
-      <w:r>
-        <w:rPr>
-          <w:lang w:val="fr-FR"/>
-        </w:rPr>
-        <w:t>del</w:t>
-      </w:r>
-      <w:proofErr w:type="spellEnd"/>
-      <w:r>
-        <w:rPr>
-          <w:lang w:val="fr-FR"/>
-        </w:rPr>
-        <w:t xml:space="preserve"> </w:t>
-      </w:r>
-      <w:proofErr w:type="spellStart"/>
-      <w:r>
-        <w:rPr>
-          <w:lang w:val="fr-FR"/>
-        </w:rPr>
-        <w:t>progetto</w:t>
-      </w:r>
-      <w:proofErr w:type="spellEnd"/>
-    </w:p>
-    <w:p>
-      <w:pPr>
-        <w:rPr>
-          <w:lang w:val="fr-FR"/>
-        </w:rPr>
-      </w:pPr>
-      <w:r>
-        <w:rPr>
-          <w:lang w:val="fr-FR"/>
-        </w:rPr>
-        <w:t xml:space="preserve">Per il </w:t>
-      </w:r>
-      <w:proofErr w:type="spellStart"/>
-      <w:r>
-        <w:rPr>
-          <w:lang w:val="fr-FR"/>
-        </w:rPr>
-        <w:t>progetto</w:t>
-      </w:r>
-      <w:proofErr w:type="spellEnd"/>
-    </w:p>
-    <w:p>
-      <w:pPr>
-        <w:pStyle w:val="Titolo2"/>
-        <w:rPr>
-          <w:lang w:val="fr-FR"/>
-        </w:rPr>
-      </w:pPr>
-      <w:r>
-        <w:rPr>
-          <w:lang w:val="fr-FR"/>
-        </w:rPr>
-        <w:t xml:space="preserve">2.2 </w:t>
-      </w:r>
-      <w:proofErr w:type="spellStart"/>
-      <w:r>
-        <w:rPr>
-          <w:lang w:val="fr-FR"/>
-        </w:rPr>
-        <w:t>Database</w:t>
-      </w:r>
-      <w:proofErr w:type="spellEnd"/>
-      <w:r>
-        <w:rPr>
-          <w:lang w:val="fr-FR"/>
-        </w:rPr>
-        <w:t xml:space="preserve"> </w:t>
-      </w:r>
-      <w:proofErr w:type="spellStart"/>
-      <w:r>
-        <w:rPr>
-          <w:lang w:val="fr-FR"/>
-        </w:rPr>
         <w:t>decentralizzati</w:t>
       </w:r>
       <w:proofErr w:type="spellEnd"/>
@@ -9282,7 +9383,14 @@
         <w:rPr>
           <w:sz w:val="20"/>
         </w:rPr>
-        <w:t>L'idea è quella di utilizzare un database decentralizzato per salvare i dati di quello che dovranno far visualizzare le carte NFC. Facendo delle richieste API apposite, è possibile prendere informazioni dai database decentralizzati e si è sicuri che i dati sono raggiungibili e aggiornati.</w:t>
+        <w:t xml:space="preserve">L'idea è quella di utilizzare un database decentralizzato per salvare i dati di quello che dovranno far visualizzare le carte NFC. Facendo delle richieste API apposite, è possibile prendere informazioni dai </w:t>
+      </w:r>
+      <w:r>
+        <w:rPr>
+          <w:sz w:val="20"/>
+        </w:rPr>
+        <w:lastRenderedPageBreak/>
+        <w:t>database decentralizzati e si è sicuri che i dati sono raggiungibili e aggiornati.</w:t>
       </w:r>
       <w:r>
         <w:rPr>
@@ -9590,7 +9698,7 @@
         </w:rPr>
         <w:t xml:space="preserve"> (</w:t>
       </w:r>
-      <w:hyperlink r:id="rId27">
+      <w:hyperlink r:id="rId28">
         <w:r>
           <w:rPr>
             <w:rStyle w:val="Collegamentoipertestuale"/>
@@ -9611,12 +9719,6 @@
           <w:sz w:val="20"/>
         </w:rPr>
         <w:br/>
-      </w:r>
-      <w:r>
-        <w:rPr>
-          <w:sz w:val="20"/>
-        </w:rPr>
-        <w:lastRenderedPageBreak/>
         <w:t xml:space="preserve">Tramite richieste API del servizio </w:t>
       </w:r>
       <w:proofErr w:type="spellStart"/>
@@ -9833,6 +9935,7 @@
         <w:rPr>
           <w:sz w:val="20"/>
         </w:rPr>
+        <w:lastRenderedPageBreak/>
         <w:t>Ci sono altri metodi simili ai database decentralizzati con il P2P che permettono di raggiungere i dati in caso un server non sia raggiungibile. Come descritto precedentemente, ci sono dei database centralizzati che usano alcune ideologie del P2P per distribuire i dati in altri server. Questo metodo è chiamato «multi-</w:t>
       </w:r>
       <w:proofErr w:type="spellStart"/>
@@ -10055,14 +10158,7 @@
         <w:rPr>
           <w:sz w:val="20"/>
         </w:rPr>
-        <w:t xml:space="preserve"> che già esistono, sarà possibile usufruirne ma richiede molto tempo, anche per capire come </w:t>
-      </w:r>
-      <w:r>
-        <w:rPr>
-          <w:sz w:val="20"/>
-        </w:rPr>
-        <w:lastRenderedPageBreak/>
-        <w:t xml:space="preserve">funziona e come utilizzarlo. In secondo luogo, ci si impiegherà molto tempo per implementare e usufruire dei dati nelle </w:t>
+        <w:t xml:space="preserve"> che già esistono, sarà possibile usufruirne ma richiede molto tempo, anche per capire come funziona e come utilizzarlo. In secondo luogo, ci si impiegherà molto tempo per implementare e usufruire dei dati nelle </w:t>
       </w:r>
       <w:proofErr w:type="spellStart"/>
       <w:r>
@@ -10220,6 +10316,7 @@
         <w:rPr>
           <w:sz w:val="20"/>
         </w:rPr>
+        <w:lastRenderedPageBreak/>
         <w:t>Questo porta però ad un uso totalmente centralizzato del progetto.</w:t>
       </w:r>
     </w:p>
@@ -10626,7 +10723,7 @@
       <w:pPr>
         <w:pStyle w:val="SUPSITestoArial10"/>
       </w:pPr>
-      <w:hyperlink r:id="rId28" w:history="1">
+      <w:hyperlink r:id="rId29" w:history="1">
         <w:r>
           <w:rPr>
             <w:rStyle w:val="Collegamentoipertestuale"/>
@@ -11075,11 +11172,11 @@
       </w:pPr>
     </w:p>
     <w:sectPr>
-      <w:headerReference w:type="even" r:id="rId29"/>
-      <w:headerReference w:type="default" r:id="rId30"/>
-      <w:footerReference w:type="default" r:id="rId31"/>
-      <w:headerReference w:type="first" r:id="rId32"/>
-      <w:footerReference w:type="first" r:id="rId33"/>
+      <w:headerReference w:type="even" r:id="rId30"/>
+      <w:headerReference w:type="default" r:id="rId31"/>
+      <w:footerReference w:type="default" r:id="rId32"/>
+      <w:headerReference w:type="first" r:id="rId33"/>
+      <w:footerReference w:type="first" r:id="rId34"/>
       <w:pgSz w:w="11900" w:h="16840" w:code="9"/>
       <w:pgMar w:top="1729" w:right="1134" w:bottom="851" w:left="1701" w:header="550" w:footer="567" w:gutter="0"/>
       <w:cols w:space="708"/>
@@ -11330,7 +11427,7 @@
         <w:sz w:val="16"/>
         <w:szCs w:val="16"/>
       </w:rPr>
-      <w:t>11</w:t>
+      <w:t>22</w:t>
     </w:r>
     <w:r>
       <w:rPr>
@@ -11379,7 +11476,7 @@
         <w:sz w:val="16"/>
         <w:szCs w:val="16"/>
       </w:rPr>
-      <w:t>27</w:t>
+      <w:t>28</w:t>
     </w:r>
     <w:r>
       <w:rPr>
@@ -12792,6 +12889,7 @@
   <w:style w:type="character" w:default="1" w:styleId="Carpredefinitoparagrafo">
     <w:name w:val="Default Paragraph Font"/>
     <w:uiPriority w:val="1"/>
+    <w:semiHidden/>
     <w:unhideWhenUsed/>
   </w:style>
   <w:style w:type="table" w:default="1" w:styleId="Tabellanormale">
@@ -13899,7 +13997,7 @@
 </file>
 
 <file path=customXml/itemProps1.xml><?xml version="1.0" encoding="utf-8"?>
-<ds:datastoreItem xmlns:ds="http://schemas.openxmlformats.org/officeDocument/2006/customXml" ds:itemID="{BB90E337-3DD5-4362-BA5E-63BB36BE1049}">
+<ds:datastoreItem xmlns:ds="http://schemas.openxmlformats.org/officeDocument/2006/customXml" ds:itemID="{3BCF3686-F6AA-4C5B-86BB-F041A9C0602E}">
   <ds:schemaRefs>
     <ds:schemaRef ds:uri="http://schemas.openxmlformats.org/officeDocument/2006/bibliography"/>
   </ds:schemaRefs>

</xml_diff>

<commit_message>
feature: card and user conroller/repo working
</commit_message>
<xml_diff>
--- a/rapporto/DOC_SARAK.docx
+++ b/rapporto/DOC_SARAK.docx
@@ -6759,14 +6759,36 @@
       <w:r>
         <w:t xml:space="preserve">Figura </w:t>
       </w:r>
-      <w:fldSimple w:instr=" SEQ Figura \* ARABIC ">
-        <w:r>
-          <w:rPr>
-            <w:noProof/>
-          </w:rPr>
-          <w:t>1</w:t>
-        </w:r>
-      </w:fldSimple>
+      <w:r>
+        <w:rPr>
+          <w:noProof/>
+        </w:rPr>
+        <w:fldChar w:fldCharType="begin"/>
+      </w:r>
+      <w:r>
+        <w:rPr>
+          <w:noProof/>
+        </w:rPr>
+        <w:instrText xml:space="preserve"> SEQ Figura \* ARABIC </w:instrText>
+      </w:r>
+      <w:r>
+        <w:rPr>
+          <w:noProof/>
+        </w:rPr>
+        <w:fldChar w:fldCharType="separate"/>
+      </w:r>
+      <w:r>
+        <w:rPr>
+          <w:noProof/>
+        </w:rPr>
+        <w:t>1</w:t>
+      </w:r>
+      <w:r>
+        <w:rPr>
+          <w:noProof/>
+        </w:rPr>
+        <w:fldChar w:fldCharType="end"/>
+      </w:r>
       <w:r>
         <w:t xml:space="preserve"> - Confronto tra i tipi di web</w:t>
       </w:r>
@@ -6844,14 +6866,36 @@
       <w:r>
         <w:t xml:space="preserve">Figura </w:t>
       </w:r>
-      <w:fldSimple w:instr=" SEQ Figura \* ARABIC ">
-        <w:r>
-          <w:rPr>
-            <w:noProof/>
-          </w:rPr>
-          <w:t>2</w:t>
-        </w:r>
-      </w:fldSimple>
+      <w:r>
+        <w:rPr>
+          <w:noProof/>
+        </w:rPr>
+        <w:fldChar w:fldCharType="begin"/>
+      </w:r>
+      <w:r>
+        <w:rPr>
+          <w:noProof/>
+        </w:rPr>
+        <w:instrText xml:space="preserve"> SEQ Figura \* ARABIC </w:instrText>
+      </w:r>
+      <w:r>
+        <w:rPr>
+          <w:noProof/>
+        </w:rPr>
+        <w:fldChar w:fldCharType="separate"/>
+      </w:r>
+      <w:r>
+        <w:rPr>
+          <w:noProof/>
+        </w:rPr>
+        <w:t>2</w:t>
+      </w:r>
+      <w:r>
+        <w:rPr>
+          <w:noProof/>
+        </w:rPr>
+        <w:fldChar w:fldCharType="end"/>
+      </w:r>
       <w:r>
         <w:t xml:space="preserve"> - Confronto tra centralizzato e </w:t>
       </w:r>
@@ -9190,11 +9234,13 @@
     <w:p>
       <w:pPr>
         <w:rPr>
+          <w:sz w:val="20"/>
           <w:lang w:val="fr-FR"/>
         </w:rPr>
       </w:pPr>
       <w:r>
         <w:rPr>
+          <w:sz w:val="20"/>
           <w:lang w:val="fr-FR"/>
         </w:rPr>
         <w:t xml:space="preserve">Per il </w:t>
@@ -9202,6 +9248,7 @@
       <w:proofErr w:type="spellStart"/>
       <w:r>
         <w:rPr>
+          <w:sz w:val="20"/>
           <w:lang w:val="fr-FR"/>
         </w:rPr>
         <w:t>progetto</w:t>
@@ -9209,6 +9256,7 @@
       <w:proofErr w:type="spellEnd"/>
       <w:r>
         <w:rPr>
+          <w:sz w:val="20"/>
           <w:lang w:val="fr-FR"/>
         </w:rPr>
         <w:t xml:space="preserve"> la </w:t>
@@ -9216,6 +9264,7 @@
       <w:proofErr w:type="spellStart"/>
       <w:r>
         <w:rPr>
+          <w:sz w:val="20"/>
           <w:lang w:val="fr-FR"/>
         </w:rPr>
         <w:t>struttura</w:t>
@@ -9223,6 +9272,7 @@
       <w:proofErr w:type="spellEnd"/>
       <w:r>
         <w:rPr>
+          <w:sz w:val="20"/>
           <w:lang w:val="fr-FR"/>
         </w:rPr>
         <w:t xml:space="preserve"> </w:t>
@@ -9230,6 +9280,7 @@
       <w:proofErr w:type="spellStart"/>
       <w:r>
         <w:rPr>
+          <w:sz w:val="20"/>
           <w:lang w:val="fr-FR"/>
         </w:rPr>
         <w:t>del</w:t>
@@ -9237,6 +9288,7 @@
       <w:proofErr w:type="spellEnd"/>
       <w:r>
         <w:rPr>
+          <w:sz w:val="20"/>
           <w:lang w:val="fr-FR"/>
         </w:rPr>
         <w:t xml:space="preserve"> </w:t>
@@ -9244,6 +9296,7 @@
       <w:proofErr w:type="spellStart"/>
       <w:r>
         <w:rPr>
+          <w:sz w:val="20"/>
           <w:lang w:val="fr-FR"/>
         </w:rPr>
         <w:t>database</w:t>
@@ -9251,6 +9304,7 @@
       <w:proofErr w:type="spellEnd"/>
       <w:r>
         <w:rPr>
+          <w:sz w:val="20"/>
           <w:lang w:val="fr-FR"/>
         </w:rPr>
         <w:t xml:space="preserve"> </w:t>
@@ -9258,6 +9312,7 @@
       <w:proofErr w:type="spellStart"/>
       <w:r>
         <w:rPr>
+          <w:sz w:val="20"/>
           <w:lang w:val="fr-FR"/>
         </w:rPr>
         <w:t>iniziale</w:t>
@@ -9265,6 +9320,7 @@
       <w:proofErr w:type="spellEnd"/>
       <w:r>
         <w:rPr>
+          <w:sz w:val="20"/>
           <w:lang w:val="fr-FR"/>
         </w:rPr>
         <w:t xml:space="preserve"> </w:t>
@@ -9272,6 +9328,7 @@
       <w:proofErr w:type="spellStart"/>
       <w:r>
         <w:rPr>
+          <w:sz w:val="20"/>
           <w:lang w:val="fr-FR"/>
         </w:rPr>
         <w:t>pensata</w:t>
@@ -9279,6 +9336,7 @@
       <w:proofErr w:type="spellEnd"/>
       <w:r>
         <w:rPr>
+          <w:sz w:val="20"/>
           <w:lang w:val="fr-FR"/>
         </w:rPr>
         <w:t xml:space="preserve"> è la </w:t>
@@ -9286,6 +9344,7 @@
       <w:proofErr w:type="spellStart"/>
       <w:r>
         <w:rPr>
+          <w:sz w:val="20"/>
           <w:lang w:val="fr-FR"/>
         </w:rPr>
         <w:t>seguente</w:t>
@@ -9293,18 +9352,15 @@
       <w:proofErr w:type="spellEnd"/>
       <w:r>
         <w:rPr>
+          <w:sz w:val="20"/>
           <w:lang w:val="fr-FR"/>
         </w:rPr>
         <w:t> :</w:t>
       </w:r>
-      <w:bookmarkStart w:id="31" w:name="_GoBack"/>
-      <w:bookmarkEnd w:id="31"/>
-    </w:p>
-    <w:p>
-      <w:pPr>
-        <w:rPr>
-          <w:lang w:val="fr-FR"/>
-        </w:rPr>
+    </w:p>
+    <w:p>
+      <w:pPr>
+        <w:keepNext/>
       </w:pPr>
       <w:r>
         <w:rPr>
@@ -9330,7 +9386,7 @@
             <v:path o:extrusionok="f" gradientshapeok="t" o:connecttype="rect"/>
             <o:lock v:ext="edit" aspectratio="t"/>
           </v:shapetype>
-          <v:shape id="_x0000_i1025" type="#_x0000_t75" style="width:453.35pt;height:395.35pt">
+          <v:shape id="_x0000_i1025" type="#_x0000_t75" style="width:453pt;height:395.4pt">
             <v:imagedata r:id="rId27" o:title="hexcard"/>
           </v:shape>
         </w:pict>
@@ -9338,6 +9394,56 @@
     </w:p>
     <w:p>
       <w:pPr>
+        <w:pStyle w:val="Didascalia"/>
+      </w:pPr>
+      <w:r>
+        <w:t xml:space="preserve">Figura </w:t>
+      </w:r>
+      <w:fldSimple w:instr=" SEQ Figura \* ARABIC ">
+        <w:r>
+          <w:rPr>
+            <w:noProof/>
+          </w:rPr>
+          <w:t>3</w:t>
+        </w:r>
+      </w:fldSimple>
+      <w:r>
+        <w:t xml:space="preserve"> - Schema ER iniziale del progetto</w:t>
+      </w:r>
+    </w:p>
+    <w:p>
+      <w:pPr>
+        <w:rPr>
+          <w:sz w:val="20"/>
+          <w:lang w:val="it-CH"/>
+        </w:rPr>
+      </w:pPr>
+      <w:r>
+        <w:rPr>
+          <w:sz w:val="20"/>
+          <w:lang w:val="it-CH"/>
+        </w:rPr>
+        <w:t xml:space="preserve">Essendo che l struttura di per se è relativamente semplice, la cosa più importante da fare sarà quello a cui è collegata la grafica in se per se. Difatti prevendo che la parte più complessa del progetto sarà non tanto il memorizzare i dati o le informazioni, o aggiornarle, ma quanto più il fattore di avere una grafica che mantenga lo stile dall’utente scelto e renderlo il più </w:t>
+      </w:r>
+      <w:r>
+        <w:rPr>
+          <w:sz w:val="20"/>
+          <w:lang w:val="it-CH"/>
+        </w:rPr>
+        <w:t>personalizzabile</w:t>
+      </w:r>
+      <w:bookmarkStart w:id="31" w:name="_GoBack"/>
+      <w:bookmarkEnd w:id="31"/>
+      <w:r>
+        <w:rPr>
+          <w:sz w:val="20"/>
+          <w:lang w:val="it-CH"/>
+        </w:rPr>
+        <w:t xml:space="preserve"> possibile.</w:t>
+      </w:r>
+    </w:p>
+    <w:p>
+      <w:pPr>
         <w:pStyle w:val="Titolo2"/>
         <w:rPr>
           <w:lang w:val="fr-FR"/>
@@ -9347,6 +9453,7 @@
         <w:rPr>
           <w:lang w:val="fr-FR"/>
         </w:rPr>
+        <w:lastRenderedPageBreak/>
         <w:t xml:space="preserve">2.2 </w:t>
       </w:r>
       <w:proofErr w:type="spellStart"/>
@@ -9383,14 +9490,7 @@
         <w:rPr>
           <w:sz w:val="20"/>
         </w:rPr>
-        <w:t xml:space="preserve">L'idea è quella di utilizzare un database decentralizzato per salvare i dati di quello che dovranno far visualizzare le carte NFC. Facendo delle richieste API apposite, è possibile prendere informazioni dai </w:t>
-      </w:r>
-      <w:r>
-        <w:rPr>
-          <w:sz w:val="20"/>
-        </w:rPr>
-        <w:lastRenderedPageBreak/>
-        <w:t>database decentralizzati e si è sicuri che i dati sono raggiungibili e aggiornati.</w:t>
+        <w:t>L'idea è quella di utilizzare un database decentralizzato per salvare i dati di quello che dovranno far visualizzare le carte NFC. Facendo delle richieste API apposite, è possibile prendere informazioni dai database decentralizzati e si è sicuri che i dati sono raggiungibili e aggiornati.</w:t>
       </w:r>
       <w:r>
         <w:rPr>
@@ -9881,6 +9981,7 @@
         <w:rPr>
           <w:sz w:val="20"/>
         </w:rPr>
+        <w:lastRenderedPageBreak/>
         <w:t xml:space="preserve">Una cosa importante da considerare è che all'interno della carta NFC ci dovranno essere le credenziali univoche dell'utente per connettersi alla rete </w:t>
       </w:r>
       <w:proofErr w:type="spellStart"/>
@@ -9935,7 +10036,6 @@
         <w:rPr>
           <w:sz w:val="20"/>
         </w:rPr>
-        <w:lastRenderedPageBreak/>
         <w:t>Ci sono altri metodi simili ai database decentralizzati con il P2P che permettono di raggiungere i dati in caso un server non sia raggiungibile. Come descritto precedentemente, ci sono dei database centralizzati che usano alcune ideologie del P2P per distribuire i dati in altri server. Questo metodo è chiamato «multi-</w:t>
       </w:r>
       <w:proofErr w:type="spellStart"/>
@@ -10302,6 +10402,7 @@
         <w:rPr>
           <w:sz w:val="20"/>
         </w:rPr>
+        <w:lastRenderedPageBreak/>
         <w:t>Questo sistema non utilizza database decentralizzati ma database centralizzati con dati replicati in altri server della stessa azienda o società che ne è in possesso. Il costo cambia a differenza del servizio che viene offerto dalle varie aziende.</w:t>
       </w:r>
     </w:p>
@@ -10316,7 +10417,6 @@
         <w:rPr>
           <w:sz w:val="20"/>
         </w:rPr>
-        <w:lastRenderedPageBreak/>
         <w:t>Questo porta però ad un uso totalmente centralizzato del progetto.</w:t>
       </w:r>
     </w:p>
@@ -11427,7 +11527,7 @@
         <w:sz w:val="16"/>
         <w:szCs w:val="16"/>
       </w:rPr>
-      <w:t>22</w:t>
+      <w:t>28</w:t>
     </w:r>
     <w:r>
       <w:rPr>
@@ -13997,7 +14097,7 @@
 </file>
 
 <file path=customXml/itemProps1.xml><?xml version="1.0" encoding="utf-8"?>
-<ds:datastoreItem xmlns:ds="http://schemas.openxmlformats.org/officeDocument/2006/customXml" ds:itemID="{3BCF3686-F6AA-4C5B-86BB-F041A9C0602E}">
+<ds:datastoreItem xmlns:ds="http://schemas.openxmlformats.org/officeDocument/2006/customXml" ds:itemID="{E6E4728F-0143-4D0E-8315-BEF29C43E9F9}">
   <ds:schemaRefs>
     <ds:schemaRef ds:uri="http://schemas.openxmlformats.org/officeDocument/2006/bibliography"/>
   </ds:schemaRefs>

</xml_diff>

<commit_message>
feature: basic repo file
</commit_message>
<xml_diff>
--- a/rapporto/DOC_SARAK.docx
+++ b/rapporto/DOC_SARAK.docx
@@ -9199,13 +9199,19 @@
         <w:rPr>
           <w:lang w:val="fr-FR"/>
         </w:rPr>
-        <w:t>database</w:t>
-      </w:r>
-      <w:proofErr w:type="spellEnd"/>
+        <w:t>d</w:t>
+      </w:r>
       <w:r>
         <w:rPr>
           <w:lang w:val="fr-FR"/>
         </w:rPr>
+        <w:t>el</w:t>
+      </w:r>
+      <w:proofErr w:type="spellEnd"/>
+      <w:r>
+        <w:rPr>
+          <w:lang w:val="fr-FR"/>
+        </w:rPr>
         <w:t xml:space="preserve"> </w:t>
       </w:r>
       <w:proofErr w:type="spellStart"/>
@@ -9213,21 +9219,35 @@
         <w:rPr>
           <w:lang w:val="fr-FR"/>
         </w:rPr>
-        <w:t>del</w:t>
-      </w:r>
-      <w:proofErr w:type="spellEnd"/>
-      <w:r>
-        <w:rPr>
-          <w:lang w:val="fr-FR"/>
-        </w:rPr>
-        <w:t xml:space="preserve"> </w:t>
-      </w:r>
-      <w:proofErr w:type="spellStart"/>
-      <w:r>
-        <w:rPr>
-          <w:lang w:val="fr-FR"/>
-        </w:rPr>
         <w:t>progetto</w:t>
+      </w:r>
+      <w:proofErr w:type="spellEnd"/>
+    </w:p>
+    <w:p>
+      <w:pPr>
+        <w:pStyle w:val="SUPSITestoArial10"/>
+        <w:rPr>
+          <w:b/>
+          <w:sz w:val="26"/>
+          <w:szCs w:val="26"/>
+        </w:rPr>
+      </w:pPr>
+      <w:r>
+        <w:rPr>
+          <w:b/>
+          <w:sz w:val="26"/>
+          <w:szCs w:val="26"/>
+        </w:rPr>
+        <w:t xml:space="preserve">2.1.1 </w:t>
+      </w:r>
+      <w:proofErr w:type="spellStart"/>
+      <w:r>
+        <w:rPr>
+          <w:b/>
+          <w:sz w:val="26"/>
+          <w:szCs w:val="26"/>
+        </w:rPr>
+        <w:t>Database</w:t>
       </w:r>
       <w:proofErr w:type="spellEnd"/>
     </w:p>
@@ -9386,7 +9406,7 @@
             <v:path o:extrusionok="f" gradientshapeok="t" o:connecttype="rect"/>
             <o:lock v:ext="edit" aspectratio="t"/>
           </v:shapetype>
-          <v:shape id="_x0000_i1025" type="#_x0000_t75" style="width:453pt;height:395.4pt">
+          <v:shape id="_x0000_i1025" type="#_x0000_t75" style="width:453.05pt;height:395.1pt">
             <v:imagedata r:id="rId27" o:title="hexcard"/>
           </v:shape>
         </w:pict>
@@ -9399,14 +9419,36 @@
       <w:r>
         <w:t xml:space="preserve">Figura </w:t>
       </w:r>
-      <w:fldSimple w:instr=" SEQ Figura \* ARABIC ">
-        <w:r>
-          <w:rPr>
-            <w:noProof/>
-          </w:rPr>
-          <w:t>3</w:t>
-        </w:r>
-      </w:fldSimple>
+      <w:r>
+        <w:rPr>
+          <w:noProof/>
+        </w:rPr>
+        <w:fldChar w:fldCharType="begin"/>
+      </w:r>
+      <w:r>
+        <w:rPr>
+          <w:noProof/>
+        </w:rPr>
+        <w:instrText xml:space="preserve"> SEQ Figura \* ARABIC </w:instrText>
+      </w:r>
+      <w:r>
+        <w:rPr>
+          <w:noProof/>
+        </w:rPr>
+        <w:fldChar w:fldCharType="separate"/>
+      </w:r>
+      <w:r>
+        <w:rPr>
+          <w:noProof/>
+        </w:rPr>
+        <w:t>3</w:t>
+      </w:r>
+      <w:r>
+        <w:rPr>
+          <w:noProof/>
+        </w:rPr>
+        <w:fldChar w:fldCharType="end"/>
+      </w:r>
       <w:r>
         <w:t xml:space="preserve"> - Schema ER iniziale del progetto</w:t>
       </w:r>
@@ -9423,7 +9465,15 @@
           <w:sz w:val="20"/>
           <w:lang w:val="it-CH"/>
         </w:rPr>
-        <w:t xml:space="preserve">Essendo che l struttura di per se è relativamente semplice, la cosa più importante da fare sarà quello a cui è collegata la grafica in se per se. Difatti prevendo che la parte più complessa del progetto sarà non tanto il memorizzare i dati o le informazioni, o aggiornarle, ma quanto più il fattore di avere una grafica che mantenga lo stile dall’utente scelto e renderlo il più </w:t>
+        <w:t xml:space="preserve">Essendo che l struttura di per se è relativamente semplice, la cosa più importante da fare sarà quello a cui è collegata la grafica in se per se. Difatti prevendo che la parte più complessa del progetto sarà non </w:t>
+      </w:r>
+      <w:r>
+        <w:rPr>
+          <w:sz w:val="20"/>
+          <w:lang w:val="it-CH"/>
+        </w:rPr>
+        <w:lastRenderedPageBreak/>
+        <w:t xml:space="preserve">tanto il memorizzare i dati o le informazioni, o aggiornarle, ma quanto più il fattore di avere una grafica che mantenga lo stile dall’utente scelto e renderlo il più </w:t>
       </w:r>
       <w:r>
         <w:rPr>
@@ -9432,251 +9482,12 @@
         </w:rPr>
         <w:t>personalizzabile</w:t>
       </w:r>
-      <w:bookmarkStart w:id="31" w:name="_GoBack"/>
-      <w:bookmarkEnd w:id="31"/>
       <w:r>
         <w:rPr>
           <w:sz w:val="20"/>
           <w:lang w:val="it-CH"/>
         </w:rPr>
         <w:t xml:space="preserve"> possibile.</w:t>
-      </w:r>
-    </w:p>
-    <w:p>
-      <w:pPr>
-        <w:pStyle w:val="Titolo2"/>
-        <w:rPr>
-          <w:lang w:val="fr-FR"/>
-        </w:rPr>
-      </w:pPr>
-      <w:r>
-        <w:rPr>
-          <w:lang w:val="fr-FR"/>
-        </w:rPr>
-        <w:lastRenderedPageBreak/>
-        <w:t xml:space="preserve">2.2 </w:t>
-      </w:r>
-      <w:proofErr w:type="spellStart"/>
-      <w:r>
-        <w:rPr>
-          <w:lang w:val="fr-FR"/>
-        </w:rPr>
-        <w:t>Database</w:t>
-      </w:r>
-      <w:proofErr w:type="spellEnd"/>
-      <w:r>
-        <w:rPr>
-          <w:lang w:val="fr-FR"/>
-        </w:rPr>
-        <w:t xml:space="preserve"> </w:t>
-      </w:r>
-      <w:proofErr w:type="spellStart"/>
-      <w:r>
-        <w:rPr>
-          <w:lang w:val="fr-FR"/>
-        </w:rPr>
-        <w:t>decentralizzati</w:t>
-      </w:r>
-      <w:proofErr w:type="spellEnd"/>
-    </w:p>
-    <w:p>
-      <w:pPr>
-        <w:pStyle w:val="SUPSITestoArial10"/>
-        <w:rPr>
-          <w:sz w:val="20"/>
-        </w:rPr>
-      </w:pPr>
-      <w:r>
-        <w:rPr>
-          <w:sz w:val="20"/>
-        </w:rPr>
-        <w:t>L'idea è quella di utilizzare un database decentralizzato per salvare i dati di quello che dovranno far visualizzare le carte NFC. Facendo delle richieste API apposite, è possibile prendere informazioni dai database decentralizzati e si è sicuri che i dati sono raggiungibili e aggiornati.</w:t>
-      </w:r>
-      <w:r>
-        <w:rPr>
-          <w:sz w:val="20"/>
-        </w:rPr>
-        <w:br/>
-        <w:t xml:space="preserve">Anche la modifica di un dato è possibile farlo tramite richieste API e verrà distribuito in tutti gli altri nodi all'interno della rete Web 3.0 autonomamente. </w:t>
-      </w:r>
-    </w:p>
-    <w:p>
-      <w:pPr>
-        <w:pStyle w:val="SUPSITestoArial10"/>
-        <w:rPr>
-          <w:sz w:val="20"/>
-        </w:rPr>
-      </w:pPr>
-      <w:r>
-        <w:rPr>
-          <w:sz w:val="20"/>
-        </w:rPr>
-        <w:t>Scelta della metodologia del database</w:t>
-      </w:r>
-    </w:p>
-    <w:p>
-      <w:pPr>
-        <w:pStyle w:val="SUPSITestoArial10"/>
-        <w:rPr>
-          <w:sz w:val="20"/>
-        </w:rPr>
-      </w:pPr>
-      <w:r>
-        <w:rPr>
-          <w:sz w:val="20"/>
-        </w:rPr>
-        <w:t>In primis si dovrà scegliere quale metodologia di database utilizzare in base al progetto. Si sa che i dati dovranno esser modificati dall'utente in possesso della propria carta NFC.</w:t>
-      </w:r>
-    </w:p>
-    <w:p>
-      <w:pPr>
-        <w:pStyle w:val="SUPSITestoArial10"/>
-        <w:rPr>
-          <w:sz w:val="20"/>
-        </w:rPr>
-      </w:pPr>
-      <w:r>
-        <w:rPr>
-          <w:sz w:val="20"/>
-        </w:rPr>
-        <w:t xml:space="preserve">Già da questa piccola considerazione, si può escludere la metodologia del </w:t>
-      </w:r>
-      <w:proofErr w:type="spellStart"/>
-      <w:r>
-        <w:rPr>
-          <w:sz w:val="20"/>
-        </w:rPr>
-        <w:t>blockchain</w:t>
-      </w:r>
-      <w:proofErr w:type="spellEnd"/>
-      <w:r>
-        <w:rPr>
-          <w:sz w:val="20"/>
-        </w:rPr>
-        <w:t xml:space="preserve">. Tuttavia, è comunque possibile provare ad utilizzare un database </w:t>
-      </w:r>
-      <w:proofErr w:type="spellStart"/>
-      <w:r>
-        <w:rPr>
-          <w:sz w:val="20"/>
-        </w:rPr>
-        <w:t>blockchain</w:t>
-      </w:r>
-      <w:proofErr w:type="spellEnd"/>
-      <w:r>
-        <w:rPr>
-          <w:sz w:val="20"/>
-        </w:rPr>
-        <w:t xml:space="preserve"> cambiandone però alcune caratteristiche. Verrà discussa questa opzione in seguito.</w:t>
-      </w:r>
-    </w:p>
-    <w:p>
-      <w:pPr>
-        <w:pStyle w:val="SUPSITestoArial10"/>
-        <w:rPr>
-          <w:sz w:val="20"/>
-        </w:rPr>
-      </w:pPr>
-      <w:r>
-        <w:rPr>
-          <w:sz w:val="20"/>
-        </w:rPr>
-        <w:t xml:space="preserve">La metodologia </w:t>
-      </w:r>
-      <w:proofErr w:type="spellStart"/>
-      <w:r>
-        <w:rPr>
-          <w:sz w:val="20"/>
-        </w:rPr>
-        <w:t>Git</w:t>
-      </w:r>
-      <w:proofErr w:type="spellEnd"/>
-      <w:r>
-        <w:rPr>
-          <w:sz w:val="20"/>
-        </w:rPr>
-        <w:t xml:space="preserve"> è possibile utilizzarla ma sarebbe molto complicato e non lo si utilizzerebbe con lo scopo per la quale è stata creata. L'idea che si potrebbe implementare con l'uso del </w:t>
-      </w:r>
-      <w:proofErr w:type="spellStart"/>
-      <w:r>
-        <w:rPr>
-          <w:sz w:val="20"/>
-        </w:rPr>
-        <w:t>Git</w:t>
-      </w:r>
-      <w:proofErr w:type="spellEnd"/>
-      <w:r>
-        <w:rPr>
-          <w:sz w:val="20"/>
-        </w:rPr>
-        <w:t xml:space="preserve"> è quella di creare la </w:t>
-      </w:r>
-      <w:proofErr w:type="spellStart"/>
-      <w:r>
-        <w:rPr>
-          <w:sz w:val="20"/>
-        </w:rPr>
-        <w:t>repository</w:t>
-      </w:r>
-      <w:proofErr w:type="spellEnd"/>
-      <w:r>
-        <w:rPr>
-          <w:sz w:val="20"/>
-        </w:rPr>
-        <w:t xml:space="preserve"> delle carte da visita e una ramificazione per ogni nuovo utente. Quando viene usata una carta NFC per visualizzare una carta di credito si dovrebbe fare in modo che venga scaricata la </w:t>
-      </w:r>
-      <w:proofErr w:type="spellStart"/>
-      <w:r>
-        <w:rPr>
-          <w:sz w:val="20"/>
-        </w:rPr>
-        <w:t>repository</w:t>
-      </w:r>
-      <w:proofErr w:type="spellEnd"/>
-      <w:r>
-        <w:rPr>
-          <w:sz w:val="20"/>
-        </w:rPr>
-        <w:t xml:space="preserve"> e la ramificazione dell'utente di cui è la carta NFC. Questo permetterebbe di visualizzare l'ultima versione pubblicata dall'utente.</w:t>
-      </w:r>
-    </w:p>
-    <w:p>
-      <w:pPr>
-        <w:pStyle w:val="SUPSITestoArial10"/>
-        <w:rPr>
-          <w:sz w:val="20"/>
-        </w:rPr>
-      </w:pPr>
-      <w:r>
-        <w:rPr>
-          <w:sz w:val="20"/>
-        </w:rPr>
-        <w:t xml:space="preserve">Questa metodologia è molto complicata da implementare, non sfrutta a pieno il Web 3.0, potrebbe non funzionare su alcuni dispositivi, potrebbe avere delle lacune di sicurezza e, soprattutto, non utilizza il metodo del </w:t>
-      </w:r>
-      <w:proofErr w:type="spellStart"/>
-      <w:r>
-        <w:rPr>
-          <w:sz w:val="20"/>
-        </w:rPr>
-        <w:t>Git</w:t>
-      </w:r>
-      <w:proofErr w:type="spellEnd"/>
-      <w:r>
-        <w:rPr>
-          <w:sz w:val="20"/>
-        </w:rPr>
-        <w:t xml:space="preserve"> per quello che è stato creato.</w:t>
-      </w:r>
-    </w:p>
-    <w:p>
-      <w:pPr>
-        <w:pStyle w:val="SUPSITestoArial10"/>
-      </w:pPr>
-      <w:r>
-        <w:rPr>
-          <w:sz w:val="20"/>
-        </w:rPr>
-        <w:t>È per questi motivi che la miglior metodologia di database decentralizzati da utilizzare è il Peer-to-peer.</w:t>
       </w:r>
     </w:p>
     <w:p>
@@ -9694,14 +9505,1012 @@
           <w:sz w:val="26"/>
           <w:szCs w:val="26"/>
         </w:rPr>
-        <w:t xml:space="preserve">2.2.1 </w:t>
-      </w:r>
+        <w:t xml:space="preserve">2.1.2 </w:t>
+      </w:r>
+      <w:proofErr w:type="spellStart"/>
       <w:r>
         <w:rPr>
           <w:b/>
           <w:sz w:val="26"/>
           <w:szCs w:val="26"/>
         </w:rPr>
+        <w:t>Backend</w:t>
+      </w:r>
+      <w:proofErr w:type="spellEnd"/>
+    </w:p>
+    <w:p>
+      <w:pPr>
+        <w:pStyle w:val="SUPSITestoArial10"/>
+        <w:rPr>
+          <w:sz w:val="20"/>
+          <w:szCs w:val="26"/>
+        </w:rPr>
+      </w:pPr>
+      <w:r>
+        <w:rPr>
+          <w:sz w:val="20"/>
+          <w:szCs w:val="26"/>
+        </w:rPr>
+        <w:t xml:space="preserve">Il </w:t>
+      </w:r>
+      <w:proofErr w:type="spellStart"/>
+      <w:r>
+        <w:rPr>
+          <w:sz w:val="20"/>
+          <w:szCs w:val="26"/>
+        </w:rPr>
+        <w:t>backend</w:t>
+      </w:r>
+      <w:proofErr w:type="spellEnd"/>
+      <w:r>
+        <w:rPr>
+          <w:sz w:val="20"/>
+          <w:szCs w:val="26"/>
+        </w:rPr>
+        <w:t xml:space="preserve"> è fatto tramite un </w:t>
+      </w:r>
+      <w:proofErr w:type="spellStart"/>
+      <w:r>
+        <w:rPr>
+          <w:sz w:val="20"/>
+          <w:szCs w:val="26"/>
+        </w:rPr>
+        <w:t>framework</w:t>
+      </w:r>
+      <w:proofErr w:type="spellEnd"/>
+      <w:r>
+        <w:rPr>
+          <w:sz w:val="20"/>
+          <w:szCs w:val="26"/>
+        </w:rPr>
+        <w:t xml:space="preserve"> di </w:t>
+      </w:r>
+      <w:proofErr w:type="spellStart"/>
+      <w:r>
+        <w:rPr>
+          <w:sz w:val="20"/>
+          <w:szCs w:val="26"/>
+        </w:rPr>
+        <w:t>javascript</w:t>
+      </w:r>
+      <w:proofErr w:type="spellEnd"/>
+      <w:r>
+        <w:rPr>
+          <w:sz w:val="20"/>
+          <w:szCs w:val="26"/>
+        </w:rPr>
+        <w:t xml:space="preserve"> in express e di seguito è presente la struttura pensata. Principalmente si cercherà di mantenere un approccio </w:t>
+      </w:r>
+      <w:r>
+        <w:rPr>
+          <w:sz w:val="20"/>
+          <w:szCs w:val="26"/>
+        </w:rPr>
+        <w:t xml:space="preserve">a strati con: Model, </w:t>
+      </w:r>
+      <w:proofErr w:type="spellStart"/>
+      <w:r>
+        <w:rPr>
+          <w:sz w:val="20"/>
+          <w:szCs w:val="26"/>
+        </w:rPr>
+        <w:t>Repository</w:t>
+      </w:r>
+      <w:proofErr w:type="spellEnd"/>
+      <w:r>
+        <w:rPr>
+          <w:sz w:val="20"/>
+          <w:szCs w:val="26"/>
+        </w:rPr>
+        <w:t xml:space="preserve"> e Controller. L’ultimo sarà quello che si interfaccerà in seguito con la </w:t>
+      </w:r>
+      <w:proofErr w:type="spellStart"/>
+      <w:r>
+        <w:rPr>
+          <w:sz w:val="20"/>
+          <w:szCs w:val="26"/>
+        </w:rPr>
+        <w:t>View</w:t>
+      </w:r>
+      <w:proofErr w:type="spellEnd"/>
+      <w:r>
+        <w:rPr>
+          <w:sz w:val="20"/>
+          <w:szCs w:val="26"/>
+        </w:rPr>
+        <w:t xml:space="preserve">, che sarà gestita dal </w:t>
+      </w:r>
+      <w:proofErr w:type="spellStart"/>
+      <w:r>
+        <w:rPr>
+          <w:sz w:val="20"/>
+          <w:szCs w:val="26"/>
+        </w:rPr>
+        <w:t>frontend</w:t>
+      </w:r>
+      <w:proofErr w:type="spellEnd"/>
+      <w:r>
+        <w:rPr>
+          <w:sz w:val="20"/>
+          <w:szCs w:val="26"/>
+        </w:rPr>
+        <w:t>. Il database utilizzato è</w:t>
+      </w:r>
+      <w:r>
+        <w:rPr>
+          <w:sz w:val="20"/>
+          <w:szCs w:val="26"/>
+        </w:rPr>
+        <w:t xml:space="preserve"> </w:t>
+      </w:r>
+      <w:proofErr w:type="spellStart"/>
+      <w:r>
+        <w:rPr>
+          <w:sz w:val="20"/>
+          <w:szCs w:val="26"/>
+        </w:rPr>
+        <w:t>MariaSQL</w:t>
+      </w:r>
+      <w:proofErr w:type="spellEnd"/>
+      <w:r>
+        <w:rPr>
+          <w:sz w:val="20"/>
+          <w:szCs w:val="26"/>
+        </w:rPr>
+        <w:t>.</w:t>
+      </w:r>
+    </w:p>
+    <w:p>
+      <w:pPr>
+        <w:pStyle w:val="SUPSITestoArial10"/>
+        <w:rPr>
+          <w:sz w:val="20"/>
+          <w:szCs w:val="26"/>
+        </w:rPr>
+      </w:pPr>
+      <w:r>
+        <w:rPr>
+          <w:sz w:val="20"/>
+          <w:szCs w:val="26"/>
+        </w:rPr>
+        <w:t>Classi model:</w:t>
+      </w:r>
+    </w:p>
+    <w:p>
+      <w:pPr>
+        <w:pStyle w:val="SUPSITestoArial10"/>
+        <w:numPr>
+          <w:ilvl w:val="0"/>
+          <w:numId w:val="7"/>
+        </w:numPr>
+        <w:rPr>
+          <w:sz w:val="20"/>
+          <w:szCs w:val="26"/>
+        </w:rPr>
+      </w:pPr>
+      <w:r>
+        <w:rPr>
+          <w:sz w:val="20"/>
+          <w:szCs w:val="26"/>
+        </w:rPr>
+        <w:t>Card</w:t>
+      </w:r>
+    </w:p>
+    <w:p>
+      <w:pPr>
+        <w:pStyle w:val="SUPSITestoArial10"/>
+        <w:numPr>
+          <w:ilvl w:val="0"/>
+          <w:numId w:val="7"/>
+        </w:numPr>
+        <w:rPr>
+          <w:sz w:val="20"/>
+          <w:szCs w:val="26"/>
+        </w:rPr>
+      </w:pPr>
+      <w:r>
+        <w:rPr>
+          <w:sz w:val="20"/>
+          <w:szCs w:val="26"/>
+        </w:rPr>
+        <w:t>Email</w:t>
+      </w:r>
+    </w:p>
+    <w:p>
+      <w:pPr>
+        <w:pStyle w:val="SUPSITestoArial10"/>
+        <w:numPr>
+          <w:ilvl w:val="0"/>
+          <w:numId w:val="7"/>
+        </w:numPr>
+        <w:rPr>
+          <w:sz w:val="20"/>
+          <w:szCs w:val="26"/>
+        </w:rPr>
+      </w:pPr>
+      <w:r>
+        <w:rPr>
+          <w:sz w:val="20"/>
+          <w:szCs w:val="26"/>
+        </w:rPr>
+        <w:t>Link</w:t>
+      </w:r>
+    </w:p>
+    <w:p>
+      <w:pPr>
+        <w:pStyle w:val="SUPSITestoArial10"/>
+        <w:numPr>
+          <w:ilvl w:val="0"/>
+          <w:numId w:val="7"/>
+        </w:numPr>
+        <w:rPr>
+          <w:sz w:val="20"/>
+          <w:szCs w:val="26"/>
+        </w:rPr>
+      </w:pPr>
+      <w:proofErr w:type="spellStart"/>
+      <w:r>
+        <w:rPr>
+          <w:sz w:val="20"/>
+          <w:szCs w:val="26"/>
+        </w:rPr>
+        <w:t>PhoneNumber</w:t>
+      </w:r>
+      <w:proofErr w:type="spellEnd"/>
+    </w:p>
+    <w:p>
+      <w:pPr>
+        <w:pStyle w:val="SUPSITestoArial10"/>
+        <w:numPr>
+          <w:ilvl w:val="0"/>
+          <w:numId w:val="7"/>
+        </w:numPr>
+        <w:rPr>
+          <w:sz w:val="20"/>
+          <w:szCs w:val="26"/>
+        </w:rPr>
+      </w:pPr>
+      <w:proofErr w:type="spellStart"/>
+      <w:r>
+        <w:rPr>
+          <w:sz w:val="20"/>
+          <w:szCs w:val="26"/>
+        </w:rPr>
+        <w:t>Role</w:t>
+      </w:r>
+      <w:proofErr w:type="spellEnd"/>
+    </w:p>
+    <w:p>
+      <w:pPr>
+        <w:pStyle w:val="SUPSITestoArial10"/>
+        <w:numPr>
+          <w:ilvl w:val="0"/>
+          <w:numId w:val="7"/>
+        </w:numPr>
+        <w:rPr>
+          <w:sz w:val="20"/>
+          <w:szCs w:val="26"/>
+        </w:rPr>
+      </w:pPr>
+      <w:r>
+        <w:rPr>
+          <w:sz w:val="20"/>
+          <w:szCs w:val="26"/>
+        </w:rPr>
+        <w:t>Style</w:t>
+      </w:r>
+    </w:p>
+    <w:p>
+      <w:pPr>
+        <w:pStyle w:val="SUPSITestoArial10"/>
+        <w:numPr>
+          <w:ilvl w:val="0"/>
+          <w:numId w:val="7"/>
+        </w:numPr>
+        <w:rPr>
+          <w:sz w:val="20"/>
+          <w:szCs w:val="26"/>
+        </w:rPr>
+      </w:pPr>
+      <w:r>
+        <w:rPr>
+          <w:sz w:val="20"/>
+          <w:szCs w:val="26"/>
+        </w:rPr>
+        <w:t>User</w:t>
+      </w:r>
+    </w:p>
+    <w:p>
+      <w:pPr>
+        <w:pStyle w:val="SUPSITestoArial10"/>
+        <w:rPr>
+          <w:sz w:val="20"/>
+          <w:szCs w:val="26"/>
+        </w:rPr>
+      </w:pPr>
+      <w:r>
+        <w:rPr>
+          <w:sz w:val="20"/>
+          <w:szCs w:val="26"/>
+        </w:rPr>
+        <w:t xml:space="preserve">Classi </w:t>
+      </w:r>
+      <w:proofErr w:type="spellStart"/>
+      <w:r>
+        <w:rPr>
+          <w:sz w:val="20"/>
+          <w:szCs w:val="26"/>
+        </w:rPr>
+        <w:t>Repository</w:t>
+      </w:r>
+      <w:proofErr w:type="spellEnd"/>
+      <w:r>
+        <w:rPr>
+          <w:sz w:val="20"/>
+          <w:szCs w:val="26"/>
+        </w:rPr>
+        <w:t>:</w:t>
+      </w:r>
+    </w:p>
+    <w:p>
+      <w:pPr>
+        <w:pStyle w:val="SUPSITestoArial10"/>
+        <w:numPr>
+          <w:ilvl w:val="0"/>
+          <w:numId w:val="10"/>
+        </w:numPr>
+        <w:rPr>
+          <w:sz w:val="20"/>
+          <w:szCs w:val="26"/>
+        </w:rPr>
+      </w:pPr>
+      <w:r>
+        <w:rPr>
+          <w:sz w:val="20"/>
+          <w:szCs w:val="26"/>
+        </w:rPr>
+        <w:t>Card</w:t>
+      </w:r>
+      <w:r>
+        <w:rPr>
+          <w:sz w:val="20"/>
+          <w:szCs w:val="26"/>
+        </w:rPr>
+        <w:t xml:space="preserve"> </w:t>
+      </w:r>
+      <w:proofErr w:type="spellStart"/>
+      <w:r>
+        <w:rPr>
+          <w:sz w:val="20"/>
+          <w:szCs w:val="26"/>
+        </w:rPr>
+        <w:t>Repository</w:t>
+      </w:r>
+      <w:proofErr w:type="spellEnd"/>
+    </w:p>
+    <w:p>
+      <w:pPr>
+        <w:pStyle w:val="SUPSITestoArial10"/>
+        <w:numPr>
+          <w:ilvl w:val="0"/>
+          <w:numId w:val="10"/>
+        </w:numPr>
+        <w:rPr>
+          <w:sz w:val="20"/>
+          <w:szCs w:val="26"/>
+        </w:rPr>
+      </w:pPr>
+      <w:r>
+        <w:rPr>
+          <w:sz w:val="20"/>
+          <w:szCs w:val="26"/>
+        </w:rPr>
+        <w:t>Email</w:t>
+      </w:r>
+      <w:r>
+        <w:rPr>
+          <w:sz w:val="20"/>
+          <w:szCs w:val="26"/>
+        </w:rPr>
+        <w:t xml:space="preserve"> </w:t>
+      </w:r>
+      <w:proofErr w:type="spellStart"/>
+      <w:r>
+        <w:rPr>
+          <w:sz w:val="20"/>
+          <w:szCs w:val="26"/>
+        </w:rPr>
+        <w:t>Repository</w:t>
+      </w:r>
+      <w:proofErr w:type="spellEnd"/>
+    </w:p>
+    <w:p>
+      <w:pPr>
+        <w:pStyle w:val="SUPSITestoArial10"/>
+        <w:numPr>
+          <w:ilvl w:val="0"/>
+          <w:numId w:val="10"/>
+        </w:numPr>
+        <w:rPr>
+          <w:sz w:val="20"/>
+          <w:szCs w:val="26"/>
+        </w:rPr>
+      </w:pPr>
+      <w:r>
+        <w:rPr>
+          <w:sz w:val="20"/>
+          <w:szCs w:val="26"/>
+        </w:rPr>
+        <w:t>Link</w:t>
+      </w:r>
+      <w:r>
+        <w:rPr>
+          <w:sz w:val="20"/>
+          <w:szCs w:val="26"/>
+        </w:rPr>
+        <w:t xml:space="preserve"> </w:t>
+      </w:r>
+      <w:proofErr w:type="spellStart"/>
+      <w:r>
+        <w:rPr>
+          <w:sz w:val="20"/>
+          <w:szCs w:val="26"/>
+        </w:rPr>
+        <w:t>Repository</w:t>
+      </w:r>
+      <w:proofErr w:type="spellEnd"/>
+    </w:p>
+    <w:p>
+      <w:pPr>
+        <w:pStyle w:val="SUPSITestoArial10"/>
+        <w:numPr>
+          <w:ilvl w:val="0"/>
+          <w:numId w:val="10"/>
+        </w:numPr>
+        <w:rPr>
+          <w:sz w:val="20"/>
+          <w:szCs w:val="26"/>
+        </w:rPr>
+      </w:pPr>
+      <w:proofErr w:type="spellStart"/>
+      <w:r>
+        <w:rPr>
+          <w:sz w:val="20"/>
+          <w:szCs w:val="26"/>
+        </w:rPr>
+        <w:t>PhoneNumber</w:t>
+      </w:r>
+      <w:proofErr w:type="spellEnd"/>
+      <w:r>
+        <w:rPr>
+          <w:sz w:val="20"/>
+          <w:szCs w:val="26"/>
+        </w:rPr>
+        <w:t xml:space="preserve"> </w:t>
+      </w:r>
+      <w:proofErr w:type="spellStart"/>
+      <w:r>
+        <w:rPr>
+          <w:sz w:val="20"/>
+          <w:szCs w:val="26"/>
+        </w:rPr>
+        <w:t>Repository</w:t>
+      </w:r>
+      <w:proofErr w:type="spellEnd"/>
+    </w:p>
+    <w:p>
+      <w:pPr>
+        <w:pStyle w:val="SUPSITestoArial10"/>
+        <w:numPr>
+          <w:ilvl w:val="0"/>
+          <w:numId w:val="10"/>
+        </w:numPr>
+        <w:rPr>
+          <w:sz w:val="20"/>
+          <w:szCs w:val="26"/>
+        </w:rPr>
+      </w:pPr>
+      <w:proofErr w:type="spellStart"/>
+      <w:r>
+        <w:rPr>
+          <w:sz w:val="20"/>
+          <w:szCs w:val="26"/>
+        </w:rPr>
+        <w:t>Role</w:t>
+      </w:r>
+      <w:proofErr w:type="spellEnd"/>
+      <w:r>
+        <w:rPr>
+          <w:sz w:val="20"/>
+          <w:szCs w:val="26"/>
+        </w:rPr>
+        <w:t xml:space="preserve"> </w:t>
+      </w:r>
+      <w:proofErr w:type="spellStart"/>
+      <w:r>
+        <w:rPr>
+          <w:sz w:val="20"/>
+          <w:szCs w:val="26"/>
+        </w:rPr>
+        <w:t>Repository</w:t>
+      </w:r>
+      <w:proofErr w:type="spellEnd"/>
+    </w:p>
+    <w:p>
+      <w:pPr>
+        <w:pStyle w:val="SUPSITestoArial10"/>
+        <w:numPr>
+          <w:ilvl w:val="0"/>
+          <w:numId w:val="10"/>
+        </w:numPr>
+        <w:rPr>
+          <w:sz w:val="20"/>
+          <w:szCs w:val="26"/>
+        </w:rPr>
+      </w:pPr>
+      <w:r>
+        <w:rPr>
+          <w:sz w:val="20"/>
+          <w:szCs w:val="26"/>
+        </w:rPr>
+        <w:t>Style</w:t>
+      </w:r>
+      <w:r>
+        <w:rPr>
+          <w:sz w:val="20"/>
+          <w:szCs w:val="26"/>
+        </w:rPr>
+        <w:t xml:space="preserve"> </w:t>
+      </w:r>
+      <w:proofErr w:type="spellStart"/>
+      <w:r>
+        <w:rPr>
+          <w:sz w:val="20"/>
+          <w:szCs w:val="26"/>
+        </w:rPr>
+        <w:t>Repository</w:t>
+      </w:r>
+      <w:proofErr w:type="spellEnd"/>
+    </w:p>
+    <w:p>
+      <w:pPr>
+        <w:pStyle w:val="SUPSITestoArial10"/>
+        <w:numPr>
+          <w:ilvl w:val="0"/>
+          <w:numId w:val="10"/>
+        </w:numPr>
+        <w:rPr>
+          <w:sz w:val="20"/>
+          <w:szCs w:val="26"/>
+        </w:rPr>
+      </w:pPr>
+      <w:r>
+        <w:rPr>
+          <w:sz w:val="20"/>
+          <w:szCs w:val="26"/>
+        </w:rPr>
+        <w:t>User</w:t>
+      </w:r>
+      <w:r>
+        <w:rPr>
+          <w:sz w:val="20"/>
+          <w:szCs w:val="26"/>
+        </w:rPr>
+        <w:t xml:space="preserve"> </w:t>
+      </w:r>
+      <w:proofErr w:type="spellStart"/>
+      <w:r>
+        <w:rPr>
+          <w:sz w:val="20"/>
+          <w:szCs w:val="26"/>
+        </w:rPr>
+        <w:t>Repository</w:t>
+      </w:r>
+      <w:proofErr w:type="spellEnd"/>
+    </w:p>
+    <w:p>
+      <w:pPr>
+        <w:pStyle w:val="SUPSITestoArial10"/>
+        <w:rPr>
+          <w:sz w:val="20"/>
+          <w:szCs w:val="26"/>
+        </w:rPr>
+      </w:pPr>
+      <w:r>
+        <w:rPr>
+          <w:sz w:val="20"/>
+          <w:szCs w:val="26"/>
+        </w:rPr>
+        <w:t>C</w:t>
+      </w:r>
+      <w:r>
+        <w:rPr>
+          <w:sz w:val="20"/>
+          <w:szCs w:val="26"/>
+        </w:rPr>
+        <w:t>lassi C</w:t>
+      </w:r>
+      <w:r>
+        <w:rPr>
+          <w:sz w:val="20"/>
+          <w:szCs w:val="26"/>
+        </w:rPr>
+        <w:t xml:space="preserve">ontroller: </w:t>
+      </w:r>
+    </w:p>
+    <w:p>
+      <w:pPr>
+        <w:pStyle w:val="SUPSITestoArial10"/>
+        <w:numPr>
+          <w:ilvl w:val="0"/>
+          <w:numId w:val="9"/>
+        </w:numPr>
+        <w:rPr>
+          <w:sz w:val="20"/>
+          <w:szCs w:val="26"/>
+        </w:rPr>
+      </w:pPr>
+      <w:r>
+        <w:rPr>
+          <w:sz w:val="20"/>
+          <w:szCs w:val="26"/>
+        </w:rPr>
+        <w:t>Card</w:t>
+      </w:r>
+      <w:r>
+        <w:rPr>
+          <w:sz w:val="20"/>
+          <w:szCs w:val="26"/>
+        </w:rPr>
+        <w:t xml:space="preserve"> </w:t>
+      </w:r>
+      <w:r>
+        <w:rPr>
+          <w:sz w:val="20"/>
+          <w:szCs w:val="26"/>
+        </w:rPr>
+        <w:t>Controller</w:t>
+      </w:r>
+    </w:p>
+    <w:p>
+      <w:pPr>
+        <w:pStyle w:val="SUPSITestoArial10"/>
+        <w:numPr>
+          <w:ilvl w:val="0"/>
+          <w:numId w:val="9"/>
+        </w:numPr>
+        <w:rPr>
+          <w:sz w:val="20"/>
+          <w:szCs w:val="26"/>
+        </w:rPr>
+      </w:pPr>
+      <w:bookmarkStart w:id="31" w:name="_GoBack"/>
+      <w:bookmarkEnd w:id="31"/>
+      <w:r>
+        <w:rPr>
+          <w:sz w:val="20"/>
+          <w:szCs w:val="26"/>
+        </w:rPr>
+        <w:t>Style</w:t>
+      </w:r>
+      <w:r>
+        <w:rPr>
+          <w:sz w:val="20"/>
+          <w:szCs w:val="26"/>
+        </w:rPr>
+        <w:t xml:space="preserve"> </w:t>
+      </w:r>
+      <w:r>
+        <w:rPr>
+          <w:sz w:val="20"/>
+          <w:szCs w:val="26"/>
+        </w:rPr>
+        <w:t>Controller</w:t>
+      </w:r>
+    </w:p>
+    <w:p>
+      <w:pPr>
+        <w:pStyle w:val="SUPSITestoArial10"/>
+        <w:numPr>
+          <w:ilvl w:val="0"/>
+          <w:numId w:val="8"/>
+        </w:numPr>
+        <w:rPr>
+          <w:sz w:val="20"/>
+          <w:szCs w:val="26"/>
+        </w:rPr>
+      </w:pPr>
+      <w:r>
+        <w:rPr>
+          <w:sz w:val="20"/>
+          <w:szCs w:val="26"/>
+        </w:rPr>
+        <w:t>User</w:t>
+      </w:r>
+      <w:r>
+        <w:rPr>
+          <w:sz w:val="20"/>
+          <w:szCs w:val="26"/>
+        </w:rPr>
+        <w:t xml:space="preserve"> </w:t>
+      </w:r>
+      <w:r>
+        <w:rPr>
+          <w:sz w:val="20"/>
+          <w:szCs w:val="26"/>
+        </w:rPr>
+        <w:t>Controller</w:t>
+      </w:r>
+    </w:p>
+    <w:p>
+      <w:pPr>
+        <w:pStyle w:val="SUPSITestoArial10"/>
+        <w:rPr>
+          <w:sz w:val="20"/>
+          <w:szCs w:val="26"/>
+        </w:rPr>
+      </w:pPr>
+    </w:p>
+    <w:p>
+      <w:pPr>
+        <w:pStyle w:val="Titolo2"/>
+        <w:rPr>
+          <w:lang w:val="fr-FR"/>
+        </w:rPr>
+      </w:pPr>
+      <w:r>
+        <w:rPr>
+          <w:lang w:val="fr-FR"/>
+        </w:rPr>
+        <w:t xml:space="preserve">2.2 </w:t>
+      </w:r>
+      <w:proofErr w:type="spellStart"/>
+      <w:r>
+        <w:rPr>
+          <w:lang w:val="fr-FR"/>
+        </w:rPr>
+        <w:t>Database</w:t>
+      </w:r>
+      <w:proofErr w:type="spellEnd"/>
+      <w:r>
+        <w:rPr>
+          <w:lang w:val="fr-FR"/>
+        </w:rPr>
+        <w:t xml:space="preserve"> </w:t>
+      </w:r>
+      <w:proofErr w:type="spellStart"/>
+      <w:r>
+        <w:rPr>
+          <w:lang w:val="fr-FR"/>
+        </w:rPr>
+        <w:t>decentralizzati</w:t>
+      </w:r>
+      <w:proofErr w:type="spellEnd"/>
+    </w:p>
+    <w:p>
+      <w:pPr>
+        <w:pStyle w:val="SUPSITestoArial10"/>
+        <w:rPr>
+          <w:sz w:val="20"/>
+        </w:rPr>
+      </w:pPr>
+      <w:r>
+        <w:rPr>
+          <w:sz w:val="20"/>
+        </w:rPr>
+        <w:t>L'idea è quella di utilizzare un database decentralizzato per salvare i dati di quello che dovranno far visualizzare le carte NFC. Facendo delle richieste API apposite, è possibile prendere informazioni dai database decentralizzati e si è sicuri che i dati sono raggiungibili e aggiornati.</w:t>
+      </w:r>
+      <w:r>
+        <w:rPr>
+          <w:sz w:val="20"/>
+        </w:rPr>
+        <w:br/>
+        <w:t xml:space="preserve">Anche la modifica di un dato è possibile farlo tramite richieste API e verrà distribuito in tutti gli altri nodi all'interno della rete Web 3.0 autonomamente. </w:t>
+      </w:r>
+    </w:p>
+    <w:p>
+      <w:pPr>
+        <w:pStyle w:val="SUPSITestoArial10"/>
+        <w:rPr>
+          <w:sz w:val="20"/>
+        </w:rPr>
+      </w:pPr>
+      <w:r>
+        <w:rPr>
+          <w:sz w:val="20"/>
+        </w:rPr>
+        <w:t>Scelta della metodologia del database</w:t>
+      </w:r>
+    </w:p>
+    <w:p>
+      <w:pPr>
+        <w:pStyle w:val="SUPSITestoArial10"/>
+        <w:rPr>
+          <w:sz w:val="20"/>
+        </w:rPr>
+      </w:pPr>
+      <w:r>
+        <w:rPr>
+          <w:sz w:val="20"/>
+        </w:rPr>
+        <w:t>In primis si dovrà scegliere quale metodologia di database utilizzare in base al progetto. Si sa che i dati dovranno esser modificati dall'utente in possesso della propria carta NFC.</w:t>
+      </w:r>
+    </w:p>
+    <w:p>
+      <w:pPr>
+        <w:pStyle w:val="SUPSITestoArial10"/>
+        <w:rPr>
+          <w:sz w:val="20"/>
+        </w:rPr>
+      </w:pPr>
+      <w:r>
+        <w:rPr>
+          <w:sz w:val="20"/>
+        </w:rPr>
+        <w:lastRenderedPageBreak/>
+        <w:t xml:space="preserve">Già da questa piccola considerazione, si può escludere la metodologia del </w:t>
+      </w:r>
+      <w:proofErr w:type="spellStart"/>
+      <w:r>
+        <w:rPr>
+          <w:sz w:val="20"/>
+        </w:rPr>
+        <w:t>blockchain</w:t>
+      </w:r>
+      <w:proofErr w:type="spellEnd"/>
+      <w:r>
+        <w:rPr>
+          <w:sz w:val="20"/>
+        </w:rPr>
+        <w:t xml:space="preserve">. Tuttavia, è comunque possibile provare ad utilizzare un database </w:t>
+      </w:r>
+      <w:proofErr w:type="spellStart"/>
+      <w:r>
+        <w:rPr>
+          <w:sz w:val="20"/>
+        </w:rPr>
+        <w:t>blockchain</w:t>
+      </w:r>
+      <w:proofErr w:type="spellEnd"/>
+      <w:r>
+        <w:rPr>
+          <w:sz w:val="20"/>
+        </w:rPr>
+        <w:t xml:space="preserve"> cambiandone però alcune caratteristiche. Verrà discussa questa opzione in seguito.</w:t>
+      </w:r>
+    </w:p>
+    <w:p>
+      <w:pPr>
+        <w:pStyle w:val="SUPSITestoArial10"/>
+        <w:rPr>
+          <w:sz w:val="20"/>
+        </w:rPr>
+      </w:pPr>
+      <w:r>
+        <w:rPr>
+          <w:sz w:val="20"/>
+        </w:rPr>
+        <w:t xml:space="preserve">La metodologia </w:t>
+      </w:r>
+      <w:proofErr w:type="spellStart"/>
+      <w:r>
+        <w:rPr>
+          <w:sz w:val="20"/>
+        </w:rPr>
+        <w:t>Git</w:t>
+      </w:r>
+      <w:proofErr w:type="spellEnd"/>
+      <w:r>
+        <w:rPr>
+          <w:sz w:val="20"/>
+        </w:rPr>
+        <w:t xml:space="preserve"> è possibile utilizzarla ma sarebbe molto complicato e non lo si utilizzerebbe con lo scopo per la quale è stata creata. L'idea che si potrebbe implementare con l'uso del </w:t>
+      </w:r>
+      <w:proofErr w:type="spellStart"/>
+      <w:r>
+        <w:rPr>
+          <w:sz w:val="20"/>
+        </w:rPr>
+        <w:t>Git</w:t>
+      </w:r>
+      <w:proofErr w:type="spellEnd"/>
+      <w:r>
+        <w:rPr>
+          <w:sz w:val="20"/>
+        </w:rPr>
+        <w:t xml:space="preserve"> è quella di creare la </w:t>
+      </w:r>
+      <w:proofErr w:type="spellStart"/>
+      <w:r>
+        <w:rPr>
+          <w:sz w:val="20"/>
+        </w:rPr>
+        <w:t>repository</w:t>
+      </w:r>
+      <w:proofErr w:type="spellEnd"/>
+      <w:r>
+        <w:rPr>
+          <w:sz w:val="20"/>
+        </w:rPr>
+        <w:t xml:space="preserve"> delle carte da visita e una ramificazione per ogni nuovo utente. Quando viene usata una carta NFC per visualizzare una carta di credito si dovrebbe fare in modo che venga scaricata la </w:t>
+      </w:r>
+      <w:proofErr w:type="spellStart"/>
+      <w:r>
+        <w:rPr>
+          <w:sz w:val="20"/>
+        </w:rPr>
+        <w:t>repository</w:t>
+      </w:r>
+      <w:proofErr w:type="spellEnd"/>
+      <w:r>
+        <w:rPr>
+          <w:sz w:val="20"/>
+        </w:rPr>
+        <w:t xml:space="preserve"> e la ramificazione dell'utente di cui è la carta NFC. Questo permetterebbe di visualizzare l'ultima versione pubblicata dall'utente.</w:t>
+      </w:r>
+    </w:p>
+    <w:p>
+      <w:pPr>
+        <w:pStyle w:val="SUPSITestoArial10"/>
+        <w:rPr>
+          <w:sz w:val="20"/>
+        </w:rPr>
+      </w:pPr>
+      <w:r>
+        <w:rPr>
+          <w:sz w:val="20"/>
+        </w:rPr>
+        <w:t xml:space="preserve">Questa metodologia è molto complicata da implementare, non sfrutta a pieno il Web 3.0, potrebbe non funzionare su alcuni dispositivi, potrebbe avere delle lacune di sicurezza e, soprattutto, non utilizza il metodo del </w:t>
+      </w:r>
+      <w:proofErr w:type="spellStart"/>
+      <w:r>
+        <w:rPr>
+          <w:sz w:val="20"/>
+        </w:rPr>
+        <w:t>Git</w:t>
+      </w:r>
+      <w:proofErr w:type="spellEnd"/>
+      <w:r>
+        <w:rPr>
+          <w:sz w:val="20"/>
+        </w:rPr>
+        <w:t xml:space="preserve"> per quello che è stato creato.</w:t>
+      </w:r>
+    </w:p>
+    <w:p>
+      <w:pPr>
+        <w:pStyle w:val="SUPSITestoArial10"/>
+      </w:pPr>
+      <w:r>
+        <w:rPr>
+          <w:sz w:val="20"/>
+        </w:rPr>
+        <w:t>È per questi motivi che la miglior metodologia di database decentralizzati da utilizzare è il Peer-to-peer.</w:t>
+      </w:r>
+    </w:p>
+    <w:p>
+      <w:pPr>
+        <w:pStyle w:val="SUPSITestoArial10"/>
+        <w:rPr>
+          <w:b/>
+          <w:sz w:val="26"/>
+          <w:szCs w:val="26"/>
+        </w:rPr>
+      </w:pPr>
+      <w:r>
+        <w:rPr>
+          <w:b/>
+          <w:sz w:val="26"/>
+          <w:szCs w:val="26"/>
+        </w:rPr>
+        <w:t xml:space="preserve">2.2.1 </w:t>
+      </w:r>
+      <w:r>
+        <w:rPr>
+          <w:b/>
+          <w:sz w:val="26"/>
+          <w:szCs w:val="26"/>
+        </w:rPr>
         <w:t>Creazione database P2P</w:t>
       </w:r>
     </w:p>
@@ -9981,7 +10790,6 @@
         <w:rPr>
           <w:sz w:val="20"/>
         </w:rPr>
-        <w:lastRenderedPageBreak/>
         <w:t xml:space="preserve">Una cosa importante da considerare è che all'interno della carta NFC ci dovranno essere le credenziali univoche dell'utente per connettersi alla rete </w:t>
       </w:r>
       <w:proofErr w:type="spellStart"/>
@@ -10098,6 +10906,7 @@
           <w:sz w:val="26"/>
           <w:szCs w:val="26"/>
         </w:rPr>
+        <w:lastRenderedPageBreak/>
         <w:t xml:space="preserve">2.2.4 </w:t>
       </w:r>
       <w:r>
@@ -10402,7 +11211,6 @@
         <w:rPr>
           <w:sz w:val="20"/>
         </w:rPr>
-        <w:lastRenderedPageBreak/>
         <w:t>Questo sistema non utilizza database decentralizzati ma database centralizzati con dati replicati in altri server della stessa azienda o società che ne è in possesso. Il costo cambia a differenza del servizio che viene offerto dalle varie aziende.</w:t>
       </w:r>
     </w:p>
@@ -11527,7 +12335,7 @@
         <w:sz w:val="16"/>
         <w:szCs w:val="16"/>
       </w:rPr>
-      <w:t>28</w:t>
+      <w:t>27</w:t>
     </w:r>
     <w:r>
       <w:rPr>
@@ -11973,6 +12781,345 @@
     </w:lvl>
   </w:abstractNum>
   <w:abstractNum w:abstractNumId="1" w15:restartNumberingAfterBreak="0">
+    <w:nsid w:val="16BA226D"/>
+    <w:multiLevelType w:val="hybridMultilevel"/>
+    <w:tmpl w:val="AA52C176"/>
+    <w:lvl w:ilvl="0" w:tplc="04090001">
+      <w:start w:val="1"/>
+      <w:numFmt w:val="bullet"/>
+      <w:lvlText w:val=""/>
+      <w:lvlJc w:val="left"/>
+      <w:pPr>
+        <w:ind w:left="720" w:hanging="360"/>
+      </w:pPr>
+      <w:rPr>
+        <w:rFonts w:ascii="Symbol" w:hAnsi="Symbol" w:hint="default"/>
+      </w:rPr>
+    </w:lvl>
+    <w:lvl w:ilvl="1" w:tplc="04090003" w:tentative="1">
+      <w:start w:val="1"/>
+      <w:numFmt w:val="bullet"/>
+      <w:lvlText w:val="o"/>
+      <w:lvlJc w:val="left"/>
+      <w:pPr>
+        <w:ind w:left="1440" w:hanging="360"/>
+      </w:pPr>
+      <w:rPr>
+        <w:rFonts w:ascii="Courier New" w:hAnsi="Courier New" w:cs="Courier New" w:hint="default"/>
+      </w:rPr>
+    </w:lvl>
+    <w:lvl w:ilvl="2" w:tplc="04090005" w:tentative="1">
+      <w:start w:val="1"/>
+      <w:numFmt w:val="bullet"/>
+      <w:lvlText w:val=""/>
+      <w:lvlJc w:val="left"/>
+      <w:pPr>
+        <w:ind w:left="2160" w:hanging="360"/>
+      </w:pPr>
+      <w:rPr>
+        <w:rFonts w:ascii="Wingdings" w:hAnsi="Wingdings" w:hint="default"/>
+      </w:rPr>
+    </w:lvl>
+    <w:lvl w:ilvl="3" w:tplc="04090001" w:tentative="1">
+      <w:start w:val="1"/>
+      <w:numFmt w:val="bullet"/>
+      <w:lvlText w:val=""/>
+      <w:lvlJc w:val="left"/>
+      <w:pPr>
+        <w:ind w:left="2880" w:hanging="360"/>
+      </w:pPr>
+      <w:rPr>
+        <w:rFonts w:ascii="Symbol" w:hAnsi="Symbol" w:hint="default"/>
+      </w:rPr>
+    </w:lvl>
+    <w:lvl w:ilvl="4" w:tplc="04090003" w:tentative="1">
+      <w:start w:val="1"/>
+      <w:numFmt w:val="bullet"/>
+      <w:lvlText w:val="o"/>
+      <w:lvlJc w:val="left"/>
+      <w:pPr>
+        <w:ind w:left="3600" w:hanging="360"/>
+      </w:pPr>
+      <w:rPr>
+        <w:rFonts w:ascii="Courier New" w:hAnsi="Courier New" w:cs="Courier New" w:hint="default"/>
+      </w:rPr>
+    </w:lvl>
+    <w:lvl w:ilvl="5" w:tplc="04090005" w:tentative="1">
+      <w:start w:val="1"/>
+      <w:numFmt w:val="bullet"/>
+      <w:lvlText w:val=""/>
+      <w:lvlJc w:val="left"/>
+      <w:pPr>
+        <w:ind w:left="4320" w:hanging="360"/>
+      </w:pPr>
+      <w:rPr>
+        <w:rFonts w:ascii="Wingdings" w:hAnsi="Wingdings" w:hint="default"/>
+      </w:rPr>
+    </w:lvl>
+    <w:lvl w:ilvl="6" w:tplc="04090001" w:tentative="1">
+      <w:start w:val="1"/>
+      <w:numFmt w:val="bullet"/>
+      <w:lvlText w:val=""/>
+      <w:lvlJc w:val="left"/>
+      <w:pPr>
+        <w:ind w:left="5040" w:hanging="360"/>
+      </w:pPr>
+      <w:rPr>
+        <w:rFonts w:ascii="Symbol" w:hAnsi="Symbol" w:hint="default"/>
+      </w:rPr>
+    </w:lvl>
+    <w:lvl w:ilvl="7" w:tplc="04090003" w:tentative="1">
+      <w:start w:val="1"/>
+      <w:numFmt w:val="bullet"/>
+      <w:lvlText w:val="o"/>
+      <w:lvlJc w:val="left"/>
+      <w:pPr>
+        <w:ind w:left="5760" w:hanging="360"/>
+      </w:pPr>
+      <w:rPr>
+        <w:rFonts w:ascii="Courier New" w:hAnsi="Courier New" w:cs="Courier New" w:hint="default"/>
+      </w:rPr>
+    </w:lvl>
+    <w:lvl w:ilvl="8" w:tplc="04090005" w:tentative="1">
+      <w:start w:val="1"/>
+      <w:numFmt w:val="bullet"/>
+      <w:lvlText w:val=""/>
+      <w:lvlJc w:val="left"/>
+      <w:pPr>
+        <w:ind w:left="6480" w:hanging="360"/>
+      </w:pPr>
+      <w:rPr>
+        <w:rFonts w:ascii="Wingdings" w:hAnsi="Wingdings" w:hint="default"/>
+      </w:rPr>
+    </w:lvl>
+  </w:abstractNum>
+  <w:abstractNum w:abstractNumId="2" w15:restartNumberingAfterBreak="0">
+    <w:nsid w:val="1AC53E7A"/>
+    <w:multiLevelType w:val="hybridMultilevel"/>
+    <w:tmpl w:val="2CB810C4"/>
+    <w:lvl w:ilvl="0" w:tplc="04090001">
+      <w:start w:val="1"/>
+      <w:numFmt w:val="bullet"/>
+      <w:lvlText w:val=""/>
+      <w:lvlJc w:val="left"/>
+      <w:pPr>
+        <w:ind w:left="720" w:hanging="360"/>
+      </w:pPr>
+      <w:rPr>
+        <w:rFonts w:ascii="Symbol" w:hAnsi="Symbol" w:hint="default"/>
+      </w:rPr>
+    </w:lvl>
+    <w:lvl w:ilvl="1" w:tplc="04090003" w:tentative="1">
+      <w:start w:val="1"/>
+      <w:numFmt w:val="bullet"/>
+      <w:lvlText w:val="o"/>
+      <w:lvlJc w:val="left"/>
+      <w:pPr>
+        <w:ind w:left="1440" w:hanging="360"/>
+      </w:pPr>
+      <w:rPr>
+        <w:rFonts w:ascii="Courier New" w:hAnsi="Courier New" w:cs="Courier New" w:hint="default"/>
+      </w:rPr>
+    </w:lvl>
+    <w:lvl w:ilvl="2" w:tplc="04090005" w:tentative="1">
+      <w:start w:val="1"/>
+      <w:numFmt w:val="bullet"/>
+      <w:lvlText w:val=""/>
+      <w:lvlJc w:val="left"/>
+      <w:pPr>
+        <w:ind w:left="2160" w:hanging="360"/>
+      </w:pPr>
+      <w:rPr>
+        <w:rFonts w:ascii="Wingdings" w:hAnsi="Wingdings" w:hint="default"/>
+      </w:rPr>
+    </w:lvl>
+    <w:lvl w:ilvl="3" w:tplc="04090001" w:tentative="1">
+      <w:start w:val="1"/>
+      <w:numFmt w:val="bullet"/>
+      <w:lvlText w:val=""/>
+      <w:lvlJc w:val="left"/>
+      <w:pPr>
+        <w:ind w:left="2880" w:hanging="360"/>
+      </w:pPr>
+      <w:rPr>
+        <w:rFonts w:ascii="Symbol" w:hAnsi="Symbol" w:hint="default"/>
+      </w:rPr>
+    </w:lvl>
+    <w:lvl w:ilvl="4" w:tplc="04090003" w:tentative="1">
+      <w:start w:val="1"/>
+      <w:numFmt w:val="bullet"/>
+      <w:lvlText w:val="o"/>
+      <w:lvlJc w:val="left"/>
+      <w:pPr>
+        <w:ind w:left="3600" w:hanging="360"/>
+      </w:pPr>
+      <w:rPr>
+        <w:rFonts w:ascii="Courier New" w:hAnsi="Courier New" w:cs="Courier New" w:hint="default"/>
+      </w:rPr>
+    </w:lvl>
+    <w:lvl w:ilvl="5" w:tplc="04090005" w:tentative="1">
+      <w:start w:val="1"/>
+      <w:numFmt w:val="bullet"/>
+      <w:lvlText w:val=""/>
+      <w:lvlJc w:val="left"/>
+      <w:pPr>
+        <w:ind w:left="4320" w:hanging="360"/>
+      </w:pPr>
+      <w:rPr>
+        <w:rFonts w:ascii="Wingdings" w:hAnsi="Wingdings" w:hint="default"/>
+      </w:rPr>
+    </w:lvl>
+    <w:lvl w:ilvl="6" w:tplc="04090001" w:tentative="1">
+      <w:start w:val="1"/>
+      <w:numFmt w:val="bullet"/>
+      <w:lvlText w:val=""/>
+      <w:lvlJc w:val="left"/>
+      <w:pPr>
+        <w:ind w:left="5040" w:hanging="360"/>
+      </w:pPr>
+      <w:rPr>
+        <w:rFonts w:ascii="Symbol" w:hAnsi="Symbol" w:hint="default"/>
+      </w:rPr>
+    </w:lvl>
+    <w:lvl w:ilvl="7" w:tplc="04090003" w:tentative="1">
+      <w:start w:val="1"/>
+      <w:numFmt w:val="bullet"/>
+      <w:lvlText w:val="o"/>
+      <w:lvlJc w:val="left"/>
+      <w:pPr>
+        <w:ind w:left="5760" w:hanging="360"/>
+      </w:pPr>
+      <w:rPr>
+        <w:rFonts w:ascii="Courier New" w:hAnsi="Courier New" w:cs="Courier New" w:hint="default"/>
+      </w:rPr>
+    </w:lvl>
+    <w:lvl w:ilvl="8" w:tplc="04090005" w:tentative="1">
+      <w:start w:val="1"/>
+      <w:numFmt w:val="bullet"/>
+      <w:lvlText w:val=""/>
+      <w:lvlJc w:val="left"/>
+      <w:pPr>
+        <w:ind w:left="6480" w:hanging="360"/>
+      </w:pPr>
+      <w:rPr>
+        <w:rFonts w:ascii="Wingdings" w:hAnsi="Wingdings" w:hint="default"/>
+      </w:rPr>
+    </w:lvl>
+  </w:abstractNum>
+  <w:abstractNum w:abstractNumId="3" w15:restartNumberingAfterBreak="0">
+    <w:nsid w:val="2CEC25F1"/>
+    <w:multiLevelType w:val="hybridMultilevel"/>
+    <w:tmpl w:val="A8681D6C"/>
+    <w:lvl w:ilvl="0" w:tplc="04090001">
+      <w:start w:val="1"/>
+      <w:numFmt w:val="bullet"/>
+      <w:lvlText w:val=""/>
+      <w:lvlJc w:val="left"/>
+      <w:pPr>
+        <w:ind w:left="720" w:hanging="360"/>
+      </w:pPr>
+      <w:rPr>
+        <w:rFonts w:ascii="Symbol" w:hAnsi="Symbol" w:hint="default"/>
+      </w:rPr>
+    </w:lvl>
+    <w:lvl w:ilvl="1" w:tplc="04090003" w:tentative="1">
+      <w:start w:val="1"/>
+      <w:numFmt w:val="bullet"/>
+      <w:lvlText w:val="o"/>
+      <w:lvlJc w:val="left"/>
+      <w:pPr>
+        <w:ind w:left="1440" w:hanging="360"/>
+      </w:pPr>
+      <w:rPr>
+        <w:rFonts w:ascii="Courier New" w:hAnsi="Courier New" w:cs="Courier New" w:hint="default"/>
+      </w:rPr>
+    </w:lvl>
+    <w:lvl w:ilvl="2" w:tplc="04090005" w:tentative="1">
+      <w:start w:val="1"/>
+      <w:numFmt w:val="bullet"/>
+      <w:lvlText w:val=""/>
+      <w:lvlJc w:val="left"/>
+      <w:pPr>
+        <w:ind w:left="2160" w:hanging="360"/>
+      </w:pPr>
+      <w:rPr>
+        <w:rFonts w:ascii="Wingdings" w:hAnsi="Wingdings" w:hint="default"/>
+      </w:rPr>
+    </w:lvl>
+    <w:lvl w:ilvl="3" w:tplc="04090001" w:tentative="1">
+      <w:start w:val="1"/>
+      <w:numFmt w:val="bullet"/>
+      <w:lvlText w:val=""/>
+      <w:lvlJc w:val="left"/>
+      <w:pPr>
+        <w:ind w:left="2880" w:hanging="360"/>
+      </w:pPr>
+      <w:rPr>
+        <w:rFonts w:ascii="Symbol" w:hAnsi="Symbol" w:hint="default"/>
+      </w:rPr>
+    </w:lvl>
+    <w:lvl w:ilvl="4" w:tplc="04090003" w:tentative="1">
+      <w:start w:val="1"/>
+      <w:numFmt w:val="bullet"/>
+      <w:lvlText w:val="o"/>
+      <w:lvlJc w:val="left"/>
+      <w:pPr>
+        <w:ind w:left="3600" w:hanging="360"/>
+      </w:pPr>
+      <w:rPr>
+        <w:rFonts w:ascii="Courier New" w:hAnsi="Courier New" w:cs="Courier New" w:hint="default"/>
+      </w:rPr>
+    </w:lvl>
+    <w:lvl w:ilvl="5" w:tplc="04090005" w:tentative="1">
+      <w:start w:val="1"/>
+      <w:numFmt w:val="bullet"/>
+      <w:lvlText w:val=""/>
+      <w:lvlJc w:val="left"/>
+      <w:pPr>
+        <w:ind w:left="4320" w:hanging="360"/>
+      </w:pPr>
+      <w:rPr>
+        <w:rFonts w:ascii="Wingdings" w:hAnsi="Wingdings" w:hint="default"/>
+      </w:rPr>
+    </w:lvl>
+    <w:lvl w:ilvl="6" w:tplc="04090001" w:tentative="1">
+      <w:start w:val="1"/>
+      <w:numFmt w:val="bullet"/>
+      <w:lvlText w:val=""/>
+      <w:lvlJc w:val="left"/>
+      <w:pPr>
+        <w:ind w:left="5040" w:hanging="360"/>
+      </w:pPr>
+      <w:rPr>
+        <w:rFonts w:ascii="Symbol" w:hAnsi="Symbol" w:hint="default"/>
+      </w:rPr>
+    </w:lvl>
+    <w:lvl w:ilvl="7" w:tplc="04090003" w:tentative="1">
+      <w:start w:val="1"/>
+      <w:numFmt w:val="bullet"/>
+      <w:lvlText w:val="o"/>
+      <w:lvlJc w:val="left"/>
+      <w:pPr>
+        <w:ind w:left="5760" w:hanging="360"/>
+      </w:pPr>
+      <w:rPr>
+        <w:rFonts w:ascii="Courier New" w:hAnsi="Courier New" w:cs="Courier New" w:hint="default"/>
+      </w:rPr>
+    </w:lvl>
+    <w:lvl w:ilvl="8" w:tplc="04090005" w:tentative="1">
+      <w:start w:val="1"/>
+      <w:numFmt w:val="bullet"/>
+      <w:lvlText w:val=""/>
+      <w:lvlJc w:val="left"/>
+      <w:pPr>
+        <w:ind w:left="6480" w:hanging="360"/>
+      </w:pPr>
+      <w:rPr>
+        <w:rFonts w:ascii="Wingdings" w:hAnsi="Wingdings" w:hint="default"/>
+      </w:rPr>
+    </w:lvl>
+  </w:abstractNum>
+  <w:abstractNum w:abstractNumId="4" w15:restartNumberingAfterBreak="0">
     <w:nsid w:val="2E830AA2"/>
     <w:multiLevelType w:val="hybridMultilevel"/>
     <w:tmpl w:val="8E70DB4C"/>
@@ -12092,7 +13239,120 @@
       </w:rPr>
     </w:lvl>
   </w:abstractNum>
-  <w:abstractNum w:abstractNumId="2" w15:restartNumberingAfterBreak="0">
+  <w:abstractNum w:abstractNumId="5" w15:restartNumberingAfterBreak="0">
+    <w:nsid w:val="313752C7"/>
+    <w:multiLevelType w:val="hybridMultilevel"/>
+    <w:tmpl w:val="BF0CAACA"/>
+    <w:lvl w:ilvl="0" w:tplc="04090001">
+      <w:start w:val="1"/>
+      <w:numFmt w:val="bullet"/>
+      <w:lvlText w:val=""/>
+      <w:lvlJc w:val="left"/>
+      <w:pPr>
+        <w:ind w:left="720" w:hanging="360"/>
+      </w:pPr>
+      <w:rPr>
+        <w:rFonts w:ascii="Symbol" w:hAnsi="Symbol" w:hint="default"/>
+      </w:rPr>
+    </w:lvl>
+    <w:lvl w:ilvl="1" w:tplc="04090003" w:tentative="1">
+      <w:start w:val="1"/>
+      <w:numFmt w:val="bullet"/>
+      <w:lvlText w:val="o"/>
+      <w:lvlJc w:val="left"/>
+      <w:pPr>
+        <w:ind w:left="1440" w:hanging="360"/>
+      </w:pPr>
+      <w:rPr>
+        <w:rFonts w:ascii="Courier New" w:hAnsi="Courier New" w:cs="Courier New" w:hint="default"/>
+      </w:rPr>
+    </w:lvl>
+    <w:lvl w:ilvl="2" w:tplc="04090005" w:tentative="1">
+      <w:start w:val="1"/>
+      <w:numFmt w:val="bullet"/>
+      <w:lvlText w:val=""/>
+      <w:lvlJc w:val="left"/>
+      <w:pPr>
+        <w:ind w:left="2160" w:hanging="360"/>
+      </w:pPr>
+      <w:rPr>
+        <w:rFonts w:ascii="Wingdings" w:hAnsi="Wingdings" w:hint="default"/>
+      </w:rPr>
+    </w:lvl>
+    <w:lvl w:ilvl="3" w:tplc="04090001" w:tentative="1">
+      <w:start w:val="1"/>
+      <w:numFmt w:val="bullet"/>
+      <w:lvlText w:val=""/>
+      <w:lvlJc w:val="left"/>
+      <w:pPr>
+        <w:ind w:left="2880" w:hanging="360"/>
+      </w:pPr>
+      <w:rPr>
+        <w:rFonts w:ascii="Symbol" w:hAnsi="Symbol" w:hint="default"/>
+      </w:rPr>
+    </w:lvl>
+    <w:lvl w:ilvl="4" w:tplc="04090003" w:tentative="1">
+      <w:start w:val="1"/>
+      <w:numFmt w:val="bullet"/>
+      <w:lvlText w:val="o"/>
+      <w:lvlJc w:val="left"/>
+      <w:pPr>
+        <w:ind w:left="3600" w:hanging="360"/>
+      </w:pPr>
+      <w:rPr>
+        <w:rFonts w:ascii="Courier New" w:hAnsi="Courier New" w:cs="Courier New" w:hint="default"/>
+      </w:rPr>
+    </w:lvl>
+    <w:lvl w:ilvl="5" w:tplc="04090005" w:tentative="1">
+      <w:start w:val="1"/>
+      <w:numFmt w:val="bullet"/>
+      <w:lvlText w:val=""/>
+      <w:lvlJc w:val="left"/>
+      <w:pPr>
+        <w:ind w:left="4320" w:hanging="360"/>
+      </w:pPr>
+      <w:rPr>
+        <w:rFonts w:ascii="Wingdings" w:hAnsi="Wingdings" w:hint="default"/>
+      </w:rPr>
+    </w:lvl>
+    <w:lvl w:ilvl="6" w:tplc="04090001" w:tentative="1">
+      <w:start w:val="1"/>
+      <w:numFmt w:val="bullet"/>
+      <w:lvlText w:val=""/>
+      <w:lvlJc w:val="left"/>
+      <w:pPr>
+        <w:ind w:left="5040" w:hanging="360"/>
+      </w:pPr>
+      <w:rPr>
+        <w:rFonts w:ascii="Symbol" w:hAnsi="Symbol" w:hint="default"/>
+      </w:rPr>
+    </w:lvl>
+    <w:lvl w:ilvl="7" w:tplc="04090003" w:tentative="1">
+      <w:start w:val="1"/>
+      <w:numFmt w:val="bullet"/>
+      <w:lvlText w:val="o"/>
+      <w:lvlJc w:val="left"/>
+      <w:pPr>
+        <w:ind w:left="5760" w:hanging="360"/>
+      </w:pPr>
+      <w:rPr>
+        <w:rFonts w:ascii="Courier New" w:hAnsi="Courier New" w:cs="Courier New" w:hint="default"/>
+      </w:rPr>
+    </w:lvl>
+    <w:lvl w:ilvl="8" w:tplc="04090005" w:tentative="1">
+      <w:start w:val="1"/>
+      <w:numFmt w:val="bullet"/>
+      <w:lvlText w:val=""/>
+      <w:lvlJc w:val="left"/>
+      <w:pPr>
+        <w:ind w:left="6480" w:hanging="360"/>
+      </w:pPr>
+      <w:rPr>
+        <w:rFonts w:ascii="Wingdings" w:hAnsi="Wingdings" w:hint="default"/>
+      </w:rPr>
+    </w:lvl>
+  </w:abstractNum>
+  <w:abstractNum w:abstractNumId="6" w15:restartNumberingAfterBreak="0">
     <w:nsid w:val="3DC20BB4"/>
     <w:multiLevelType w:val="hybridMultilevel"/>
     <w:tmpl w:val="997A4AC8"/>
@@ -12212,7 +13472,7 @@
       </w:rPr>
     </w:lvl>
   </w:abstractNum>
-  <w:abstractNum w:abstractNumId="3" w15:restartNumberingAfterBreak="0">
+  <w:abstractNum w:abstractNumId="7" w15:restartNumberingAfterBreak="0">
     <w:nsid w:val="4C367037"/>
     <w:multiLevelType w:val="hybridMultilevel"/>
     <w:tmpl w:val="6AD8816C"/>
@@ -12325,7 +13585,7 @@
       </w:rPr>
     </w:lvl>
   </w:abstractNum>
-  <w:abstractNum w:abstractNumId="4" w15:restartNumberingAfterBreak="0">
+  <w:abstractNum w:abstractNumId="8" w15:restartNumberingAfterBreak="0">
     <w:nsid w:val="64654D84"/>
     <w:multiLevelType w:val="hybridMultilevel"/>
     <w:tmpl w:val="D3AAD4B8"/>
@@ -12445,7 +13705,7 @@
       </w:rPr>
     </w:lvl>
   </w:abstractNum>
-  <w:abstractNum w:abstractNumId="5" w15:restartNumberingAfterBreak="0">
+  <w:abstractNum w:abstractNumId="9" w15:restartNumberingAfterBreak="0">
     <w:nsid w:val="67A15BD7"/>
     <w:multiLevelType w:val="multilevel"/>
     <w:tmpl w:val="31669ED6"/>
@@ -12559,21 +13819,33 @@
     </w:lvl>
   </w:abstractNum>
   <w:num w:numId="1">
-    <w:abstractNumId w:val="1"/>
+    <w:abstractNumId w:val="4"/>
   </w:num>
   <w:num w:numId="2">
-    <w:abstractNumId w:val="4"/>
+    <w:abstractNumId w:val="8"/>
   </w:num>
   <w:num w:numId="3">
-    <w:abstractNumId w:val="2"/>
+    <w:abstractNumId w:val="6"/>
   </w:num>
   <w:num w:numId="4">
     <w:abstractNumId w:val="0"/>
   </w:num>
   <w:num w:numId="5">
+    <w:abstractNumId w:val="9"/>
+  </w:num>
+  <w:num w:numId="6">
+    <w:abstractNumId w:val="7"/>
+  </w:num>
+  <w:num w:numId="7">
+    <w:abstractNumId w:val="1"/>
+  </w:num>
+  <w:num w:numId="8">
     <w:abstractNumId w:val="5"/>
   </w:num>
-  <w:num w:numId="6">
+  <w:num w:numId="9">
+    <w:abstractNumId w:val="2"/>
+  </w:num>
+  <w:num w:numId="10">
     <w:abstractNumId w:val="3"/>
   </w:num>
   <w:numIdMacAtCleanup w:val="5"/>
@@ -14097,7 +15369,7 @@
 </file>
 
 <file path=customXml/itemProps1.xml><?xml version="1.0" encoding="utf-8"?>
-<ds:datastoreItem xmlns:ds="http://schemas.openxmlformats.org/officeDocument/2006/customXml" ds:itemID="{E6E4728F-0143-4D0E-8315-BEF29C43E9F9}">
+<ds:datastoreItem xmlns:ds="http://schemas.openxmlformats.org/officeDocument/2006/customXml" ds:itemID="{FE5CBA88-4A2F-49AA-9F09-3E26BC0B38A6}">
   <ds:schemaRefs>
     <ds:schemaRef ds:uri="http://schemas.openxmlformats.org/officeDocument/2006/bibliography"/>
   </ds:schemaRefs>

</xml_diff>

<commit_message>
doc: scaletta delle cose che mancano
</commit_message>
<xml_diff>
--- a/rapporto/DOC_SARAK.docx
+++ b/rapporto/DOC_SARAK.docx
@@ -11385,6 +11385,389 @@
         </w:rPr>
         <w:t xml:space="preserve"> piuttosto che lo sviluppo web. Il che avrebbe potuto portare delle complicanze in caso di sviluppi futuri di questa applicazione.</w:t>
       </w:r>
+    </w:p>
+    <w:p>
+      <w:pPr>
+        <w:pStyle w:val="SUPSITestoArial10"/>
+        <w:rPr>
+          <w:sz w:val="20"/>
+        </w:rPr>
+      </w:pPr>
+    </w:p>
+    <w:p>
+      <w:pPr>
+        <w:pStyle w:val="Titolo3"/>
+      </w:pPr>
+      <w:r>
+        <w:t>1.2.4 VCF</w:t>
+      </w:r>
+    </w:p>
+    <w:p>
+      <w:pPr>
+        <w:pStyle w:val="SUPSITestoArial10"/>
+        <w:rPr>
+          <w:sz w:val="20"/>
+        </w:rPr>
+      </w:pPr>
+      <w:r>
+        <w:rPr>
+          <w:sz w:val="20"/>
+        </w:rPr>
+        <w:t xml:space="preserve">File </w:t>
+      </w:r>
+      <w:proofErr w:type="spellStart"/>
+      <w:r>
+        <w:rPr>
+          <w:sz w:val="20"/>
+        </w:rPr>
+        <w:t>vcf</w:t>
+      </w:r>
+      <w:proofErr w:type="spellEnd"/>
+      <w:r>
+        <w:rPr>
+          <w:sz w:val="20"/>
+        </w:rPr>
+        <w:t xml:space="preserve">, per il salvataggio </w:t>
+      </w:r>
+      <w:proofErr w:type="spellStart"/>
+      <w:r>
+        <w:rPr>
+          <w:sz w:val="20"/>
+        </w:rPr>
+        <w:t>auomatico</w:t>
+      </w:r>
+      <w:proofErr w:type="spellEnd"/>
+      <w:r>
+        <w:rPr>
+          <w:sz w:val="20"/>
+        </w:rPr>
+        <w:t xml:space="preserve"> in rubrica</w:t>
+      </w:r>
+      <w:r>
+        <w:rPr>
+          <w:sz w:val="20"/>
+        </w:rPr>
+        <w:t>, come funziona come è strutturato</w:t>
+      </w:r>
+    </w:p>
+    <w:p>
+      <w:pPr>
+        <w:pStyle w:val="Titolo3"/>
+      </w:pPr>
+      <w:r>
+        <w:t>1.2.5</w:t>
+      </w:r>
+      <w:r>
+        <w:t xml:space="preserve"> Ambiente di sviluppo</w:t>
+      </w:r>
+      <w:r>
+        <w:t xml:space="preserve"> </w:t>
+      </w:r>
+      <w:hyperlink r:id="rId27" w:tgtFrame="_new" w:history="1">
+        <w:r>
+          <w:rPr>
+            <w:rStyle w:val="Collegamentoipertestuale"/>
+            <w:rFonts w:ascii="Segoe UI" w:hAnsi="Segoe UI" w:cs="Segoe UI"/>
+            <w:bdr w:val="single" w:sz="2" w:space="0" w:color="E3E3E3" w:frame="1"/>
+            <w:shd w:val="clear" w:color="auto" w:fill="FFFFFF"/>
+          </w:rPr>
+          <w:t>nginx.org</w:t>
+        </w:r>
+      </w:hyperlink>
+    </w:p>
+    <w:p>
+      <w:pPr>
+        <w:pStyle w:val="SUPSITestoArial10"/>
+        <w:rPr>
+          <w:sz w:val="20"/>
+        </w:rPr>
+      </w:pPr>
+      <w:r>
+        <w:rPr>
+          <w:lang w:val="it-IT"/>
+        </w:rPr>
+        <w:t xml:space="preserve">NGINX è un server web open-source creato da Igor </w:t>
+      </w:r>
+      <w:proofErr w:type="spellStart"/>
+      <w:r>
+        <w:rPr>
+          <w:lang w:val="it-IT"/>
+        </w:rPr>
+        <w:t>Sysoev</w:t>
+      </w:r>
+      <w:proofErr w:type="spellEnd"/>
+      <w:r>
+        <w:rPr>
+          <w:lang w:val="it-IT"/>
+        </w:rPr>
+        <w:t xml:space="preserve"> e rilasciato per la prima volta nel 2004. È noto per le sue alte prestazioni, stabilità e basso consumo di risorse. Progettato per gestire un gran numero di connessioni contemporanee, utilizza un'architettura asincrona e basata sugli eventi, risultando molto efficiente nel gestire richieste simultanee. Consuma poche risorse di sistema, rendendolo adatto a server con risorse limitate e garantendo un buon funzionamento anche sotto carico pesante. NGINX può essere utilizzato sia come server web sia come reverse </w:t>
+      </w:r>
+      <w:proofErr w:type="spellStart"/>
+      <w:r>
+        <w:rPr>
+          <w:lang w:val="it-IT"/>
+        </w:rPr>
+        <w:t>proxy</w:t>
+      </w:r>
+      <w:proofErr w:type="spellEnd"/>
+      <w:r>
+        <w:rPr>
+          <w:lang w:val="it-IT"/>
+        </w:rPr>
+        <w:t xml:space="preserve">, </w:t>
+      </w:r>
+      <w:proofErr w:type="spellStart"/>
+      <w:r>
+        <w:rPr>
+          <w:lang w:val="it-IT"/>
+        </w:rPr>
+        <w:t>load</w:t>
+      </w:r>
+      <w:proofErr w:type="spellEnd"/>
+      <w:r>
+        <w:rPr>
+          <w:lang w:val="it-IT"/>
+        </w:rPr>
+        <w:t xml:space="preserve"> </w:t>
+      </w:r>
+      <w:proofErr w:type="spellStart"/>
+      <w:r>
+        <w:rPr>
+          <w:lang w:val="it-IT"/>
+        </w:rPr>
+        <w:t>balancer</w:t>
+      </w:r>
+      <w:proofErr w:type="spellEnd"/>
+      <w:r>
+        <w:rPr>
+          <w:lang w:val="it-IT"/>
+        </w:rPr>
+        <w:t xml:space="preserve"> e HTTP cache, supportando vari algoritmi di bilanciamento del carico come round-</w:t>
+      </w:r>
+      <w:proofErr w:type="spellStart"/>
+      <w:r>
+        <w:rPr>
+          <w:lang w:val="it-IT"/>
+        </w:rPr>
+        <w:t>robin</w:t>
+      </w:r>
+      <w:proofErr w:type="spellEnd"/>
+      <w:r>
+        <w:rPr>
+          <w:lang w:val="it-IT"/>
+        </w:rPr>
+        <w:t xml:space="preserve">, </w:t>
+      </w:r>
+      <w:proofErr w:type="spellStart"/>
+      <w:r>
+        <w:rPr>
+          <w:lang w:val="it-IT"/>
+        </w:rPr>
+        <w:t>least</w:t>
+      </w:r>
+      <w:proofErr w:type="spellEnd"/>
+      <w:r>
+        <w:rPr>
+          <w:lang w:val="it-IT"/>
+        </w:rPr>
+        <w:t xml:space="preserve"> </w:t>
+      </w:r>
+      <w:proofErr w:type="spellStart"/>
+      <w:r>
+        <w:rPr>
+          <w:lang w:val="it-IT"/>
+        </w:rPr>
+        <w:t>connections</w:t>
+      </w:r>
+      <w:proofErr w:type="spellEnd"/>
+      <w:r>
+        <w:rPr>
+          <w:lang w:val="it-IT"/>
+        </w:rPr>
+        <w:t xml:space="preserve"> e IP </w:t>
+      </w:r>
+      <w:proofErr w:type="spellStart"/>
+      <w:r>
+        <w:rPr>
+          <w:lang w:val="it-IT"/>
+        </w:rPr>
+        <w:t>hash</w:t>
+      </w:r>
+      <w:proofErr w:type="spellEnd"/>
+      <w:r>
+        <w:rPr>
+          <w:lang w:val="it-IT"/>
+        </w:rPr>
+        <w:t xml:space="preserve">. Offre funzionalità di </w:t>
+      </w:r>
+      <w:proofErr w:type="spellStart"/>
+      <w:r>
+        <w:rPr>
+          <w:lang w:val="it-IT"/>
+        </w:rPr>
+        <w:t>caching</w:t>
+      </w:r>
+      <w:proofErr w:type="spellEnd"/>
+      <w:r>
+        <w:rPr>
+          <w:lang w:val="it-IT"/>
+        </w:rPr>
+        <w:t xml:space="preserve"> avanzate, migliorando i tempi di risposta e riducendo il carico sui server </w:t>
+      </w:r>
+      <w:proofErr w:type="spellStart"/>
+      <w:r>
+        <w:rPr>
+          <w:lang w:val="it-IT"/>
+        </w:rPr>
+        <w:t>backend</w:t>
+      </w:r>
+      <w:proofErr w:type="spellEnd"/>
+      <w:r>
+        <w:rPr>
+          <w:lang w:val="it-IT"/>
+        </w:rPr>
+        <w:t xml:space="preserve">. Supporta le ultime versioni del protocollo HTTP e include funzionalità avanzate per la gestione delle connessioni sicure. È compatibile con vari sistemi operativi, tra cui Unix, Linux e Windows, rendendolo molto versatile per diversi ambienti. Può essere esteso con moduli per aggiungere nuove funzionalità senza compromettere le prestazioni di base. Offre diverse funzionalità per la riscrittura delle URL, la gestione delle intestazioni HTTP e altre manipolazioni del traffico web. Viene comunemente utilizzato come server web statico per servire contenuti statici come HTML, CSS, JavaScript e immagini con alte prestazioni. Viene anche utilizzato come reverse </w:t>
+      </w:r>
+      <w:proofErr w:type="spellStart"/>
+      <w:r>
+        <w:rPr>
+          <w:lang w:val="it-IT"/>
+        </w:rPr>
+        <w:t>proxy</w:t>
+      </w:r>
+      <w:proofErr w:type="spellEnd"/>
+      <w:r>
+        <w:rPr>
+          <w:lang w:val="it-IT"/>
+        </w:rPr>
+        <w:t xml:space="preserve"> per instradare le richieste ai server </w:t>
+      </w:r>
+      <w:proofErr w:type="spellStart"/>
+      <w:r>
+        <w:rPr>
+          <w:lang w:val="it-IT"/>
+        </w:rPr>
+        <w:t>backend</w:t>
+      </w:r>
+      <w:proofErr w:type="spellEnd"/>
+      <w:r>
+        <w:rPr>
+          <w:lang w:val="it-IT"/>
+        </w:rPr>
+        <w:t xml:space="preserve"> appropriati e come </w:t>
+      </w:r>
+      <w:proofErr w:type="spellStart"/>
+      <w:r>
+        <w:rPr>
+          <w:lang w:val="it-IT"/>
+        </w:rPr>
+        <w:t>load</w:t>
+      </w:r>
+      <w:proofErr w:type="spellEnd"/>
+      <w:r>
+        <w:rPr>
+          <w:lang w:val="it-IT"/>
+        </w:rPr>
+        <w:t xml:space="preserve"> </w:t>
+      </w:r>
+      <w:proofErr w:type="spellStart"/>
+      <w:r>
+        <w:rPr>
+          <w:lang w:val="it-IT"/>
+        </w:rPr>
+        <w:t>balancer</w:t>
+      </w:r>
+      <w:proofErr w:type="spellEnd"/>
+      <w:r>
+        <w:rPr>
+          <w:lang w:val="it-IT"/>
+        </w:rPr>
+        <w:t xml:space="preserve"> per distribuire il carico tra più server </w:t>
+      </w:r>
+      <w:proofErr w:type="spellStart"/>
+      <w:r>
+        <w:rPr>
+          <w:lang w:val="it-IT"/>
+        </w:rPr>
+        <w:t>backend</w:t>
+      </w:r>
+      <w:proofErr w:type="spellEnd"/>
+      <w:r>
+        <w:rPr>
+          <w:lang w:val="it-IT"/>
+        </w:rPr>
+        <w:t xml:space="preserve">, migliorando la resilienza e la scalabilità delle applicazioni. NGINX può inoltre essere utilizzato come gateway API per gestire le richieste API implementando rate </w:t>
+      </w:r>
+      <w:proofErr w:type="spellStart"/>
+      <w:r>
+        <w:rPr>
+          <w:lang w:val="it-IT"/>
+        </w:rPr>
+        <w:t>limiting</w:t>
+      </w:r>
+      <w:proofErr w:type="spellEnd"/>
+      <w:r>
+        <w:rPr>
+          <w:lang w:val="it-IT"/>
+        </w:rPr>
+        <w:t xml:space="preserve">, autenticazione e altre funzionalità di controllo del traffico e come server mail </w:t>
+      </w:r>
+      <w:proofErr w:type="spellStart"/>
+      <w:r>
+        <w:rPr>
+          <w:lang w:val="it-IT"/>
+        </w:rPr>
+        <w:t>proxy</w:t>
+      </w:r>
+      <w:proofErr w:type="spellEnd"/>
+      <w:r>
+        <w:rPr>
+          <w:lang w:val="it-IT"/>
+        </w:rPr>
+        <w:t xml:space="preserve"> supportando protocolli come IMAP, POP3 e SMTP. Grazie alla sua velocità, efficienza e flessibilità, NGINX è una scelta popolare per molte aziende e sviluppatori e può essere utilizzato in una vasta gamma di scenari, dal semplice server web statico a un complesso </w:t>
+      </w:r>
+      <w:proofErr w:type="spellStart"/>
+      <w:r>
+        <w:rPr>
+          <w:lang w:val="it-IT"/>
+        </w:rPr>
+        <w:t>load</w:t>
+      </w:r>
+      <w:proofErr w:type="spellEnd"/>
+      <w:r>
+        <w:rPr>
+          <w:lang w:val="it-IT"/>
+        </w:rPr>
+        <w:t xml:space="preserve"> </w:t>
+      </w:r>
+      <w:proofErr w:type="spellStart"/>
+      <w:r>
+        <w:rPr>
+          <w:lang w:val="it-IT"/>
+        </w:rPr>
+        <w:t>balancer</w:t>
+      </w:r>
+      <w:proofErr w:type="spellEnd"/>
+      <w:r>
+        <w:rPr>
+          <w:lang w:val="it-IT"/>
+        </w:rPr>
+        <w:t xml:space="preserve"> e reverse </w:t>
+      </w:r>
+      <w:proofErr w:type="spellStart"/>
+      <w:r>
+        <w:rPr>
+          <w:lang w:val="it-IT"/>
+        </w:rPr>
+        <w:t>proxy</w:t>
+      </w:r>
+      <w:proofErr w:type="spellEnd"/>
+      <w:r>
+        <w:rPr>
+          <w:lang w:val="it-IT"/>
+        </w:rPr>
+        <w:t xml:space="preserve"> per applicazioni web dinamiche</w:t>
+      </w:r>
       <w:r>
         <w:br w:type="page"/>
       </w:r>
@@ -11631,7 +12014,7 @@
                     <pic:cNvPicPr/>
                   </pic:nvPicPr>
                   <pic:blipFill rotWithShape="1">
-                    <a:blip r:embed="rId27">
+                    <a:blip r:embed="rId28">
                       <a:extLst>
                         <a:ext uri="{28A0092B-C50C-407E-A947-70E740481C1C}">
                           <a14:useLocalDpi xmlns:a14="http://schemas.microsoft.com/office/drawing/2010/main" val="0"/>
@@ -11695,7 +12078,7 @@
                     <pic:cNvPicPr/>
                   </pic:nvPicPr>
                   <pic:blipFill rotWithShape="1">
-                    <a:blip r:embed="rId27">
+                    <a:blip r:embed="rId28">
                       <a:extLst>
                         <a:ext uri="{28A0092B-C50C-407E-A947-70E740481C1C}">
                           <a14:useLocalDpi xmlns:a14="http://schemas.microsoft.com/office/drawing/2010/main" val="0"/>
@@ -11916,7 +12299,7 @@
             <o:lock v:ext="edit" aspectratio="t"/>
           </v:shapetype>
           <v:shape id="_x0000_i1025" type="#_x0000_t75" style="width:453.45pt;height:395.3pt">
-            <v:imagedata r:id="rId28" o:title="hexcard"/>
+            <v:imagedata r:id="rId29" o:title="hexcard"/>
           </v:shape>
         </w:pict>
       </w:r>
@@ -14112,7 +14495,7 @@
         </w:rPr>
         <w:t xml:space="preserve"> (</w:t>
       </w:r>
-      <w:hyperlink r:id="rId29">
+      <w:hyperlink r:id="rId30">
         <w:r>
           <w:rPr>
             <w:rStyle w:val="Collegamentoipertestuale"/>
@@ -14871,170 +15254,711 @@
         </w:rPr>
         <w:t>, la messa in produzione del progetto, le difficoltà e il risultato dei tester come persone in se per se.</w:t>
       </w:r>
-      <w:bookmarkStart w:id="32" w:name="_GoBack"/>
+    </w:p>
+    <w:p>
+      <w:pPr>
+        <w:pStyle w:val="Titolo2"/>
+        <w:rPr>
+          <w:lang w:val="it-CH"/>
+        </w:rPr>
+      </w:pPr>
+      <w:bookmarkStart w:id="32" w:name="_Toc73344993"/>
+      <w:bookmarkStart w:id="33" w:name="_Toc73345134"/>
+      <w:bookmarkStart w:id="34" w:name="_Toc73345149"/>
+      <w:bookmarkStart w:id="35" w:name="_Toc82498962"/>
+      <w:bookmarkStart w:id="36" w:name="_Toc160445525"/>
+      <w:r>
+        <w:rPr>
+          <w:lang w:val="it-CH"/>
+        </w:rPr>
+        <w:t xml:space="preserve">3.1 </w:t>
+      </w:r>
       <w:bookmarkEnd w:id="32"/>
-    </w:p>
-    <w:p>
-      <w:pPr>
-        <w:pStyle w:val="Titolo2"/>
-        <w:rPr>
-          <w:lang w:val="it-CH"/>
-        </w:rPr>
-      </w:pPr>
-      <w:bookmarkStart w:id="33" w:name="_Toc73344993"/>
-      <w:bookmarkStart w:id="34" w:name="_Toc73345134"/>
-      <w:bookmarkStart w:id="35" w:name="_Toc73345149"/>
-      <w:bookmarkStart w:id="36" w:name="_Toc82498962"/>
-      <w:bookmarkStart w:id="37" w:name="_Toc160445525"/>
-      <w:r>
-        <w:rPr>
-          <w:lang w:val="it-CH"/>
-        </w:rPr>
-        <w:t xml:space="preserve">3.1 </w:t>
-      </w:r>
       <w:bookmarkEnd w:id="33"/>
       <w:bookmarkEnd w:id="34"/>
       <w:bookmarkEnd w:id="35"/>
+      <w:r>
+        <w:rPr>
+          <w:lang w:val="it-CH"/>
+        </w:rPr>
+        <w:t>Studio dei linguaggi</w:t>
+      </w:r>
       <w:bookmarkEnd w:id="36"/>
-      <w:r>
-        <w:rPr>
-          <w:lang w:val="it-CH"/>
-        </w:rPr>
-        <w:t>Studio dei linguaggi</w:t>
+    </w:p>
+    <w:p>
+      <w:pPr>
+        <w:rPr>
+          <w:lang w:val="it-CH"/>
+        </w:rPr>
+      </w:pPr>
+      <w:r>
+        <w:rPr>
+          <w:lang w:val="it-CH"/>
+        </w:rPr>
+        <w:t xml:space="preserve">Per lo sviluppo di questo progetto è stato richiesto e scelto che fosse svolto in </w:t>
+      </w:r>
+      <w:proofErr w:type="spellStart"/>
+      <w:r>
+        <w:rPr>
+          <w:lang w:val="it-CH"/>
+        </w:rPr>
+        <w:t>Angular</w:t>
+      </w:r>
+      <w:proofErr w:type="spellEnd"/>
+      <w:r>
+        <w:rPr>
+          <w:lang w:val="it-CH"/>
+        </w:rPr>
+        <w:t xml:space="preserve"> per il </w:t>
+      </w:r>
+      <w:proofErr w:type="spellStart"/>
+      <w:r>
+        <w:rPr>
+          <w:lang w:val="it-CH"/>
+        </w:rPr>
+        <w:t>frontend</w:t>
+      </w:r>
+      <w:proofErr w:type="spellEnd"/>
+      <w:r>
+        <w:rPr>
+          <w:lang w:val="it-CH"/>
+        </w:rPr>
+        <w:t xml:space="preserve"> e un </w:t>
+      </w:r>
+      <w:proofErr w:type="spellStart"/>
+      <w:r>
+        <w:rPr>
+          <w:lang w:val="it-CH"/>
+        </w:rPr>
+        <w:t>backend</w:t>
+      </w:r>
+      <w:proofErr w:type="spellEnd"/>
+      <w:r>
+        <w:rPr>
+          <w:lang w:val="it-CH"/>
+        </w:rPr>
+        <w:t xml:space="preserve"> in express.js, che fa utilizzo di </w:t>
+      </w:r>
+      <w:proofErr w:type="spellStart"/>
+      <w:r>
+        <w:rPr>
+          <w:lang w:val="it-CH"/>
+        </w:rPr>
+        <w:t>node</w:t>
+      </w:r>
+      <w:proofErr w:type="spellEnd"/>
+      <w:r>
+        <w:rPr>
+          <w:lang w:val="it-CH"/>
+        </w:rPr>
+        <w:t xml:space="preserve"> </w:t>
+      </w:r>
+      <w:proofErr w:type="spellStart"/>
+      <w:r>
+        <w:rPr>
+          <w:lang w:val="it-CH"/>
+        </w:rPr>
+        <w:t>js</w:t>
+      </w:r>
+      <w:proofErr w:type="spellEnd"/>
+      <w:r>
+        <w:rPr>
+          <w:lang w:val="it-CH"/>
+        </w:rPr>
+        <w:t>.</w:t>
+      </w:r>
+    </w:p>
+    <w:p>
+      <w:pPr>
+        <w:rPr>
+          <w:lang w:val="it-CH"/>
+        </w:rPr>
+      </w:pPr>
+      <w:r>
+        <w:rPr>
+          <w:lang w:val="it-CH"/>
+        </w:rPr>
+        <w:t xml:space="preserve">Il </w:t>
+      </w:r>
+      <w:proofErr w:type="spellStart"/>
+      <w:r>
+        <w:rPr>
+          <w:lang w:val="it-CH"/>
+        </w:rPr>
+        <w:t>backend</w:t>
+      </w:r>
+      <w:proofErr w:type="spellEnd"/>
+      <w:r>
+        <w:rPr>
+          <w:lang w:val="it-CH"/>
+        </w:rPr>
+        <w:t xml:space="preserve"> riceve le richieste API dal </w:t>
+      </w:r>
+      <w:proofErr w:type="spellStart"/>
+      <w:r>
+        <w:rPr>
+          <w:lang w:val="it-CH"/>
+        </w:rPr>
+        <w:t>frontend</w:t>
+      </w:r>
+      <w:proofErr w:type="spellEnd"/>
+      <w:r>
+        <w:rPr>
+          <w:lang w:val="it-CH"/>
+        </w:rPr>
+        <w:t xml:space="preserve"> e poi contatta direttamente il </w:t>
+      </w:r>
+      <w:proofErr w:type="spellStart"/>
+      <w:r>
+        <w:rPr>
+          <w:lang w:val="it-CH"/>
+        </w:rPr>
+        <w:t>databse</w:t>
+      </w:r>
+      <w:proofErr w:type="spellEnd"/>
+      <w:r>
+        <w:rPr>
+          <w:lang w:val="it-CH"/>
+        </w:rPr>
+        <w:t xml:space="preserve"> per occuparsi delle richieste e gestirle in maniera appropriata. Non penso che express </w:t>
+      </w:r>
+      <w:proofErr w:type="spellStart"/>
+      <w:r>
+        <w:rPr>
+          <w:lang w:val="it-CH"/>
+        </w:rPr>
+        <w:t>js</w:t>
+      </w:r>
+      <w:proofErr w:type="spellEnd"/>
+      <w:r>
+        <w:rPr>
+          <w:lang w:val="it-CH"/>
+        </w:rPr>
+        <w:t xml:space="preserve"> necessiti di essere più di tanto </w:t>
+      </w:r>
+      <w:proofErr w:type="spellStart"/>
+      <w:r>
+        <w:rPr>
+          <w:lang w:val="it-CH"/>
+        </w:rPr>
+        <w:t>approfodnito</w:t>
+      </w:r>
+      <w:proofErr w:type="spellEnd"/>
+      <w:r>
+        <w:rPr>
+          <w:lang w:val="it-CH"/>
+        </w:rPr>
+        <w:t xml:space="preserve">, ma invece </w:t>
+      </w:r>
+      <w:proofErr w:type="spellStart"/>
+      <w:r>
+        <w:rPr>
+          <w:lang w:val="it-CH"/>
+        </w:rPr>
+        <w:t>Angulr</w:t>
+      </w:r>
+      <w:proofErr w:type="spellEnd"/>
+      <w:r>
+        <w:rPr>
+          <w:lang w:val="it-CH"/>
+        </w:rPr>
+        <w:t xml:space="preserve"> si.</w:t>
+      </w:r>
+    </w:p>
+    <w:p>
+      <w:pPr>
+        <w:rPr>
+          <w:lang w:val="it-CH"/>
+        </w:rPr>
+      </w:pPr>
+      <w:proofErr w:type="spellStart"/>
+      <w:r>
+        <w:rPr>
+          <w:lang w:val="it-CH"/>
+        </w:rPr>
+        <w:t>Angular</w:t>
+      </w:r>
+      <w:proofErr w:type="spellEnd"/>
+      <w:r>
+        <w:rPr>
+          <w:lang w:val="it-CH"/>
+        </w:rPr>
+        <w:t xml:space="preserve"> è un </w:t>
+      </w:r>
+      <w:proofErr w:type="spellStart"/>
+      <w:r>
+        <w:rPr>
+          <w:lang w:val="it-CH"/>
+        </w:rPr>
+        <w:t>framework</w:t>
+      </w:r>
+      <w:proofErr w:type="spellEnd"/>
+      <w:r>
+        <w:rPr>
+          <w:lang w:val="it-CH"/>
+        </w:rPr>
+        <w:t xml:space="preserve"> sviluppato e usato da Google, e la cosa più comoda che si può utilizzare di lui sono i componenti.</w:t>
+      </w:r>
+    </w:p>
+    <w:p>
+      <w:pPr>
+        <w:rPr>
+          <w:lang w:val="it-CH"/>
+        </w:rPr>
+      </w:pPr>
+      <w:proofErr w:type="spellStart"/>
+      <w:r>
+        <w:rPr>
+          <w:lang w:val="it-CH"/>
+        </w:rPr>
+        <w:t>Angular</w:t>
+      </w:r>
+      <w:proofErr w:type="spellEnd"/>
+      <w:r>
+        <w:rPr>
+          <w:lang w:val="it-CH"/>
+        </w:rPr>
+        <w:t xml:space="preserve"> ha la modalità </w:t>
+      </w:r>
+      <w:proofErr w:type="spellStart"/>
+      <w:r>
+        <w:rPr>
+          <w:lang w:val="it-CH"/>
+        </w:rPr>
+        <w:t>standalone</w:t>
+      </w:r>
+      <w:proofErr w:type="spellEnd"/>
+      <w:r>
+        <w:rPr>
+          <w:lang w:val="it-CH"/>
+        </w:rPr>
+        <w:t xml:space="preserve"> che è stata scelta per questo progetto. </w:t>
+      </w:r>
+      <w:proofErr w:type="spellStart"/>
+      <w:r>
+        <w:rPr>
+          <w:lang w:val="it-CH"/>
+        </w:rPr>
+        <w:t>QUelllo</w:t>
+      </w:r>
+      <w:proofErr w:type="spellEnd"/>
+      <w:r>
+        <w:rPr>
+          <w:lang w:val="it-CH"/>
+        </w:rPr>
+        <w:t xml:space="preserve"> che cambia </w:t>
+      </w:r>
+      <w:proofErr w:type="spellStart"/>
+      <w:r>
+        <w:rPr>
+          <w:lang w:val="it-CH"/>
+        </w:rPr>
+        <w:t>principalemtne</w:t>
+      </w:r>
+      <w:proofErr w:type="spellEnd"/>
+      <w:r>
+        <w:rPr>
+          <w:lang w:val="it-CH"/>
+        </w:rPr>
+        <w:t xml:space="preserve"> è che la varie dipendenze che il progetto ha, non sono più dichiarate a livello globale, ma </w:t>
+      </w:r>
+      <w:proofErr w:type="spellStart"/>
+      <w:r>
+        <w:rPr>
+          <w:lang w:val="it-CH"/>
+        </w:rPr>
+        <w:t>piuttossto</w:t>
+      </w:r>
+      <w:proofErr w:type="spellEnd"/>
+      <w:r>
+        <w:rPr>
+          <w:lang w:val="it-CH"/>
+        </w:rPr>
+        <w:t xml:space="preserve"> a livello di componente.</w:t>
+      </w:r>
+    </w:p>
+    <w:p>
+      <w:pPr>
+        <w:rPr>
+          <w:lang w:val="it-CH"/>
+        </w:rPr>
+      </w:pPr>
+      <w:r>
+        <w:rPr>
+          <w:lang w:val="it-CH"/>
+        </w:rPr>
+        <w:t>Una delle cose che si sono evolute durante il progetto è stata anche la scelta dell’utilizzo di componenti personalizzati.</w:t>
+      </w:r>
+    </w:p>
+    <w:p>
+      <w:pPr>
+        <w:rPr>
+          <w:lang w:val="it-CH"/>
+        </w:rPr>
+      </w:pPr>
+      <w:r>
+        <w:rPr>
+          <w:lang w:val="it-CH"/>
+        </w:rPr>
+        <w:t>Come i semplici bottoni, input e cosi via dicendo.</w:t>
+      </w:r>
+    </w:p>
+    <w:p>
+      <w:pPr>
+        <w:pStyle w:val="Titolo2"/>
+        <w:rPr>
+          <w:lang w:val="it-CH"/>
+        </w:rPr>
+      </w:pPr>
+      <w:bookmarkStart w:id="37" w:name="_Toc73344994"/>
+      <w:bookmarkStart w:id="38" w:name="_Toc73345135"/>
+      <w:bookmarkStart w:id="39" w:name="_Toc73345150"/>
+      <w:bookmarkStart w:id="40" w:name="_Toc82498963"/>
+      <w:bookmarkStart w:id="41" w:name="_Toc160445526"/>
+      <w:r>
+        <w:rPr>
+          <w:lang w:val="it-CH"/>
+        </w:rPr>
+        <w:t xml:space="preserve">3.2 </w:t>
       </w:r>
       <w:bookmarkEnd w:id="37"/>
-    </w:p>
-    <w:p>
-      <w:pPr>
-        <w:rPr>
-          <w:lang w:val="it-CH"/>
-        </w:rPr>
-      </w:pPr>
-      <w:r>
-        <w:rPr>
-          <w:lang w:val="it-CH"/>
-        </w:rPr>
-        <w:t xml:space="preserve">&lt;Parti importanti che riguardando l’utilizzo di </w:t>
-      </w:r>
-      <w:proofErr w:type="spellStart"/>
-      <w:r>
-        <w:rPr>
-          <w:lang w:val="it-CH"/>
-        </w:rPr>
-        <w:t>Angular</w:t>
-      </w:r>
-      <w:proofErr w:type="spellEnd"/>
-      <w:r>
-        <w:rPr>
-          <w:lang w:val="it-CH"/>
-        </w:rPr>
-        <w:t>, come esso funziona, quali sono le sue peculiarità&gt;</w:t>
-      </w:r>
-    </w:p>
-    <w:p>
-      <w:pPr>
-        <w:pStyle w:val="Titolo2"/>
-        <w:rPr>
-          <w:lang w:val="it-CH"/>
-        </w:rPr>
-      </w:pPr>
-      <w:bookmarkStart w:id="38" w:name="_Toc73344994"/>
-      <w:bookmarkStart w:id="39" w:name="_Toc73345135"/>
-      <w:bookmarkStart w:id="40" w:name="_Toc73345150"/>
-      <w:bookmarkStart w:id="41" w:name="_Toc82498963"/>
-      <w:bookmarkStart w:id="42" w:name="_Toc160445526"/>
-      <w:r>
-        <w:rPr>
-          <w:lang w:val="it-CH"/>
-        </w:rPr>
-        <w:t xml:space="preserve">3.2 </w:t>
-      </w:r>
       <w:bookmarkEnd w:id="38"/>
       <w:bookmarkEnd w:id="39"/>
       <w:bookmarkEnd w:id="40"/>
+      <w:r>
+        <w:rPr>
+          <w:lang w:val="it-CH"/>
+        </w:rPr>
+        <w:t>Sviluppo dell’applicazione</w:t>
+      </w:r>
       <w:bookmarkEnd w:id="41"/>
-      <w:r>
-        <w:rPr>
-          <w:lang w:val="it-CH"/>
-        </w:rPr>
-        <w:t>Sviluppo dell’applicazione</w:t>
+    </w:p>
+    <w:p>
+      <w:pPr>
+        <w:rPr>
+          <w:lang w:val="it-CH"/>
+        </w:rPr>
+      </w:pPr>
+      <w:r>
+        <w:rPr>
+          <w:lang w:val="it-CH"/>
+        </w:rPr>
+        <w:t>&lt;</w:t>
+      </w:r>
+      <w:proofErr w:type="gramStart"/>
+      <w:r>
+        <w:rPr>
+          <w:lang w:val="it-CH"/>
+        </w:rPr>
+        <w:t>parti</w:t>
+      </w:r>
+      <w:proofErr w:type="gramEnd"/>
+      <w:r>
+        <w:rPr>
+          <w:lang w:val="it-CH"/>
+        </w:rPr>
+        <w:t xml:space="preserve"> rilevanti di come l’applicazione si stata sviluppata, parlando del login/registrazione, sicurezza varia, struttura del codice…&gt;</w:t>
+      </w:r>
+    </w:p>
+    <w:p>
+      <w:pPr>
+        <w:rPr>
+          <w:lang w:val="it-CH"/>
+        </w:rPr>
+      </w:pPr>
+      <w:r>
+        <w:rPr>
+          <w:lang w:val="it-CH"/>
+        </w:rPr>
+        <w:t>Login e registrazione</w:t>
+      </w:r>
+    </w:p>
+    <w:p>
+      <w:pPr>
+        <w:pStyle w:val="Paragrafoelenco"/>
+        <w:numPr>
+          <w:ilvl w:val="0"/>
+          <w:numId w:val="14"/>
+        </w:numPr>
+        <w:ind w:left="709"/>
+        <w:rPr>
+          <w:lang w:val="it-CH"/>
+        </w:rPr>
+      </w:pPr>
+      <w:r>
+        <w:rPr>
+          <w:lang w:val="it-CH"/>
+        </w:rPr>
+        <w:t xml:space="preserve">All’inizio presenti solo </w:t>
+      </w:r>
+      <w:proofErr w:type="spellStart"/>
+      <w:r>
+        <w:rPr>
+          <w:lang w:val="it-CH"/>
+        </w:rPr>
+        <w:t>user</w:t>
+      </w:r>
+      <w:proofErr w:type="spellEnd"/>
+    </w:p>
+    <w:p>
+      <w:pPr>
+        <w:pStyle w:val="Paragrafoelenco"/>
+        <w:numPr>
+          <w:ilvl w:val="0"/>
+          <w:numId w:val="14"/>
+        </w:numPr>
+        <w:ind w:left="709"/>
+        <w:rPr>
+          <w:lang w:val="it-CH"/>
+        </w:rPr>
+      </w:pPr>
+      <w:r>
+        <w:rPr>
+          <w:lang w:val="it-CH"/>
+        </w:rPr>
+        <w:t>Evoluzione a contatti e utenti, cambiamenti effettuati nel codice per la gestione di questa scelta</w:t>
+      </w:r>
+    </w:p>
+    <w:p>
+      <w:pPr>
+        <w:pStyle w:val="Paragrafoelenco"/>
+        <w:numPr>
+          <w:ilvl w:val="0"/>
+          <w:numId w:val="14"/>
+        </w:numPr>
+        <w:ind w:left="709"/>
+        <w:rPr>
+          <w:lang w:val="it-CH"/>
+        </w:rPr>
+      </w:pPr>
+      <w:r>
+        <w:rPr>
+          <w:lang w:val="it-CH"/>
+        </w:rPr>
+        <w:t>Gestione degli utenti</w:t>
+      </w:r>
+    </w:p>
+    <w:p>
+      <w:pPr>
+        <w:rPr>
+          <w:lang w:val="it-CH"/>
+        </w:rPr>
+      </w:pPr>
+      <w:r>
+        <w:rPr>
+          <w:lang w:val="it-CH"/>
+        </w:rPr>
+        <w:t>Carte</w:t>
+      </w:r>
+    </w:p>
+    <w:p>
+      <w:pPr>
+        <w:pStyle w:val="Paragrafoelenco"/>
+        <w:numPr>
+          <w:ilvl w:val="0"/>
+          <w:numId w:val="15"/>
+        </w:numPr>
+        <w:rPr>
+          <w:lang w:val="it-CH"/>
+        </w:rPr>
+      </w:pPr>
+      <w:r>
+        <w:rPr>
+          <w:lang w:val="it-CH"/>
+        </w:rPr>
+        <w:t>Collegamento iniziale solo all’utente, gestione di questa cosa</w:t>
+      </w:r>
+    </w:p>
+    <w:p>
+      <w:pPr>
+        <w:pStyle w:val="Paragrafoelenco"/>
+        <w:numPr>
+          <w:ilvl w:val="0"/>
+          <w:numId w:val="15"/>
+        </w:numPr>
+        <w:rPr>
+          <w:lang w:val="it-CH"/>
+        </w:rPr>
+      </w:pPr>
+      <w:r>
+        <w:rPr>
+          <w:lang w:val="it-CH"/>
+        </w:rPr>
+        <w:t>Collegamento evoluto a utente e contatto, perché? Email libera in sostanza</w:t>
+      </w:r>
+    </w:p>
+    <w:p>
+      <w:pPr>
+        <w:pStyle w:val="Paragrafoelenco"/>
+        <w:numPr>
+          <w:ilvl w:val="0"/>
+          <w:numId w:val="15"/>
+        </w:numPr>
+        <w:rPr>
+          <w:lang w:val="it-CH"/>
+        </w:rPr>
+      </w:pPr>
+      <w:r>
+        <w:rPr>
+          <w:lang w:val="it-CH"/>
+        </w:rPr>
+        <w:t>Gestione dello stile, perché ho deciso di trasferirla direttamente sulla carta e non più una tabella a parte?</w:t>
+      </w:r>
+    </w:p>
+    <w:p>
+      <w:r>
+        <w:t>VCF:</w:t>
+      </w:r>
+    </w:p>
+    <w:p>
+      <w:pPr>
+        <w:pStyle w:val="Paragrafoelenco"/>
+        <w:numPr>
+          <w:ilvl w:val="0"/>
+          <w:numId w:val="17"/>
+        </w:numPr>
+      </w:pPr>
+      <w:r>
+        <w:t>Gestione e come si è fatto</w:t>
+      </w:r>
+    </w:p>
+    <w:p>
+      <w:pPr>
+        <w:pStyle w:val="Paragrafoelenco"/>
+        <w:numPr>
+          <w:ilvl w:val="0"/>
+          <w:numId w:val="17"/>
+        </w:numPr>
+      </w:pPr>
+      <w:r>
+        <w:t xml:space="preserve">Escamotage per </w:t>
+      </w:r>
+      <w:proofErr w:type="spellStart"/>
+      <w:r>
+        <w:t>iOS</w:t>
+      </w:r>
+      <w:proofErr w:type="spellEnd"/>
+      <w:r>
+        <w:t xml:space="preserve"> per non passare da DOWNLOAD (link esterno)</w:t>
+      </w:r>
+    </w:p>
+    <w:p>
+      <w:pPr>
+        <w:pStyle w:val="Titolo2"/>
+      </w:pPr>
+      <w:bookmarkStart w:id="42" w:name="_Toc160445528"/>
+      <w:r>
+        <w:lastRenderedPageBreak/>
+        <w:t>3.4 Messa in produzione</w:t>
       </w:r>
       <w:bookmarkEnd w:id="42"/>
     </w:p>
     <w:p>
-      <w:pPr>
-        <w:rPr>
-          <w:lang w:val="it-CH"/>
-        </w:rPr>
-      </w:pPr>
-      <w:r>
-        <w:rPr>
-          <w:lang w:val="it-CH"/>
-        </w:rPr>
-        <w:t>&lt;</w:t>
-      </w:r>
-      <w:proofErr w:type="gramStart"/>
-      <w:r>
-        <w:rPr>
-          <w:lang w:val="it-CH"/>
-        </w:rPr>
-        <w:t>parti</w:t>
-      </w:r>
-      <w:proofErr w:type="gramEnd"/>
-      <w:r>
-        <w:rPr>
-          <w:lang w:val="it-CH"/>
-        </w:rPr>
-        <w:t xml:space="preserve"> rilevanti di come l’applicazione si stata sviluppata, parlando del login/registrazione, sicurezza varia, struttura del codice…&gt;</w:t>
-      </w:r>
-    </w:p>
-    <w:p>
-      <w:pPr>
-        <w:pStyle w:val="Titolo2"/>
-      </w:pPr>
-      <w:bookmarkStart w:id="43" w:name="_Toc160445527"/>
-      <w:r>
-        <w:t xml:space="preserve">3.3 </w:t>
-      </w:r>
-      <w:r>
-        <w:t>Test</w:t>
-      </w:r>
-      <w:bookmarkEnd w:id="43"/>
-    </w:p>
-    <w:p>
-      <w:r>
-        <w:t>&lt;Risultati dei test in locale, della messa in produzione&gt;</w:t>
-      </w:r>
-    </w:p>
-    <w:p>
-      <w:pPr>
-        <w:pStyle w:val="Titolo2"/>
-      </w:pPr>
-      <w:bookmarkStart w:id="44" w:name="_Toc160445528"/>
-      <w:r>
-        <w:t>3.4 Messa in produzione</w:t>
-      </w:r>
-      <w:bookmarkEnd w:id="44"/>
-    </w:p>
-    <w:p>
-      <w:r>
-        <w:t>&lt;</w:t>
-      </w:r>
-      <w:proofErr w:type="gramStart"/>
-      <w:r>
-        <w:t>ambiente</w:t>
-      </w:r>
-      <w:proofErr w:type="gramEnd"/>
-      <w:r>
-        <w:t xml:space="preserve"> della messa in produzione, come funziona, </w:t>
-      </w:r>
-      <w:proofErr w:type="spellStart"/>
-      <w:r>
-        <w:t>caratterisitche</w:t>
-      </w:r>
-      <w:proofErr w:type="spellEnd"/>
-      <w:r>
-        <w:t xml:space="preserve"> particolari se presente&gt;</w:t>
+      <w:r>
+        <w:t xml:space="preserve">Il prodotto, essendo fatto per azienda, necessitava anche la messa in produzione. La prima versione </w:t>
+      </w:r>
+      <w:proofErr w:type="spellStart"/>
+      <w:r>
+        <w:t>uffficiale</w:t>
+      </w:r>
+      <w:proofErr w:type="spellEnd"/>
+      <w:r>
+        <w:t xml:space="preserve"> di test è stata rilascia il 14 maggio 2024, su un server con XXX caratteristiche, e l’utilizzo di </w:t>
+      </w:r>
+      <w:proofErr w:type="spellStart"/>
+      <w:r>
+        <w:t>Ngnix</w:t>
+      </w:r>
+      <w:proofErr w:type="spellEnd"/>
+      <w:r>
+        <w:t xml:space="preserve"> per la gestione delle </w:t>
+      </w:r>
+      <w:proofErr w:type="spellStart"/>
+      <w:r>
+        <w:t>path</w:t>
+      </w:r>
+      <w:proofErr w:type="spellEnd"/>
+      <w:r>
+        <w:t xml:space="preserve"> e del </w:t>
+      </w:r>
+      <w:proofErr w:type="spellStart"/>
+      <w:r>
+        <w:t>renidirzzamento</w:t>
+      </w:r>
+      <w:proofErr w:type="spellEnd"/>
+      <w:r>
+        <w:t xml:space="preserve">, visto che </w:t>
+      </w:r>
+      <w:proofErr w:type="spellStart"/>
+      <w:r>
+        <w:t>angular</w:t>
+      </w:r>
+      <w:proofErr w:type="spellEnd"/>
+      <w:r>
+        <w:t xml:space="preserve"> fa il tutto attraverso le </w:t>
+      </w:r>
+      <w:proofErr w:type="spellStart"/>
+      <w:r>
+        <w:t>ssue</w:t>
+      </w:r>
+      <w:proofErr w:type="spellEnd"/>
+      <w:r>
+        <w:t xml:space="preserve"> </w:t>
+      </w:r>
+      <w:proofErr w:type="spellStart"/>
+      <w:r>
+        <w:t>route</w:t>
+      </w:r>
+      <w:proofErr w:type="spellEnd"/>
+      <w:r>
+        <w:t>. Per farle funzionare è stato necessario inserire questa riga di codice:</w:t>
+      </w:r>
+    </w:p>
+    <w:p>
+      <w:r>
+        <w:t>&lt;&lt; riga di codice&gt;&gt;</w:t>
+      </w:r>
+      <w:r>
+        <w:t xml:space="preserve"> </w:t>
+      </w:r>
+      <w:r>
+        <w:tab/>
+      </w:r>
+      <w:r>
+        <w:br/>
+        <w:t xml:space="preserve">altrimenti c’era una soluzione più alla buona, in cui ogni </w:t>
+      </w:r>
+      <w:proofErr w:type="spellStart"/>
+      <w:r>
+        <w:t>path</w:t>
+      </w:r>
+      <w:proofErr w:type="spellEnd"/>
+      <w:r>
+        <w:t xml:space="preserve"> aveva di </w:t>
+      </w:r>
+      <w:proofErr w:type="spellStart"/>
+      <w:r>
+        <w:t>defualt</w:t>
+      </w:r>
+      <w:proofErr w:type="spellEnd"/>
+      <w:r>
+        <w:t xml:space="preserve"> al suo interno un cancelletto # e necessitava di essere sempre </w:t>
+      </w:r>
+      <w:proofErr w:type="spellStart"/>
+      <w:r>
+        <w:t>reindiiraazo</w:t>
+      </w:r>
+      <w:proofErr w:type="spellEnd"/>
+      <w:r>
+        <w:t xml:space="preserve"> così. Però non è una soluzione </w:t>
+      </w:r>
+      <w:proofErr w:type="spellStart"/>
+      <w:r>
+        <w:t>ulita</w:t>
+      </w:r>
+      <w:proofErr w:type="spellEnd"/>
+      <w:r>
+        <w:t xml:space="preserve"> avere un prodotto che al suo interno deve avere dei cancelletti. Quindi, la riga sopracitata, è stata la soluzione perfetta per la messa in produzione.</w:t>
       </w:r>
     </w:p>
     <w:p>
@@ -15049,41 +15973,89 @@
       <w:pPr>
         <w:pStyle w:val="Titolo"/>
       </w:pPr>
-      <w:bookmarkStart w:id="45" w:name="_Toc160445529"/>
+      <w:bookmarkStart w:id="43" w:name="_Toc160445529"/>
       <w:r>
         <w:lastRenderedPageBreak/>
         <w:t>Capitolo 4 – Risultati ottenuti</w:t>
       </w:r>
+      <w:bookmarkEnd w:id="43"/>
+    </w:p>
+    <w:p>
+      <w:pPr>
+        <w:pStyle w:val="Titolo2"/>
+      </w:pPr>
+      <w:bookmarkStart w:id="44" w:name="_Toc160445530"/>
+      <w:r>
+        <w:t>4</w:t>
+      </w:r>
+      <w:r>
+        <w:t>.1</w:t>
+      </w:r>
+      <w:r>
+        <w:t xml:space="preserve"> </w:t>
+      </w:r>
+      <w:r>
+        <w:t>Test e copertura effettuata</w:t>
+      </w:r>
+      <w:bookmarkEnd w:id="44"/>
+    </w:p>
+    <w:p>
+      <w:r>
+        <w:t>&lt;Risultati dei test in locale, della messa in produzione&gt;</w:t>
+      </w:r>
+    </w:p>
+    <w:p/>
+    <w:p>
+      <w:pPr>
+        <w:pStyle w:val="Titolo2"/>
+      </w:pPr>
+      <w:bookmarkStart w:id="45" w:name="_Toc160445531"/>
+      <w:r>
+        <w:t>4.2 Altro</w:t>
+      </w:r>
       <w:bookmarkEnd w:id="45"/>
     </w:p>
     <w:p>
+      <w:r>
+        <w:t>Aggiunte che si possono assolutamente fare:</w:t>
+      </w:r>
+    </w:p>
+    <w:p>
+      <w:pPr>
+        <w:pStyle w:val="Paragrafoelenco"/>
+        <w:numPr>
+          <w:ilvl w:val="0"/>
+          <w:numId w:val="16"/>
+        </w:numPr>
+      </w:pPr>
+      <w:r>
+        <w:t xml:space="preserve">Gestione </w:t>
+      </w:r>
+      <w:proofErr w:type="spellStart"/>
+      <w:r>
+        <w:t>miglirata</w:t>
+      </w:r>
+      <w:proofErr w:type="spellEnd"/>
+      <w:r>
+        <w:t xml:space="preserve"> di utenti e non utenti</w:t>
+      </w:r>
+    </w:p>
+    <w:p>
+      <w:pPr>
+        <w:pStyle w:val="Paragrafoelenco"/>
+        <w:numPr>
+          <w:ilvl w:val="0"/>
+          <w:numId w:val="16"/>
+        </w:numPr>
+      </w:pPr>
+      <w:r>
+        <w:t>Modifica della carta con più possibilità</w:t>
+      </w:r>
+    </w:p>
+    <w:p>
       <w:pPr>
         <w:pStyle w:val="Titolo2"/>
       </w:pPr>
-      <w:bookmarkStart w:id="46" w:name="_Toc160445530"/>
-      <w:r>
-        <w:t>4</w:t>
-      </w:r>
-      <w:r>
-        <w:t>.1</w:t>
-      </w:r>
-      <w:r>
-        <w:t xml:space="preserve"> </w:t>
-      </w:r>
-      <w:r>
-        <w:t>Test e copertura effettuata</w:t>
-      </w:r>
-      <w:bookmarkEnd w:id="46"/>
-    </w:p>
-    <w:p>
-      <w:pPr>
-        <w:pStyle w:val="Titolo2"/>
-      </w:pPr>
-      <w:bookmarkStart w:id="47" w:name="_Toc160445531"/>
-      <w:r>
-        <w:t>4.2 Altro</w:t>
-      </w:r>
-      <w:bookmarkEnd w:id="47"/>
       <w:r>
         <w:br w:type="page"/>
       </w:r>
@@ -15092,14 +16064,52 @@
       <w:pPr>
         <w:pStyle w:val="Titolo"/>
       </w:pPr>
-      <w:bookmarkStart w:id="48" w:name="_Toc160445532"/>
+      <w:bookmarkStart w:id="46" w:name="_Toc160445532"/>
       <w:r>
         <w:lastRenderedPageBreak/>
         <w:t>Capitolo 5 – Conclusione</w:t>
       </w:r>
-      <w:bookmarkEnd w:id="48"/>
-    </w:p>
-    <w:p/>
+      <w:bookmarkEnd w:id="46"/>
+    </w:p>
+    <w:p>
+      <w:r>
+        <w:t xml:space="preserve">Progetto </w:t>
+      </w:r>
+      <w:proofErr w:type="spellStart"/>
+      <w:r>
+        <w:t>interssante</w:t>
+      </w:r>
+      <w:proofErr w:type="spellEnd"/>
+      <w:r>
+        <w:t xml:space="preserve">, bello lavorare per un azienda e vedere i </w:t>
+      </w:r>
+      <w:proofErr w:type="spellStart"/>
+      <w:r>
+        <w:t>rsltati</w:t>
+      </w:r>
+      <w:proofErr w:type="spellEnd"/>
+      <w:r>
+        <w:t xml:space="preserve"> man mano che avanzano, anche per la grafica è stato molto soddisfacente, iniziare con un </w:t>
+      </w:r>
+      <w:proofErr w:type="spellStart"/>
+      <w:r>
+        <w:t>prgetto</w:t>
+      </w:r>
+      <w:proofErr w:type="spellEnd"/>
+      <w:r>
+        <w:t xml:space="preserve"> molto semplice e poco sviluppato, per poi avere la fortuna di avere un grafico che si poteva dedicare e mettere effettivamente quei cambiamenti utilizzando </w:t>
+      </w:r>
+      <w:proofErr w:type="spellStart"/>
+      <w:r>
+        <w:t>spailwind</w:t>
+      </w:r>
+      <w:proofErr w:type="spellEnd"/>
+      <w:r>
+        <w:t xml:space="preserve"> e vedere il disegno che diventa realtà.</w:t>
+      </w:r>
+      <w:bookmarkStart w:id="47" w:name="_GoBack"/>
+      <w:bookmarkEnd w:id="47"/>
+    </w:p>
     <w:p>
       <w:pPr>
         <w:spacing w:line="240" w:lineRule="auto"/>
@@ -15115,7 +16125,7 @@
           <w:lang w:val="it-CH"/>
         </w:rPr>
       </w:pPr>
-      <w:bookmarkStart w:id="49" w:name="_Toc160445533"/>
+      <w:bookmarkStart w:id="48" w:name="_Toc160445533"/>
       <w:r>
         <w:rPr>
           <w:lang w:val="it-CH"/>
@@ -15123,7 +16133,7 @@
         <w:lastRenderedPageBreak/>
         <w:t>Bibliografia</w:t>
       </w:r>
-      <w:bookmarkEnd w:id="49"/>
+      <w:bookmarkEnd w:id="48"/>
     </w:p>
     <w:p>
       <w:pPr>
@@ -15226,7 +16236,7 @@
       <w:pPr>
         <w:pStyle w:val="SUPSITestoArial10"/>
       </w:pPr>
-      <w:hyperlink r:id="rId30" w:history="1">
+      <w:hyperlink r:id="rId31" w:history="1">
         <w:r>
           <w:rPr>
             <w:rStyle w:val="Collegamentoipertestuale"/>
@@ -15375,7 +16385,7 @@
           <w:szCs w:val="56"/>
         </w:rPr>
       </w:pPr>
-      <w:bookmarkStart w:id="50" w:name="_Toc160445534"/>
+      <w:bookmarkStart w:id="49" w:name="_Toc160445534"/>
       <w:r>
         <w:rPr>
           <w:rStyle w:val="Enfasigrassetto"/>
@@ -15388,7 +16398,7 @@
         <w:lastRenderedPageBreak/>
         <w:t>Appendici</w:t>
       </w:r>
-      <w:bookmarkEnd w:id="50"/>
+      <w:bookmarkEnd w:id="49"/>
     </w:p>
     <w:p>
       <w:pPr>
@@ -15539,7 +16549,7 @@
           <w:szCs w:val="56"/>
         </w:rPr>
       </w:pPr>
-      <w:bookmarkStart w:id="51" w:name="_Toc160445535"/>
+      <w:bookmarkStart w:id="50" w:name="_Toc160445535"/>
       <w:r>
         <w:rPr>
           <w:rStyle w:val="Enfasigrassetto"/>
@@ -15552,7 +16562,7 @@
         <w:lastRenderedPageBreak/>
         <w:t>Allegati</w:t>
       </w:r>
-      <w:bookmarkEnd w:id="51"/>
+      <w:bookmarkEnd w:id="50"/>
     </w:p>
     <w:p>
       <w:pPr>
@@ -15675,11 +16685,11 @@
       </w:pPr>
     </w:p>
     <w:sectPr>
-      <w:headerReference w:type="even" r:id="rId31"/>
-      <w:headerReference w:type="default" r:id="rId32"/>
-      <w:footerReference w:type="default" r:id="rId33"/>
-      <w:headerReference w:type="first" r:id="rId34"/>
-      <w:footerReference w:type="first" r:id="rId35"/>
+      <w:headerReference w:type="even" r:id="rId32"/>
+      <w:headerReference w:type="default" r:id="rId33"/>
+      <w:footerReference w:type="default" r:id="rId34"/>
+      <w:headerReference w:type="first" r:id="rId35"/>
+      <w:footerReference w:type="first" r:id="rId36"/>
       <w:pgSz w:w="11900" w:h="16840" w:code="9"/>
       <w:pgMar w:top="1729" w:right="1134" w:bottom="851" w:left="1701" w:header="550" w:footer="567" w:gutter="0"/>
       <w:cols w:space="708"/>
@@ -15930,7 +16940,7 @@
         <w:sz w:val="16"/>
         <w:szCs w:val="16"/>
       </w:rPr>
-      <w:t>25</w:t>
+      <w:t>31</w:t>
     </w:r>
     <w:r>
       <w:rPr>
@@ -15979,7 +16989,7 @@
         <w:sz w:val="16"/>
         <w:szCs w:val="16"/>
       </w:rPr>
-      <w:t>33</w:t>
+      <w:t>34</w:t>
     </w:r>
     <w:r>
       <w:rPr>
@@ -17407,6 +18417,92 @@
     </w:lvl>
   </w:abstractNum>
   <w:abstractNum w:abstractNumId="10" w15:restartNumberingAfterBreak="0">
+    <w:nsid w:val="4CC019AB"/>
+    <w:multiLevelType w:val="hybridMultilevel"/>
+    <w:tmpl w:val="F8A8F962"/>
+    <w:lvl w:ilvl="0" w:tplc="0409000F">
+      <w:start w:val="1"/>
+      <w:numFmt w:val="decimal"/>
+      <w:lvlText w:val="%1."/>
+      <w:lvlJc w:val="left"/>
+      <w:pPr>
+        <w:ind w:left="360" w:hanging="360"/>
+      </w:pPr>
+    </w:lvl>
+    <w:lvl w:ilvl="1" w:tplc="04090019" w:tentative="1">
+      <w:start w:val="1"/>
+      <w:numFmt w:val="lowerLetter"/>
+      <w:lvlText w:val="%2."/>
+      <w:lvlJc w:val="left"/>
+      <w:pPr>
+        <w:ind w:left="1080" w:hanging="360"/>
+      </w:pPr>
+    </w:lvl>
+    <w:lvl w:ilvl="2" w:tplc="0409001B" w:tentative="1">
+      <w:start w:val="1"/>
+      <w:numFmt w:val="lowerRoman"/>
+      <w:lvlText w:val="%3."/>
+      <w:lvlJc w:val="right"/>
+      <w:pPr>
+        <w:ind w:left="1800" w:hanging="180"/>
+      </w:pPr>
+    </w:lvl>
+    <w:lvl w:ilvl="3" w:tplc="0409000F" w:tentative="1">
+      <w:start w:val="1"/>
+      <w:numFmt w:val="decimal"/>
+      <w:lvlText w:val="%4."/>
+      <w:lvlJc w:val="left"/>
+      <w:pPr>
+        <w:ind w:left="2520" w:hanging="360"/>
+      </w:pPr>
+    </w:lvl>
+    <w:lvl w:ilvl="4" w:tplc="04090019" w:tentative="1">
+      <w:start w:val="1"/>
+      <w:numFmt w:val="lowerLetter"/>
+      <w:lvlText w:val="%5."/>
+      <w:lvlJc w:val="left"/>
+      <w:pPr>
+        <w:ind w:left="3240" w:hanging="360"/>
+      </w:pPr>
+    </w:lvl>
+    <w:lvl w:ilvl="5" w:tplc="0409001B" w:tentative="1">
+      <w:start w:val="1"/>
+      <w:numFmt w:val="lowerRoman"/>
+      <w:lvlText w:val="%6."/>
+      <w:lvlJc w:val="right"/>
+      <w:pPr>
+        <w:ind w:left="3960" w:hanging="180"/>
+      </w:pPr>
+    </w:lvl>
+    <w:lvl w:ilvl="6" w:tplc="0409000F" w:tentative="1">
+      <w:start w:val="1"/>
+      <w:numFmt w:val="decimal"/>
+      <w:lvlText w:val="%7."/>
+      <w:lvlJc w:val="left"/>
+      <w:pPr>
+        <w:ind w:left="4680" w:hanging="360"/>
+      </w:pPr>
+    </w:lvl>
+    <w:lvl w:ilvl="7" w:tplc="04090019" w:tentative="1">
+      <w:start w:val="1"/>
+      <w:numFmt w:val="lowerLetter"/>
+      <w:lvlText w:val="%8."/>
+      <w:lvlJc w:val="left"/>
+      <w:pPr>
+        <w:ind w:left="5400" w:hanging="360"/>
+      </w:pPr>
+    </w:lvl>
+    <w:lvl w:ilvl="8" w:tplc="0409001B" w:tentative="1">
+      <w:start w:val="1"/>
+      <w:numFmt w:val="lowerRoman"/>
+      <w:lvlText w:val="%9."/>
+      <w:lvlJc w:val="right"/>
+      <w:pPr>
+        <w:ind w:left="6120" w:hanging="180"/>
+      </w:pPr>
+    </w:lvl>
+  </w:abstractNum>
+  <w:abstractNum w:abstractNumId="11" w15:restartNumberingAfterBreak="0">
     <w:nsid w:val="57505FAF"/>
     <w:multiLevelType w:val="multilevel"/>
     <w:tmpl w:val="0DE093DA"/>
@@ -17519,7 +18615,7 @@
       </w:pPr>
     </w:lvl>
   </w:abstractNum>
-  <w:abstractNum w:abstractNumId="11" w15:restartNumberingAfterBreak="0">
+  <w:abstractNum w:abstractNumId="12" w15:restartNumberingAfterBreak="0">
     <w:nsid w:val="64654D84"/>
     <w:multiLevelType w:val="hybridMultilevel"/>
     <w:tmpl w:val="D3AAD4B8"/>
@@ -17639,7 +18735,93 @@
       </w:rPr>
     </w:lvl>
   </w:abstractNum>
-  <w:abstractNum w:abstractNumId="12" w15:restartNumberingAfterBreak="0">
+  <w:abstractNum w:abstractNumId="13" w15:restartNumberingAfterBreak="0">
+    <w:nsid w:val="65BA59C9"/>
+    <w:multiLevelType w:val="hybridMultilevel"/>
+    <w:tmpl w:val="5A169046"/>
+    <w:lvl w:ilvl="0" w:tplc="0409000F">
+      <w:start w:val="1"/>
+      <w:numFmt w:val="decimal"/>
+      <w:lvlText w:val="%1."/>
+      <w:lvlJc w:val="left"/>
+      <w:pPr>
+        <w:ind w:left="720" w:hanging="360"/>
+      </w:pPr>
+    </w:lvl>
+    <w:lvl w:ilvl="1" w:tplc="04090019" w:tentative="1">
+      <w:start w:val="1"/>
+      <w:numFmt w:val="lowerLetter"/>
+      <w:lvlText w:val="%2."/>
+      <w:lvlJc w:val="left"/>
+      <w:pPr>
+        <w:ind w:left="1440" w:hanging="360"/>
+      </w:pPr>
+    </w:lvl>
+    <w:lvl w:ilvl="2" w:tplc="0409001B" w:tentative="1">
+      <w:start w:val="1"/>
+      <w:numFmt w:val="lowerRoman"/>
+      <w:lvlText w:val="%3."/>
+      <w:lvlJc w:val="right"/>
+      <w:pPr>
+        <w:ind w:left="2160" w:hanging="180"/>
+      </w:pPr>
+    </w:lvl>
+    <w:lvl w:ilvl="3" w:tplc="0409000F" w:tentative="1">
+      <w:start w:val="1"/>
+      <w:numFmt w:val="decimal"/>
+      <w:lvlText w:val="%4."/>
+      <w:lvlJc w:val="left"/>
+      <w:pPr>
+        <w:ind w:left="2880" w:hanging="360"/>
+      </w:pPr>
+    </w:lvl>
+    <w:lvl w:ilvl="4" w:tplc="04090019" w:tentative="1">
+      <w:start w:val="1"/>
+      <w:numFmt w:val="lowerLetter"/>
+      <w:lvlText w:val="%5."/>
+      <w:lvlJc w:val="left"/>
+      <w:pPr>
+        <w:ind w:left="3600" w:hanging="360"/>
+      </w:pPr>
+    </w:lvl>
+    <w:lvl w:ilvl="5" w:tplc="0409001B" w:tentative="1">
+      <w:start w:val="1"/>
+      <w:numFmt w:val="lowerRoman"/>
+      <w:lvlText w:val="%6."/>
+      <w:lvlJc w:val="right"/>
+      <w:pPr>
+        <w:ind w:left="4320" w:hanging="180"/>
+      </w:pPr>
+    </w:lvl>
+    <w:lvl w:ilvl="6" w:tplc="0409000F" w:tentative="1">
+      <w:start w:val="1"/>
+      <w:numFmt w:val="decimal"/>
+      <w:lvlText w:val="%7."/>
+      <w:lvlJc w:val="left"/>
+      <w:pPr>
+        <w:ind w:left="5040" w:hanging="360"/>
+      </w:pPr>
+    </w:lvl>
+    <w:lvl w:ilvl="7" w:tplc="04090019" w:tentative="1">
+      <w:start w:val="1"/>
+      <w:numFmt w:val="lowerLetter"/>
+      <w:lvlText w:val="%8."/>
+      <w:lvlJc w:val="left"/>
+      <w:pPr>
+        <w:ind w:left="5760" w:hanging="360"/>
+      </w:pPr>
+    </w:lvl>
+    <w:lvl w:ilvl="8" w:tplc="0409001B" w:tentative="1">
+      <w:start w:val="1"/>
+      <w:numFmt w:val="lowerRoman"/>
+      <w:lvlText w:val="%9."/>
+      <w:lvlJc w:val="right"/>
+      <w:pPr>
+        <w:ind w:left="6480" w:hanging="180"/>
+      </w:pPr>
+    </w:lvl>
+  </w:abstractNum>
+  <w:abstractNum w:abstractNumId="14" w15:restartNumberingAfterBreak="0">
     <w:nsid w:val="67A15BD7"/>
     <w:multiLevelType w:val="multilevel"/>
     <w:tmpl w:val="31669ED6"/>
@@ -17752,11 +18934,183 @@
       </w:rPr>
     </w:lvl>
   </w:abstractNum>
+  <w:abstractNum w:abstractNumId="15" w15:restartNumberingAfterBreak="0">
+    <w:nsid w:val="74621AE9"/>
+    <w:multiLevelType w:val="hybridMultilevel"/>
+    <w:tmpl w:val="1818BA42"/>
+    <w:lvl w:ilvl="0" w:tplc="0409000F">
+      <w:start w:val="1"/>
+      <w:numFmt w:val="decimal"/>
+      <w:lvlText w:val="%1."/>
+      <w:lvlJc w:val="left"/>
+      <w:pPr>
+        <w:ind w:left="720" w:hanging="360"/>
+      </w:pPr>
+    </w:lvl>
+    <w:lvl w:ilvl="1" w:tplc="04090019" w:tentative="1">
+      <w:start w:val="1"/>
+      <w:numFmt w:val="lowerLetter"/>
+      <w:lvlText w:val="%2."/>
+      <w:lvlJc w:val="left"/>
+      <w:pPr>
+        <w:ind w:left="1440" w:hanging="360"/>
+      </w:pPr>
+    </w:lvl>
+    <w:lvl w:ilvl="2" w:tplc="0409001B" w:tentative="1">
+      <w:start w:val="1"/>
+      <w:numFmt w:val="lowerRoman"/>
+      <w:lvlText w:val="%3."/>
+      <w:lvlJc w:val="right"/>
+      <w:pPr>
+        <w:ind w:left="2160" w:hanging="180"/>
+      </w:pPr>
+    </w:lvl>
+    <w:lvl w:ilvl="3" w:tplc="0409000F" w:tentative="1">
+      <w:start w:val="1"/>
+      <w:numFmt w:val="decimal"/>
+      <w:lvlText w:val="%4."/>
+      <w:lvlJc w:val="left"/>
+      <w:pPr>
+        <w:ind w:left="2880" w:hanging="360"/>
+      </w:pPr>
+    </w:lvl>
+    <w:lvl w:ilvl="4" w:tplc="04090019" w:tentative="1">
+      <w:start w:val="1"/>
+      <w:numFmt w:val="lowerLetter"/>
+      <w:lvlText w:val="%5."/>
+      <w:lvlJc w:val="left"/>
+      <w:pPr>
+        <w:ind w:left="3600" w:hanging="360"/>
+      </w:pPr>
+    </w:lvl>
+    <w:lvl w:ilvl="5" w:tplc="0409001B" w:tentative="1">
+      <w:start w:val="1"/>
+      <w:numFmt w:val="lowerRoman"/>
+      <w:lvlText w:val="%6."/>
+      <w:lvlJc w:val="right"/>
+      <w:pPr>
+        <w:ind w:left="4320" w:hanging="180"/>
+      </w:pPr>
+    </w:lvl>
+    <w:lvl w:ilvl="6" w:tplc="0409000F" w:tentative="1">
+      <w:start w:val="1"/>
+      <w:numFmt w:val="decimal"/>
+      <w:lvlText w:val="%7."/>
+      <w:lvlJc w:val="left"/>
+      <w:pPr>
+        <w:ind w:left="5040" w:hanging="360"/>
+      </w:pPr>
+    </w:lvl>
+    <w:lvl w:ilvl="7" w:tplc="04090019" w:tentative="1">
+      <w:start w:val="1"/>
+      <w:numFmt w:val="lowerLetter"/>
+      <w:lvlText w:val="%8."/>
+      <w:lvlJc w:val="left"/>
+      <w:pPr>
+        <w:ind w:left="5760" w:hanging="360"/>
+      </w:pPr>
+    </w:lvl>
+    <w:lvl w:ilvl="8" w:tplc="0409001B" w:tentative="1">
+      <w:start w:val="1"/>
+      <w:numFmt w:val="lowerRoman"/>
+      <w:lvlText w:val="%9."/>
+      <w:lvlJc w:val="right"/>
+      <w:pPr>
+        <w:ind w:left="6480" w:hanging="180"/>
+      </w:pPr>
+    </w:lvl>
+  </w:abstractNum>
+  <w:abstractNum w:abstractNumId="16" w15:restartNumberingAfterBreak="0">
+    <w:nsid w:val="76642084"/>
+    <w:multiLevelType w:val="hybridMultilevel"/>
+    <w:tmpl w:val="1F846748"/>
+    <w:lvl w:ilvl="0" w:tplc="0409000F">
+      <w:start w:val="1"/>
+      <w:numFmt w:val="decimal"/>
+      <w:lvlText w:val="%1."/>
+      <w:lvlJc w:val="left"/>
+      <w:pPr>
+        <w:ind w:left="720" w:hanging="360"/>
+      </w:pPr>
+    </w:lvl>
+    <w:lvl w:ilvl="1" w:tplc="04090019" w:tentative="1">
+      <w:start w:val="1"/>
+      <w:numFmt w:val="lowerLetter"/>
+      <w:lvlText w:val="%2."/>
+      <w:lvlJc w:val="left"/>
+      <w:pPr>
+        <w:ind w:left="1440" w:hanging="360"/>
+      </w:pPr>
+    </w:lvl>
+    <w:lvl w:ilvl="2" w:tplc="0409001B" w:tentative="1">
+      <w:start w:val="1"/>
+      <w:numFmt w:val="lowerRoman"/>
+      <w:lvlText w:val="%3."/>
+      <w:lvlJc w:val="right"/>
+      <w:pPr>
+        <w:ind w:left="2160" w:hanging="180"/>
+      </w:pPr>
+    </w:lvl>
+    <w:lvl w:ilvl="3" w:tplc="0409000F" w:tentative="1">
+      <w:start w:val="1"/>
+      <w:numFmt w:val="decimal"/>
+      <w:lvlText w:val="%4."/>
+      <w:lvlJc w:val="left"/>
+      <w:pPr>
+        <w:ind w:left="2880" w:hanging="360"/>
+      </w:pPr>
+    </w:lvl>
+    <w:lvl w:ilvl="4" w:tplc="04090019" w:tentative="1">
+      <w:start w:val="1"/>
+      <w:numFmt w:val="lowerLetter"/>
+      <w:lvlText w:val="%5."/>
+      <w:lvlJc w:val="left"/>
+      <w:pPr>
+        <w:ind w:left="3600" w:hanging="360"/>
+      </w:pPr>
+    </w:lvl>
+    <w:lvl w:ilvl="5" w:tplc="0409001B" w:tentative="1">
+      <w:start w:val="1"/>
+      <w:numFmt w:val="lowerRoman"/>
+      <w:lvlText w:val="%6."/>
+      <w:lvlJc w:val="right"/>
+      <w:pPr>
+        <w:ind w:left="4320" w:hanging="180"/>
+      </w:pPr>
+    </w:lvl>
+    <w:lvl w:ilvl="6" w:tplc="0409000F" w:tentative="1">
+      <w:start w:val="1"/>
+      <w:numFmt w:val="decimal"/>
+      <w:lvlText w:val="%7."/>
+      <w:lvlJc w:val="left"/>
+      <w:pPr>
+        <w:ind w:left="5040" w:hanging="360"/>
+      </w:pPr>
+    </w:lvl>
+    <w:lvl w:ilvl="7" w:tplc="04090019" w:tentative="1">
+      <w:start w:val="1"/>
+      <w:numFmt w:val="lowerLetter"/>
+      <w:lvlText w:val="%8."/>
+      <w:lvlJc w:val="left"/>
+      <w:pPr>
+        <w:ind w:left="5760" w:hanging="360"/>
+      </w:pPr>
+    </w:lvl>
+    <w:lvl w:ilvl="8" w:tplc="0409001B" w:tentative="1">
+      <w:start w:val="1"/>
+      <w:numFmt w:val="lowerRoman"/>
+      <w:lvlText w:val="%9."/>
+      <w:lvlJc w:val="right"/>
+      <w:pPr>
+        <w:ind w:left="6480" w:hanging="180"/>
+      </w:pPr>
+    </w:lvl>
+  </w:abstractNum>
   <w:num w:numId="1">
     <w:abstractNumId w:val="6"/>
   </w:num>
   <w:num w:numId="2">
-    <w:abstractNumId w:val="11"/>
+    <w:abstractNumId w:val="12"/>
   </w:num>
   <w:num w:numId="3">
     <w:abstractNumId w:val="8"/>
@@ -17765,7 +19119,7 @@
     <w:abstractNumId w:val="1"/>
   </w:num>
   <w:num w:numId="5">
-    <w:abstractNumId w:val="12"/>
+    <w:abstractNumId w:val="14"/>
   </w:num>
   <w:num w:numId="6">
     <w:abstractNumId w:val="9"/>
@@ -17783,13 +19137,25 @@
     <w:abstractNumId w:val="5"/>
   </w:num>
   <w:num w:numId="11">
-    <w:abstractNumId w:val="10"/>
+    <w:abstractNumId w:val="11"/>
   </w:num>
   <w:num w:numId="12">
     <w:abstractNumId w:val="4"/>
   </w:num>
   <w:num w:numId="13">
     <w:abstractNumId w:val="0"/>
+  </w:num>
+  <w:num w:numId="14">
+    <w:abstractNumId w:val="10"/>
+  </w:num>
+  <w:num w:numId="15">
+    <w:abstractNumId w:val="15"/>
+  </w:num>
+  <w:num w:numId="16">
+    <w:abstractNumId w:val="16"/>
+  </w:num>
+  <w:num w:numId="17">
+    <w:abstractNumId w:val="13"/>
   </w:num>
   <w:numIdMacAtCleanup w:val="5"/>
 </w:numbering>
@@ -19311,7 +20677,7 @@
 </file>
 
 <file path=customXml/itemProps1.xml><?xml version="1.0" encoding="utf-8"?>
-<ds:datastoreItem xmlns:ds="http://schemas.openxmlformats.org/officeDocument/2006/customXml" ds:itemID="{49FB207D-C6F3-47CF-AB6E-E2FB54D18D69}">
+<ds:datastoreItem xmlns:ds="http://schemas.openxmlformats.org/officeDocument/2006/customXml" ds:itemID="{4C011D96-B887-4B70-8BFD-0DA9CE9797A1}">
   <ds:schemaRefs>
     <ds:schemaRef ds:uri="http://schemas.openxmlformats.org/officeDocument/2006/bibliography"/>
   </ds:schemaRefs>

</xml_diff>